<commit_message>
Added user update route, fixed file unlinking issue, updated documentation
</commit_message>
<xml_diff>
--- a/documentation files/HIKVISION backend documentation.docx
+++ b/documentation files/HIKVISION backend documentation.docx
@@ -50,31 +50,7 @@
           <w:szCs w:val="26"/>
           <w:bdr w:val="single" w:sz="4" w:space="0" w:color="EDEDED" w:frame="1"/>
         </w:rPr>
-        <w:t xml:space="preserve">{{backend </w:t>
-      </w:r>
-      <w:proofErr w:type="spellStart"/>
-      <w:r>
-        <w:rPr>
-          <w:rStyle w:val="inlinevariable"/>
-          <w:rFonts w:ascii="Segoe UI" w:hAnsi="Segoe UI" w:cs="Segoe UI"/>
-          <w:color w:val="2552AA"/>
-          <w:sz w:val="26"/>
-          <w:szCs w:val="26"/>
-          <w:bdr w:val="single" w:sz="4" w:space="0" w:color="EDEDED" w:frame="1"/>
-        </w:rPr>
-        <w:t>url</w:t>
-      </w:r>
-      <w:proofErr w:type="spellEnd"/>
-      <w:r>
-        <w:rPr>
-          <w:rStyle w:val="inlinevariable"/>
-          <w:rFonts w:ascii="Segoe UI" w:hAnsi="Segoe UI" w:cs="Segoe UI"/>
-          <w:color w:val="2552AA"/>
-          <w:sz w:val="26"/>
-          <w:szCs w:val="26"/>
-          <w:bdr w:val="single" w:sz="4" w:space="0" w:color="EDEDED" w:frame="1"/>
-        </w:rPr>
-        <w:t>}}</w:t>
+        <w:t>{{backend url}}</w:t>
       </w:r>
       <w:r>
         <w:rPr>
@@ -157,16 +133,18 @@
           <w:bCs/>
           <w:i/>
           <w:iCs/>
-          <w:sz w:val="28"/>
-          <w:szCs w:val="28"/>
-        </w:rPr>
-      </w:pPr>
-      <w:r>
-        <w:rPr>
-          <w:b/>
-          <w:bCs/>
-          <w:i/>
-          <w:iCs/>
+          <w:caps/>
+          <w:sz w:val="28"/>
+          <w:szCs w:val="28"/>
+        </w:rPr>
+      </w:pPr>
+      <w:r>
+        <w:rPr>
+          <w:b/>
+          <w:bCs/>
+          <w:i/>
+          <w:iCs/>
+          <w:caps/>
           <w:sz w:val="28"/>
           <w:szCs w:val="28"/>
         </w:rPr>
@@ -178,6 +156,7 @@
           <w:bCs/>
           <w:i/>
           <w:iCs/>
+          <w:caps/>
           <w:sz w:val="28"/>
           <w:szCs w:val="28"/>
         </w:rPr>
@@ -216,31 +195,7 @@
           <w:szCs w:val="26"/>
           <w:bdr w:val="single" w:sz="4" w:space="0" w:color="EDEDED" w:frame="1"/>
         </w:rPr>
-        <w:t xml:space="preserve">{{backend </w:t>
-      </w:r>
-      <w:proofErr w:type="spellStart"/>
-      <w:r>
-        <w:rPr>
-          <w:rStyle w:val="inlinevariable"/>
-          <w:rFonts w:ascii="Segoe UI" w:hAnsi="Segoe UI" w:cs="Segoe UI"/>
-          <w:color w:val="2552AA"/>
-          <w:sz w:val="26"/>
-          <w:szCs w:val="26"/>
-          <w:bdr w:val="single" w:sz="4" w:space="0" w:color="EDEDED" w:frame="1"/>
-        </w:rPr>
-        <w:t>url</w:t>
-      </w:r>
-      <w:proofErr w:type="spellEnd"/>
-      <w:r>
-        <w:rPr>
-          <w:rStyle w:val="inlinevariable"/>
-          <w:rFonts w:ascii="Segoe UI" w:hAnsi="Segoe UI" w:cs="Segoe UI"/>
-          <w:color w:val="2552AA"/>
-          <w:sz w:val="26"/>
-          <w:szCs w:val="26"/>
-          <w:bdr w:val="single" w:sz="4" w:space="0" w:color="EDEDED" w:frame="1"/>
-        </w:rPr>
-        <w:t>}}</w:t>
+        <w:t>{{backend url}}</w:t>
       </w:r>
       <w:r>
         <w:rPr>
@@ -261,16 +216,18 @@
           <w:bCs/>
           <w:i/>
           <w:iCs/>
-          <w:sz w:val="28"/>
-          <w:szCs w:val="28"/>
-        </w:rPr>
-      </w:pPr>
-      <w:r>
-        <w:rPr>
-          <w:b/>
-          <w:bCs/>
-          <w:i/>
-          <w:iCs/>
+          <w:caps/>
+          <w:sz w:val="28"/>
+          <w:szCs w:val="28"/>
+        </w:rPr>
+      </w:pPr>
+      <w:r>
+        <w:rPr>
+          <w:b/>
+          <w:bCs/>
+          <w:i/>
+          <w:iCs/>
+          <w:caps/>
           <w:sz w:val="28"/>
           <w:szCs w:val="28"/>
         </w:rPr>
@@ -291,10 +248,19 @@
       </w:pPr>
       <w:r>
         <w:rPr>
-          <w:sz w:val="28"/>
-          <w:szCs w:val="28"/>
-        </w:rPr>
-        <w:t>name (text)</w:t>
+          <w:b/>
+          <w:bCs/>
+          <w:sz w:val="28"/>
+          <w:szCs w:val="28"/>
+        </w:rPr>
+        <w:t>name</w:t>
+      </w:r>
+      <w:r>
+        <w:rPr>
+          <w:sz w:val="28"/>
+          <w:szCs w:val="28"/>
+        </w:rPr>
+        <w:t xml:space="preserve"> (text)</w:t>
       </w:r>
       <w:r>
         <w:rPr>
@@ -323,15 +289,15 @@
           <w:szCs w:val="28"/>
         </w:rPr>
       </w:pPr>
-      <w:proofErr w:type="spellStart"/>
-      <w:r>
-        <w:rPr>
+      <w:r>
+        <w:rPr>
+          <w:b/>
+          <w:bCs/>
           <w:sz w:val="28"/>
           <w:szCs w:val="28"/>
         </w:rPr>
         <w:t>employeeNo</w:t>
       </w:r>
-      <w:proofErr w:type="spellEnd"/>
       <w:r>
         <w:rPr>
           <w:sz w:val="28"/>
@@ -373,19 +339,23 @@
       <w:pPr>
         <w:ind w:left="720"/>
         <w:rPr>
-          <w:sz w:val="28"/>
-          <w:szCs w:val="28"/>
-        </w:rPr>
-      </w:pPr>
-      <w:proofErr w:type="spellStart"/>
-      <w:r>
-        <w:rPr>
+          <w:b/>
+          <w:bCs/>
+          <w:i/>
+          <w:iCs/>
+          <w:sz w:val="28"/>
+          <w:szCs w:val="28"/>
+        </w:rPr>
+      </w:pPr>
+      <w:r>
+        <w:rPr>
+          <w:b/>
+          <w:bCs/>
           <w:sz w:val="28"/>
           <w:szCs w:val="28"/>
         </w:rPr>
         <w:t>faceImage</w:t>
       </w:r>
-      <w:proofErr w:type="spellEnd"/>
       <w:r>
         <w:rPr>
           <w:sz w:val="28"/>
@@ -407,88 +377,531 @@
           <w:sz w:val="28"/>
           <w:szCs w:val="28"/>
         </w:rPr>
+        <w:t xml:space="preserve">(filesize =&gt; </w:t>
+      </w:r>
+      <w:r>
+        <w:rPr>
+          <w:sz w:val="28"/>
+          <w:szCs w:val="28"/>
+        </w:rPr>
+        <w:t>less</w:t>
+      </w:r>
+      <w:r>
+        <w:rPr>
+          <w:sz w:val="28"/>
+          <w:szCs w:val="28"/>
+        </w:rPr>
+        <w:t xml:space="preserve"> than </w:t>
+      </w:r>
+      <w:r>
+        <w:rPr>
+          <w:sz w:val="28"/>
+          <w:szCs w:val="28"/>
+        </w:rPr>
+        <w:t>5M</w:t>
+      </w:r>
+      <w:r>
+        <w:rPr>
+          <w:sz w:val="28"/>
+          <w:szCs w:val="28"/>
+        </w:rPr>
+        <w:t>B, file type =&gt; JPEG</w:t>
+      </w:r>
+      <w:r>
+        <w:rPr>
+          <w:sz w:val="28"/>
+          <w:szCs w:val="28"/>
+        </w:rPr>
+        <w:t>,</w:t>
+      </w:r>
+      <w:r>
+        <w:rPr>
+          <w:sz w:val="28"/>
+          <w:szCs w:val="28"/>
+        </w:rPr>
+        <w:t xml:space="preserve"> JPG</w:t>
+      </w:r>
+      <w:r>
+        <w:rPr>
+          <w:sz w:val="28"/>
+          <w:szCs w:val="28"/>
+        </w:rPr>
+        <w:t xml:space="preserve"> or PNG</w:t>
+      </w:r>
+      <w:r>
+        <w:rPr>
+          <w:sz w:val="28"/>
+          <w:szCs w:val="28"/>
+        </w:rPr>
+        <w:t>)</w:t>
+      </w:r>
+      <w:r>
+        <w:rPr>
+          <w:sz w:val="28"/>
+          <w:szCs w:val="28"/>
+        </w:rPr>
+        <w:t xml:space="preserve"> </w:t>
+      </w:r>
+      <w:r>
+        <w:rPr>
+          <w:b/>
+          <w:bCs/>
+          <w:i/>
+          <w:iCs/>
+          <w:sz w:val="28"/>
+          <w:szCs w:val="28"/>
+        </w:rPr>
+        <w:t xml:space="preserve">required </w:t>
+      </w:r>
+    </w:p>
+    <w:p>
+      <w:pPr>
+        <w:ind w:left="720"/>
+        <w:rPr>
+          <w:sz w:val="28"/>
+          <w:szCs w:val="28"/>
+        </w:rPr>
+      </w:pPr>
+      <w:r>
+        <w:rPr>
+          <w:b/>
+          <w:bCs/>
+          <w:sz w:val="28"/>
+          <w:szCs w:val="28"/>
+        </w:rPr>
+        <w:t>userType</w:t>
+      </w:r>
+      <w:r>
+        <w:rPr>
+          <w:sz w:val="28"/>
+          <w:szCs w:val="28"/>
+        </w:rPr>
+        <w:t xml:space="preserve"> (text) </w:t>
+      </w:r>
+      <w:r>
+        <w:rPr>
+          <w:b/>
+          <w:bCs/>
+          <w:sz w:val="28"/>
+          <w:szCs w:val="28"/>
+        </w:rPr>
+        <w:t xml:space="preserve">constraints: </w:t>
+      </w:r>
+      <w:r>
+        <w:rPr>
+          <w:sz w:val="28"/>
+          <w:szCs w:val="28"/>
+        </w:rPr>
+        <w:t xml:space="preserve">(can be only “normal, visitor or blackList” *case sensitive*) </w:t>
+      </w:r>
+      <w:r>
+        <w:rPr>
+          <w:b/>
+          <w:bCs/>
+          <w:i/>
+          <w:iCs/>
+          <w:sz w:val="28"/>
+          <w:szCs w:val="28"/>
+        </w:rPr>
+        <w:t>optional (default: normal)</w:t>
+      </w:r>
+    </w:p>
+    <w:p>
+      <w:pPr>
+        <w:shd w:val="clear" w:color="auto" w:fill="FFFFFF"/>
+        <w:spacing w:line="270" w:lineRule="atLeast"/>
+        <w:ind w:left="720"/>
+        <w:rPr>
+          <w:rFonts w:ascii="Courier New" w:eastAsia="Times New Roman" w:hAnsi="Courier New" w:cs="Courier New"/>
+          <w:color w:val="000000"/>
+          <w:kern w:val="0"/>
+          <w:sz w:val="18"/>
+          <w:szCs w:val="18"/>
+          <w:lang w:eastAsia="en-PK"/>
+          <w14:ligatures w14:val="none"/>
+        </w:rPr>
+      </w:pPr>
+      <w:r>
+        <w:rPr>
+          <w:b/>
+          <w:bCs/>
+          <w:sz w:val="28"/>
+          <w:szCs w:val="28"/>
+        </w:rPr>
+        <w:t>beginTime</w:t>
+      </w:r>
+      <w:r>
+        <w:rPr>
+          <w:sz w:val="28"/>
+          <w:szCs w:val="28"/>
+        </w:rPr>
+        <w:t xml:space="preserve"> (text) </w:t>
+      </w:r>
+      <w:r>
+        <w:rPr>
+          <w:b/>
+          <w:bCs/>
+          <w:sz w:val="28"/>
+          <w:szCs w:val="28"/>
+        </w:rPr>
+        <w:t xml:space="preserve">constraints: </w:t>
+      </w:r>
+      <w:r>
+        <w:rPr>
+          <w:sz w:val="28"/>
+          <w:szCs w:val="28"/>
+        </w:rPr>
         <w:t>(</w:t>
       </w:r>
-      <w:proofErr w:type="spellStart"/>
-      <w:r>
-        <w:rPr>
-          <w:sz w:val="28"/>
-          <w:szCs w:val="28"/>
-        </w:rPr>
-        <w:t>filesize</w:t>
-      </w:r>
-      <w:proofErr w:type="spellEnd"/>
-      <w:r>
-        <w:rPr>
-          <w:sz w:val="28"/>
-          <w:szCs w:val="28"/>
-        </w:rPr>
-        <w:t xml:space="preserve"> less =</w:t>
-      </w:r>
-      <w:proofErr w:type="gramStart"/>
-      <w:r>
-        <w:rPr>
-          <w:sz w:val="28"/>
-          <w:szCs w:val="28"/>
-        </w:rPr>
-        <w:t>&gt;  than</w:t>
-      </w:r>
-      <w:proofErr w:type="gramEnd"/>
-      <w:r>
-        <w:rPr>
-          <w:sz w:val="28"/>
-          <w:szCs w:val="28"/>
-        </w:rPr>
-        <w:t xml:space="preserve"> 200KB, file type =&gt; JPEG or JPG)</w:t>
-      </w:r>
-      <w:r>
-        <w:rPr>
-          <w:sz w:val="28"/>
-          <w:szCs w:val="28"/>
-        </w:rPr>
-        <w:t xml:space="preserve"> </w:t>
-      </w:r>
-      <w:r>
-        <w:rPr>
-          <w:b/>
-          <w:bCs/>
-          <w:i/>
-          <w:iCs/>
-          <w:sz w:val="28"/>
-          <w:szCs w:val="28"/>
-        </w:rPr>
-        <w:t>required</w:t>
-      </w:r>
-      <w:r>
-        <w:rPr>
-          <w:b/>
-          <w:bCs/>
-          <w:i/>
-          <w:iCs/>
-          <w:sz w:val="28"/>
-          <w:szCs w:val="28"/>
-        </w:rPr>
-        <w:t xml:space="preserve"> </w:t>
-      </w:r>
-    </w:p>
-    <w:p>
-      <w:pPr>
-        <w:ind w:left="720"/>
-        <w:rPr>
-          <w:b/>
-          <w:bCs/>
-          <w:i/>
-          <w:iCs/>
-          <w:sz w:val="28"/>
-          <w:szCs w:val="28"/>
-        </w:rPr>
-      </w:pPr>
-      <w:r>
-        <w:rPr>
-          <w:b/>
-          <w:bCs/>
-          <w:i/>
-          <w:iCs/>
+      <w:r>
+        <w:rPr>
+          <w:rFonts w:ascii="Segoe UI" w:eastAsia="Times New Roman" w:hAnsi="Segoe UI" w:cs="Segoe UI"/>
+          <w:color w:val="0451A5"/>
+          <w:kern w:val="0"/>
+          <w:sz w:val="26"/>
+          <w:szCs w:val="26"/>
+          <w:lang w:eastAsia="en-PK"/>
+          <w14:ligatures w14:val="none"/>
+        </w:rPr>
+        <w:t>must be in format YYYY-MM-DDTHH:mm:ss (e.g. 2024-01-01T00:00:00</w:t>
+      </w:r>
+      <w:r>
+        <w:rPr>
+          <w:rFonts w:ascii="Segoe UI" w:hAnsi="Segoe UI" w:cs="Segoe UI"/>
+          <w:sz w:val="26"/>
+          <w:szCs w:val="26"/>
+        </w:rPr>
+        <w:t xml:space="preserve">) </w:t>
+      </w:r>
+      <w:r>
+        <w:rPr>
+          <w:b/>
+          <w:bCs/>
+          <w:i/>
+          <w:iCs/>
+          <w:sz w:val="28"/>
+          <w:szCs w:val="28"/>
+        </w:rPr>
+        <w:t>optional (default:</w:t>
+      </w:r>
+      <w:r>
+        <w:rPr>
+          <w:rFonts w:ascii="Segoe UI" w:eastAsia="Times New Roman" w:hAnsi="Segoe UI" w:cs="Segoe UI"/>
+          <w:color w:val="0451A5"/>
+          <w:kern w:val="0"/>
+          <w:sz w:val="26"/>
+          <w:szCs w:val="26"/>
+          <w:lang w:eastAsia="en-PK"/>
+          <w14:ligatures w14:val="none"/>
+        </w:rPr>
+        <w:t xml:space="preserve"> 202</w:t>
+      </w:r>
+      <w:r>
+        <w:rPr>
+          <w:rFonts w:ascii="Segoe UI" w:eastAsia="Times New Roman" w:hAnsi="Segoe UI" w:cs="Segoe UI"/>
+          <w:color w:val="0451A5"/>
+          <w:kern w:val="0"/>
+          <w:sz w:val="26"/>
+          <w:szCs w:val="26"/>
+          <w:lang w:eastAsia="en-PK"/>
+          <w14:ligatures w14:val="none"/>
+        </w:rPr>
+        <w:t>6</w:t>
+      </w:r>
+      <w:r>
+        <w:rPr>
+          <w:rFonts w:ascii="Segoe UI" w:eastAsia="Times New Roman" w:hAnsi="Segoe UI" w:cs="Segoe UI"/>
+          <w:color w:val="0451A5"/>
+          <w:kern w:val="0"/>
+          <w:sz w:val="26"/>
+          <w:szCs w:val="26"/>
+          <w:lang w:eastAsia="en-PK"/>
+          <w14:ligatures w14:val="none"/>
+        </w:rPr>
+        <w:t>-01-01T00:00:00</w:t>
+      </w:r>
+      <w:r>
+        <w:rPr>
+          <w:b/>
+          <w:bCs/>
+          <w:i/>
+          <w:iCs/>
+          <w:sz w:val="28"/>
+          <w:szCs w:val="28"/>
+        </w:rPr>
+        <w:t>)</w:t>
+      </w:r>
+    </w:p>
+    <w:p>
+      <w:pPr>
+        <w:shd w:val="clear" w:color="auto" w:fill="FFFFFF"/>
+        <w:spacing w:line="270" w:lineRule="atLeast"/>
+        <w:ind w:left="720"/>
+        <w:rPr>
+          <w:rFonts w:ascii="Courier New" w:eastAsia="Times New Roman" w:hAnsi="Courier New" w:cs="Courier New"/>
+          <w:color w:val="000000"/>
+          <w:kern w:val="0"/>
+          <w:sz w:val="18"/>
+          <w:szCs w:val="18"/>
+          <w:lang w:eastAsia="en-PK"/>
+          <w14:ligatures w14:val="none"/>
+        </w:rPr>
+      </w:pPr>
+      <w:r>
+        <w:rPr>
+          <w:b/>
+          <w:bCs/>
+          <w:sz w:val="28"/>
+          <w:szCs w:val="28"/>
+        </w:rPr>
+        <w:t>endTime</w:t>
+      </w:r>
+      <w:r>
+        <w:rPr>
+          <w:sz w:val="28"/>
+          <w:szCs w:val="28"/>
+        </w:rPr>
+        <w:t xml:space="preserve"> (text) </w:t>
+      </w:r>
+      <w:r>
+        <w:rPr>
+          <w:b/>
+          <w:bCs/>
+          <w:sz w:val="28"/>
+          <w:szCs w:val="28"/>
+        </w:rPr>
+        <w:t xml:space="preserve">constraints: </w:t>
+      </w:r>
+      <w:r>
+        <w:rPr>
+          <w:sz w:val="28"/>
+          <w:szCs w:val="28"/>
+        </w:rPr>
+        <w:t>(</w:t>
+      </w:r>
+      <w:r>
+        <w:rPr>
+          <w:rFonts w:ascii="Segoe UI" w:eastAsia="Times New Roman" w:hAnsi="Segoe UI" w:cs="Segoe UI"/>
+          <w:color w:val="0451A5"/>
+          <w:kern w:val="0"/>
+          <w:sz w:val="26"/>
+          <w:szCs w:val="26"/>
+          <w:lang w:eastAsia="en-PK"/>
+          <w14:ligatures w14:val="none"/>
+        </w:rPr>
+        <w:t>must be in format YYYY-MM-DDTHH:mm:ss (e.g. 2024-01-01T00:00:00</w:t>
+      </w:r>
+      <w:r>
+        <w:rPr>
+          <w:rFonts w:ascii="Segoe UI" w:hAnsi="Segoe UI" w:cs="Segoe UI"/>
+          <w:sz w:val="26"/>
+          <w:szCs w:val="26"/>
+        </w:rPr>
+        <w:t xml:space="preserve">) </w:t>
+      </w:r>
+      <w:r>
+        <w:rPr>
+          <w:b/>
+          <w:bCs/>
+          <w:i/>
+          <w:iCs/>
+          <w:sz w:val="28"/>
+          <w:szCs w:val="28"/>
+        </w:rPr>
+        <w:t>optional (default:</w:t>
+      </w:r>
+      <w:r>
+        <w:rPr>
+          <w:rFonts w:ascii="Segoe UI" w:eastAsia="Times New Roman" w:hAnsi="Segoe UI" w:cs="Segoe UI"/>
+          <w:color w:val="0451A5"/>
+          <w:kern w:val="0"/>
+          <w:sz w:val="26"/>
+          <w:szCs w:val="26"/>
+          <w:lang w:eastAsia="en-PK"/>
+          <w14:ligatures w14:val="none"/>
+        </w:rPr>
+        <w:t xml:space="preserve"> 20</w:t>
+      </w:r>
+      <w:r>
+        <w:rPr>
+          <w:rFonts w:ascii="Segoe UI" w:eastAsia="Times New Roman" w:hAnsi="Segoe UI" w:cs="Segoe UI"/>
+          <w:color w:val="0451A5"/>
+          <w:kern w:val="0"/>
+          <w:sz w:val="26"/>
+          <w:szCs w:val="26"/>
+          <w:lang w:eastAsia="en-PK"/>
+          <w14:ligatures w14:val="none"/>
+        </w:rPr>
+        <w:t>30</w:t>
+      </w:r>
+      <w:r>
+        <w:rPr>
+          <w:rFonts w:ascii="Segoe UI" w:eastAsia="Times New Roman" w:hAnsi="Segoe UI" w:cs="Segoe UI"/>
+          <w:color w:val="0451A5"/>
+          <w:kern w:val="0"/>
+          <w:sz w:val="26"/>
+          <w:szCs w:val="26"/>
+          <w:lang w:eastAsia="en-PK"/>
+          <w14:ligatures w14:val="none"/>
+        </w:rPr>
+        <w:t>-1</w:t>
+      </w:r>
+      <w:r>
+        <w:rPr>
+          <w:rFonts w:ascii="Segoe UI" w:eastAsia="Times New Roman" w:hAnsi="Segoe UI" w:cs="Segoe UI"/>
+          <w:color w:val="0451A5"/>
+          <w:kern w:val="0"/>
+          <w:sz w:val="26"/>
+          <w:szCs w:val="26"/>
+          <w:lang w:eastAsia="en-PK"/>
+          <w14:ligatures w14:val="none"/>
+        </w:rPr>
+        <w:t>2</w:t>
+      </w:r>
+      <w:r>
+        <w:rPr>
+          <w:rFonts w:ascii="Segoe UI" w:eastAsia="Times New Roman" w:hAnsi="Segoe UI" w:cs="Segoe UI"/>
+          <w:color w:val="0451A5"/>
+          <w:kern w:val="0"/>
+          <w:sz w:val="26"/>
+          <w:szCs w:val="26"/>
+          <w:lang w:eastAsia="en-PK"/>
+          <w14:ligatures w14:val="none"/>
+        </w:rPr>
+        <w:t>-</w:t>
+      </w:r>
+      <w:r>
+        <w:rPr>
+          <w:rFonts w:ascii="Segoe UI" w:eastAsia="Times New Roman" w:hAnsi="Segoe UI" w:cs="Segoe UI"/>
+          <w:color w:val="0451A5"/>
+          <w:kern w:val="0"/>
+          <w:sz w:val="26"/>
+          <w:szCs w:val="26"/>
+          <w:lang w:eastAsia="en-PK"/>
+          <w14:ligatures w14:val="none"/>
+        </w:rPr>
+        <w:t>3</w:t>
+      </w:r>
+      <w:r>
+        <w:rPr>
+          <w:rFonts w:ascii="Segoe UI" w:eastAsia="Times New Roman" w:hAnsi="Segoe UI" w:cs="Segoe UI"/>
+          <w:color w:val="0451A5"/>
+          <w:kern w:val="0"/>
+          <w:sz w:val="26"/>
+          <w:szCs w:val="26"/>
+          <w:lang w:eastAsia="en-PK"/>
+          <w14:ligatures w14:val="none"/>
+        </w:rPr>
+        <w:t>1T</w:t>
+      </w:r>
+      <w:r>
+        <w:rPr>
+          <w:rFonts w:ascii="Segoe UI" w:eastAsia="Times New Roman" w:hAnsi="Segoe UI" w:cs="Segoe UI"/>
+          <w:color w:val="0451A5"/>
+          <w:kern w:val="0"/>
+          <w:sz w:val="26"/>
+          <w:szCs w:val="26"/>
+          <w:lang w:eastAsia="en-PK"/>
+          <w14:ligatures w14:val="none"/>
+        </w:rPr>
+        <w:t>23</w:t>
+      </w:r>
+      <w:r>
+        <w:rPr>
+          <w:rFonts w:ascii="Segoe UI" w:eastAsia="Times New Roman" w:hAnsi="Segoe UI" w:cs="Segoe UI"/>
+          <w:color w:val="0451A5"/>
+          <w:kern w:val="0"/>
+          <w:sz w:val="26"/>
+          <w:szCs w:val="26"/>
+          <w:lang w:eastAsia="en-PK"/>
+          <w14:ligatures w14:val="none"/>
+        </w:rPr>
+        <w:t>:</w:t>
+      </w:r>
+      <w:r>
+        <w:rPr>
+          <w:rFonts w:ascii="Segoe UI" w:eastAsia="Times New Roman" w:hAnsi="Segoe UI" w:cs="Segoe UI"/>
+          <w:color w:val="0451A5"/>
+          <w:kern w:val="0"/>
+          <w:sz w:val="26"/>
+          <w:szCs w:val="26"/>
+          <w:lang w:eastAsia="en-PK"/>
+          <w14:ligatures w14:val="none"/>
+        </w:rPr>
+        <w:t>59</w:t>
+      </w:r>
+      <w:r>
+        <w:rPr>
+          <w:rFonts w:ascii="Segoe UI" w:eastAsia="Times New Roman" w:hAnsi="Segoe UI" w:cs="Segoe UI"/>
+          <w:color w:val="0451A5"/>
+          <w:kern w:val="0"/>
+          <w:sz w:val="26"/>
+          <w:szCs w:val="26"/>
+          <w:lang w:eastAsia="en-PK"/>
+          <w14:ligatures w14:val="none"/>
+        </w:rPr>
+        <w:t>:</w:t>
+      </w:r>
+      <w:r>
+        <w:rPr>
+          <w:rFonts w:ascii="Segoe UI" w:eastAsia="Times New Roman" w:hAnsi="Segoe UI" w:cs="Segoe UI"/>
+          <w:color w:val="0451A5"/>
+          <w:kern w:val="0"/>
+          <w:sz w:val="26"/>
+          <w:szCs w:val="26"/>
+          <w:lang w:eastAsia="en-PK"/>
+          <w14:ligatures w14:val="none"/>
+        </w:rPr>
+        <w:t>59</w:t>
+      </w:r>
+      <w:r>
+        <w:rPr>
+          <w:b/>
+          <w:bCs/>
+          <w:i/>
+          <w:iCs/>
+          <w:sz w:val="28"/>
+          <w:szCs w:val="28"/>
+        </w:rPr>
+        <w:t>)</w:t>
+      </w:r>
+    </w:p>
+    <w:p>
+      <w:pPr>
+        <w:shd w:val="clear" w:color="auto" w:fill="FFFFFF"/>
+        <w:spacing w:line="270" w:lineRule="atLeast"/>
+        <w:ind w:left="720"/>
+        <w:rPr>
+          <w:rFonts w:ascii="Courier New" w:eastAsia="Times New Roman" w:hAnsi="Courier New" w:cs="Courier New"/>
+          <w:color w:val="000000"/>
+          <w:kern w:val="0"/>
+          <w:sz w:val="18"/>
+          <w:szCs w:val="18"/>
+          <w:lang w:eastAsia="en-PK"/>
+          <w14:ligatures w14:val="none"/>
+        </w:rPr>
+      </w:pPr>
+    </w:p>
+    <w:p>
+      <w:pPr>
+        <w:ind w:left="720"/>
+        <w:rPr>
+          <w:b/>
+          <w:bCs/>
+          <w:i/>
+          <w:iCs/>
+          <w:caps/>
+          <w:sz w:val="28"/>
+          <w:szCs w:val="28"/>
+        </w:rPr>
+      </w:pPr>
+      <w:r>
+        <w:rPr>
+          <w:b/>
+          <w:bCs/>
+          <w:i/>
+          <w:iCs/>
+          <w:caps/>
           <w:sz w:val="28"/>
           <w:szCs w:val="28"/>
         </w:rPr>
@@ -540,16 +953,18 @@
           <w:bCs/>
           <w:i/>
           <w:iCs/>
-          <w:sz w:val="28"/>
-          <w:szCs w:val="28"/>
-        </w:rPr>
-      </w:pPr>
-      <w:r>
-        <w:rPr>
-          <w:b/>
-          <w:bCs/>
-          <w:i/>
-          <w:iCs/>
+          <w:caps/>
+          <w:sz w:val="28"/>
+          <w:szCs w:val="28"/>
+        </w:rPr>
+      </w:pPr>
+      <w:r>
+        <w:rPr>
+          <w:b/>
+          <w:bCs/>
+          <w:i/>
+          <w:iCs/>
+          <w:caps/>
           <w:sz w:val="28"/>
           <w:szCs w:val="28"/>
         </w:rPr>
@@ -558,7 +973,6 @@
     </w:p>
     <w:p>
       <w:pPr>
-        <w:ind w:left="720"/>
         <w:rPr>
           <w:sz w:val="28"/>
           <w:szCs w:val="28"/>
@@ -570,11 +984,12 @@
           <w:sz w:val="28"/>
           <w:szCs w:val="28"/>
         </w:rPr>
+        <w:lastRenderedPageBreak/>
         <w:drawing>
-          <wp:inline distT="0" distB="0" distL="0" distR="0" wp14:anchorId="3C654F38" wp14:editId="42650AA1">
-            <wp:extent cx="5731510" cy="3703320"/>
+          <wp:inline distT="0" distB="0" distL="0" distR="0" wp14:anchorId="278A0296" wp14:editId="4A6EF7EE">
+            <wp:extent cx="5731510" cy="2656840"/>
             <wp:effectExtent l="0" t="0" r="2540" b="0"/>
-            <wp:docPr id="1189504577" name="Picture 1"/>
+            <wp:docPr id="1467012599" name="Picture 1"/>
             <wp:cNvGraphicFramePr>
               <a:graphicFrameLocks xmlns:a="http://schemas.openxmlformats.org/drawingml/2006/main" noChangeAspect="1"/>
             </wp:cNvGraphicFramePr>
@@ -582,7 +997,7 @@
               <a:graphicData uri="http://schemas.openxmlformats.org/drawingml/2006/picture">
                 <pic:pic xmlns:pic="http://schemas.openxmlformats.org/drawingml/2006/picture">
                   <pic:nvPicPr>
-                    <pic:cNvPr id="1189504577" name=""/>
+                    <pic:cNvPr id="1467012599" name=""/>
                     <pic:cNvPicPr/>
                   </pic:nvPicPr>
                   <pic:blipFill>
@@ -594,7 +1009,7 @@
                   <pic:spPr>
                     <a:xfrm>
                       <a:off x="0" y="0"/>
-                      <a:ext cx="5731510" cy="3703320"/>
+                      <a:ext cx="5731510" cy="2656840"/>
                     </a:xfrm>
                     <a:prstGeom prst="rect">
                       <a:avLst/>
@@ -609,6 +1024,15 @@
     </w:p>
     <w:p>
       <w:pPr>
+        <w:ind w:left="720"/>
+        <w:rPr>
+          <w:sz w:val="28"/>
+          <w:szCs w:val="28"/>
+        </w:rPr>
+      </w:pPr>
+    </w:p>
+    <w:p>
+      <w:pPr>
         <w:pStyle w:val="ListParagraph"/>
         <w:numPr>
           <w:ilvl w:val="0"/>
@@ -628,48 +1052,48 @@
           <w:sz w:val="28"/>
           <w:szCs w:val="28"/>
         </w:rPr>
-        <w:t>Get all users</w:t>
-      </w:r>
-      <w:r>
-        <w:rPr>
-          <w:b/>
-          <w:bCs/>
-          <w:sz w:val="28"/>
-          <w:szCs w:val="28"/>
-        </w:rPr>
-        <w:t xml:space="preserve"> (30 per request)</w:t>
-      </w:r>
-    </w:p>
-    <w:p>
-      <w:pPr>
-        <w:ind w:left="720"/>
-        <w:rPr>
-          <w:b/>
-          <w:bCs/>
-          <w:i/>
-          <w:iCs/>
-          <w:sz w:val="28"/>
-          <w:szCs w:val="28"/>
-        </w:rPr>
-      </w:pPr>
-      <w:r>
-        <w:rPr>
-          <w:b/>
-          <w:bCs/>
-          <w:i/>
-          <w:iCs/>
-          <w:sz w:val="28"/>
-          <w:szCs w:val="28"/>
-        </w:rPr>
-        <w:lastRenderedPageBreak/>
-        <w:t>url:</w:t>
-      </w:r>
-    </w:p>
-    <w:p>
-      <w:pPr>
-        <w:ind w:left="720"/>
-        <w:rPr>
-          <w:rFonts w:ascii="Segoe UI" w:hAnsi="Segoe UI" w:cs="Segoe UI"/>
+        <w:t>Update</w:t>
+      </w:r>
+      <w:r>
+        <w:rPr>
+          <w:b/>
+          <w:bCs/>
+          <w:sz w:val="28"/>
+          <w:szCs w:val="28"/>
+        </w:rPr>
+        <w:t xml:space="preserve"> user</w:t>
+      </w:r>
+    </w:p>
+    <w:p>
+      <w:pPr>
+        <w:ind w:left="720"/>
+        <w:rPr>
+          <w:b/>
+          <w:bCs/>
+          <w:i/>
+          <w:iCs/>
+          <w:caps/>
+          <w:sz w:val="28"/>
+          <w:szCs w:val="28"/>
+        </w:rPr>
+      </w:pPr>
+      <w:r>
+        <w:rPr>
+          <w:b/>
+          <w:bCs/>
+          <w:i/>
+          <w:iCs/>
+          <w:caps/>
+          <w:sz w:val="28"/>
+          <w:szCs w:val="28"/>
+        </w:rPr>
+        <w:t>url: (Method + URL)</w:t>
+      </w:r>
+    </w:p>
+    <w:p>
+      <w:pPr>
+        <w:ind w:left="720"/>
+        <w:rPr>
           <w:sz w:val="26"/>
           <w:szCs w:val="26"/>
         </w:rPr>
@@ -680,7 +1104,15 @@
           <w:sz w:val="26"/>
           <w:szCs w:val="26"/>
         </w:rPr>
-        <w:t>GE</w:t>
+        <w:t>P</w:t>
+      </w:r>
+      <w:r>
+        <w:rPr>
+          <w:color w:val="4EA72E" w:themeColor="accent6"/>
+          <w:sz w:val="26"/>
+          <w:szCs w:val="26"/>
+        </w:rPr>
+        <w:t>U</w:t>
       </w:r>
       <w:r>
         <w:rPr>
@@ -706,9 +1138,28 @@
           <w:szCs w:val="26"/>
           <w:bdr w:val="single" w:sz="4" w:space="0" w:color="EDEDED" w:frame="1"/>
         </w:rPr>
-        <w:t xml:space="preserve">{{backend </w:t>
-      </w:r>
-      <w:proofErr w:type="spellStart"/>
+        <w:t>{{backend url}}</w:t>
+      </w:r>
+      <w:r>
+        <w:rPr>
+          <w:rFonts w:ascii="Segoe UI" w:hAnsi="Segoe UI" w:cs="Segoe UI"/>
+          <w:color w:val="212121"/>
+          <w:sz w:val="26"/>
+          <w:szCs w:val="26"/>
+          <w:shd w:val="clear" w:color="auto" w:fill="FFFFFF"/>
+        </w:rPr>
+        <w:t>/students/</w:t>
+      </w:r>
+      <w:r>
+        <w:rPr>
+          <w:rFonts w:ascii="Segoe UI" w:hAnsi="Segoe UI" w:cs="Segoe UI"/>
+          <w:color w:val="212121"/>
+          <w:sz w:val="26"/>
+          <w:szCs w:val="26"/>
+          <w:shd w:val="clear" w:color="auto" w:fill="FFFFFF"/>
+        </w:rPr>
+        <w:t>update/</w:t>
+      </w:r>
       <w:r>
         <w:rPr>
           <w:rStyle w:val="inlinevariable"/>
@@ -718,9 +1169,8 @@
           <w:szCs w:val="26"/>
           <w:bdr w:val="single" w:sz="4" w:space="0" w:color="EDEDED" w:frame="1"/>
         </w:rPr>
-        <w:t>url</w:t>
-      </w:r>
-      <w:proofErr w:type="spellEnd"/>
+        <w:t>{{</w:t>
+      </w:r>
       <w:r>
         <w:rPr>
           <w:rStyle w:val="inlinevariable"/>
@@ -730,7 +1180,651 @@
           <w:szCs w:val="26"/>
           <w:bdr w:val="single" w:sz="4" w:space="0" w:color="EDEDED" w:frame="1"/>
         </w:rPr>
+        <w:t>studentId</w:t>
+      </w:r>
+      <w:r>
+        <w:rPr>
+          <w:rStyle w:val="inlinevariable"/>
+          <w:rFonts w:ascii="Segoe UI" w:hAnsi="Segoe UI" w:cs="Segoe UI"/>
+          <w:color w:val="2552AA"/>
+          <w:sz w:val="26"/>
+          <w:szCs w:val="26"/>
+          <w:bdr w:val="single" w:sz="4" w:space="0" w:color="EDEDED" w:frame="1"/>
+        </w:rPr>
         <w:t>}}</w:t>
+      </w:r>
+    </w:p>
+    <w:p>
+      <w:pPr>
+        <w:ind w:left="720"/>
+        <w:rPr>
+          <w:b/>
+          <w:bCs/>
+          <w:i/>
+          <w:iCs/>
+          <w:caps/>
+          <w:sz w:val="28"/>
+          <w:szCs w:val="28"/>
+        </w:rPr>
+      </w:pPr>
+      <w:r>
+        <w:rPr>
+          <w:b/>
+          <w:bCs/>
+          <w:i/>
+          <w:iCs/>
+          <w:caps/>
+          <w:sz w:val="28"/>
+          <w:szCs w:val="28"/>
+        </w:rPr>
+        <w:t>params:</w:t>
+      </w:r>
+    </w:p>
+    <w:p>
+      <w:pPr>
+        <w:ind w:left="720"/>
+        <w:rPr>
+          <w:b/>
+          <w:bCs/>
+          <w:i/>
+          <w:iCs/>
+          <w:caps/>
+          <w:sz w:val="28"/>
+          <w:szCs w:val="28"/>
+        </w:rPr>
+      </w:pPr>
+      <w:r>
+        <w:rPr>
+          <w:b/>
+          <w:bCs/>
+          <w:i/>
+          <w:iCs/>
+          <w:caps/>
+          <w:sz w:val="28"/>
+          <w:szCs w:val="28"/>
+        </w:rPr>
+        <w:t>(Must PROVIDE ATLEAST ONE OF THE OPTIONAL FIELDS)</w:t>
+      </w:r>
+    </w:p>
+    <w:p>
+      <w:pPr>
+        <w:ind w:left="720"/>
+        <w:rPr>
+          <w:sz w:val="28"/>
+          <w:szCs w:val="28"/>
+        </w:rPr>
+      </w:pPr>
+      <w:r>
+        <w:rPr>
+          <w:b/>
+          <w:bCs/>
+          <w:sz w:val="28"/>
+          <w:szCs w:val="28"/>
+        </w:rPr>
+        <w:t>name</w:t>
+      </w:r>
+      <w:r>
+        <w:rPr>
+          <w:sz w:val="28"/>
+          <w:szCs w:val="28"/>
+        </w:rPr>
+        <w:t xml:space="preserve"> (text) </w:t>
+      </w:r>
+      <w:r>
+        <w:rPr>
+          <w:b/>
+          <w:bCs/>
+          <w:i/>
+          <w:iCs/>
+          <w:sz w:val="28"/>
+          <w:szCs w:val="28"/>
+        </w:rPr>
+        <w:t>optional</w:t>
+      </w:r>
+    </w:p>
+    <w:p>
+      <w:pPr>
+        <w:ind w:left="720"/>
+        <w:rPr>
+          <w:b/>
+          <w:bCs/>
+          <w:i/>
+          <w:iCs/>
+          <w:sz w:val="28"/>
+          <w:szCs w:val="28"/>
+        </w:rPr>
+      </w:pPr>
+      <w:r>
+        <w:rPr>
+          <w:b/>
+          <w:bCs/>
+          <w:sz w:val="28"/>
+          <w:szCs w:val="28"/>
+        </w:rPr>
+        <w:t>faceImage</w:t>
+      </w:r>
+      <w:r>
+        <w:rPr>
+          <w:sz w:val="28"/>
+          <w:szCs w:val="28"/>
+        </w:rPr>
+        <w:t xml:space="preserve"> (file) </w:t>
+      </w:r>
+      <w:r>
+        <w:rPr>
+          <w:b/>
+          <w:bCs/>
+          <w:sz w:val="28"/>
+          <w:szCs w:val="28"/>
+        </w:rPr>
+        <w:t xml:space="preserve">constraints: </w:t>
+      </w:r>
+      <w:r>
+        <w:rPr>
+          <w:sz w:val="28"/>
+          <w:szCs w:val="28"/>
+        </w:rPr>
+        <w:t xml:space="preserve">(filesize =&gt; less than </w:t>
+      </w:r>
+      <w:r>
+        <w:rPr>
+          <w:sz w:val="28"/>
+          <w:szCs w:val="28"/>
+        </w:rPr>
+        <w:t>5M</w:t>
+      </w:r>
+      <w:r>
+        <w:rPr>
+          <w:sz w:val="28"/>
+          <w:szCs w:val="28"/>
+        </w:rPr>
+        <w:t>B, file type =&gt; JPEG</w:t>
+      </w:r>
+      <w:r>
+        <w:rPr>
+          <w:sz w:val="28"/>
+          <w:szCs w:val="28"/>
+        </w:rPr>
+        <w:t>,</w:t>
+      </w:r>
+      <w:r>
+        <w:rPr>
+          <w:sz w:val="28"/>
+          <w:szCs w:val="28"/>
+        </w:rPr>
+        <w:t xml:space="preserve"> JPG</w:t>
+      </w:r>
+      <w:r>
+        <w:rPr>
+          <w:sz w:val="28"/>
+          <w:szCs w:val="28"/>
+        </w:rPr>
+        <w:t xml:space="preserve"> or PNG</w:t>
+      </w:r>
+      <w:r>
+        <w:rPr>
+          <w:sz w:val="28"/>
+          <w:szCs w:val="28"/>
+        </w:rPr>
+        <w:t xml:space="preserve">) </w:t>
+      </w:r>
+      <w:r>
+        <w:rPr>
+          <w:b/>
+          <w:bCs/>
+          <w:i/>
+          <w:iCs/>
+          <w:sz w:val="28"/>
+          <w:szCs w:val="28"/>
+        </w:rPr>
+        <w:t>optional</w:t>
+      </w:r>
+    </w:p>
+    <w:p>
+      <w:pPr>
+        <w:ind w:left="720"/>
+        <w:rPr>
+          <w:sz w:val="28"/>
+          <w:szCs w:val="28"/>
+        </w:rPr>
+      </w:pPr>
+      <w:r>
+        <w:rPr>
+          <w:b/>
+          <w:bCs/>
+          <w:sz w:val="28"/>
+          <w:szCs w:val="28"/>
+        </w:rPr>
+        <w:t>userType</w:t>
+      </w:r>
+      <w:r>
+        <w:rPr>
+          <w:sz w:val="28"/>
+          <w:szCs w:val="28"/>
+        </w:rPr>
+        <w:t xml:space="preserve"> (text) </w:t>
+      </w:r>
+      <w:r>
+        <w:rPr>
+          <w:b/>
+          <w:bCs/>
+          <w:sz w:val="28"/>
+          <w:szCs w:val="28"/>
+        </w:rPr>
+        <w:t xml:space="preserve">constraints: </w:t>
+      </w:r>
+      <w:r>
+        <w:rPr>
+          <w:sz w:val="28"/>
+          <w:szCs w:val="28"/>
+        </w:rPr>
+        <w:t xml:space="preserve">(can be only “normal, visitor or blackList” *case sensitive*) </w:t>
+      </w:r>
+      <w:r>
+        <w:rPr>
+          <w:b/>
+          <w:bCs/>
+          <w:i/>
+          <w:iCs/>
+          <w:sz w:val="28"/>
+          <w:szCs w:val="28"/>
+        </w:rPr>
+        <w:t>optional</w:t>
+      </w:r>
+    </w:p>
+    <w:p>
+      <w:pPr>
+        <w:shd w:val="clear" w:color="auto" w:fill="FFFFFF"/>
+        <w:spacing w:line="270" w:lineRule="atLeast"/>
+        <w:ind w:left="720"/>
+        <w:rPr>
+          <w:rFonts w:ascii="Courier New" w:eastAsia="Times New Roman" w:hAnsi="Courier New" w:cs="Courier New"/>
+          <w:color w:val="000000"/>
+          <w:kern w:val="0"/>
+          <w:sz w:val="18"/>
+          <w:szCs w:val="18"/>
+          <w:lang w:eastAsia="en-PK"/>
+          <w14:ligatures w14:val="none"/>
+        </w:rPr>
+      </w:pPr>
+      <w:r>
+        <w:rPr>
+          <w:b/>
+          <w:bCs/>
+          <w:sz w:val="28"/>
+          <w:szCs w:val="28"/>
+        </w:rPr>
+        <w:t>beginTime</w:t>
+      </w:r>
+      <w:r>
+        <w:rPr>
+          <w:sz w:val="28"/>
+          <w:szCs w:val="28"/>
+        </w:rPr>
+        <w:t xml:space="preserve"> (text) </w:t>
+      </w:r>
+      <w:r>
+        <w:rPr>
+          <w:b/>
+          <w:bCs/>
+          <w:sz w:val="28"/>
+          <w:szCs w:val="28"/>
+        </w:rPr>
+        <w:t xml:space="preserve">constraints: </w:t>
+      </w:r>
+      <w:r>
+        <w:rPr>
+          <w:sz w:val="28"/>
+          <w:szCs w:val="28"/>
+        </w:rPr>
+        <w:t>(</w:t>
+      </w:r>
+      <w:r>
+        <w:rPr>
+          <w:rFonts w:ascii="Segoe UI" w:eastAsia="Times New Roman" w:hAnsi="Segoe UI" w:cs="Segoe UI"/>
+          <w:color w:val="0451A5"/>
+          <w:kern w:val="0"/>
+          <w:sz w:val="26"/>
+          <w:szCs w:val="26"/>
+          <w:lang w:eastAsia="en-PK"/>
+          <w14:ligatures w14:val="none"/>
+        </w:rPr>
+        <w:t>must be in format YYYY-MM-DDTHH:mm:ss (e.g. 2024-01-01T00:00:00</w:t>
+      </w:r>
+      <w:r>
+        <w:rPr>
+          <w:rFonts w:ascii="Segoe UI" w:hAnsi="Segoe UI" w:cs="Segoe UI"/>
+          <w:sz w:val="26"/>
+          <w:szCs w:val="26"/>
+        </w:rPr>
+        <w:t xml:space="preserve">) </w:t>
+      </w:r>
+      <w:r>
+        <w:rPr>
+          <w:b/>
+          <w:bCs/>
+          <w:i/>
+          <w:iCs/>
+          <w:sz w:val="28"/>
+          <w:szCs w:val="28"/>
+        </w:rPr>
+        <w:t xml:space="preserve">optional </w:t>
+      </w:r>
+    </w:p>
+    <w:p>
+      <w:pPr>
+        <w:shd w:val="clear" w:color="auto" w:fill="FFFFFF"/>
+        <w:spacing w:line="270" w:lineRule="atLeast"/>
+        <w:ind w:left="720"/>
+        <w:rPr>
+          <w:rFonts w:ascii="Courier New" w:eastAsia="Times New Roman" w:hAnsi="Courier New" w:cs="Courier New"/>
+          <w:color w:val="000000"/>
+          <w:kern w:val="0"/>
+          <w:sz w:val="18"/>
+          <w:szCs w:val="18"/>
+          <w:lang w:eastAsia="en-PK"/>
+          <w14:ligatures w14:val="none"/>
+        </w:rPr>
+      </w:pPr>
+      <w:r>
+        <w:rPr>
+          <w:b/>
+          <w:bCs/>
+          <w:sz w:val="28"/>
+          <w:szCs w:val="28"/>
+        </w:rPr>
+        <w:t>endTime</w:t>
+      </w:r>
+      <w:r>
+        <w:rPr>
+          <w:sz w:val="28"/>
+          <w:szCs w:val="28"/>
+        </w:rPr>
+        <w:t xml:space="preserve"> (text) </w:t>
+      </w:r>
+      <w:r>
+        <w:rPr>
+          <w:b/>
+          <w:bCs/>
+          <w:sz w:val="28"/>
+          <w:szCs w:val="28"/>
+        </w:rPr>
+        <w:t xml:space="preserve">constraints: </w:t>
+      </w:r>
+      <w:r>
+        <w:rPr>
+          <w:sz w:val="28"/>
+          <w:szCs w:val="28"/>
+        </w:rPr>
+        <w:t>(</w:t>
+      </w:r>
+      <w:r>
+        <w:rPr>
+          <w:rFonts w:ascii="Segoe UI" w:eastAsia="Times New Roman" w:hAnsi="Segoe UI" w:cs="Segoe UI"/>
+          <w:color w:val="0451A5"/>
+          <w:kern w:val="0"/>
+          <w:sz w:val="26"/>
+          <w:szCs w:val="26"/>
+          <w:lang w:eastAsia="en-PK"/>
+          <w14:ligatures w14:val="none"/>
+        </w:rPr>
+        <w:t>must be in format YYYY-MM-DDTHH:mm:ss (e.g. 2024-01-01T00:00:00</w:t>
+      </w:r>
+      <w:r>
+        <w:rPr>
+          <w:rFonts w:ascii="Segoe UI" w:hAnsi="Segoe UI" w:cs="Segoe UI"/>
+          <w:sz w:val="26"/>
+          <w:szCs w:val="26"/>
+        </w:rPr>
+        <w:t xml:space="preserve">) </w:t>
+      </w:r>
+      <w:r>
+        <w:rPr>
+          <w:b/>
+          <w:bCs/>
+          <w:i/>
+          <w:iCs/>
+          <w:sz w:val="28"/>
+          <w:szCs w:val="28"/>
+        </w:rPr>
+        <w:t xml:space="preserve">optional </w:t>
+      </w:r>
+    </w:p>
+    <w:p>
+      <w:pPr>
+        <w:shd w:val="clear" w:color="auto" w:fill="FFFFFF"/>
+        <w:spacing w:line="270" w:lineRule="atLeast"/>
+        <w:ind w:left="720"/>
+        <w:rPr>
+          <w:rFonts w:ascii="Courier New" w:eastAsia="Times New Roman" w:hAnsi="Courier New" w:cs="Courier New"/>
+          <w:color w:val="000000"/>
+          <w:kern w:val="0"/>
+          <w:sz w:val="18"/>
+          <w:szCs w:val="18"/>
+          <w:lang w:eastAsia="en-PK"/>
+          <w14:ligatures w14:val="none"/>
+        </w:rPr>
+      </w:pPr>
+    </w:p>
+    <w:p>
+      <w:pPr>
+        <w:ind w:left="720"/>
+        <w:rPr>
+          <w:b/>
+          <w:bCs/>
+          <w:i/>
+          <w:iCs/>
+          <w:caps/>
+          <w:sz w:val="28"/>
+          <w:szCs w:val="28"/>
+        </w:rPr>
+      </w:pPr>
+      <w:r>
+        <w:rPr>
+          <w:b/>
+          <w:bCs/>
+          <w:i/>
+          <w:iCs/>
+          <w:caps/>
+          <w:sz w:val="28"/>
+          <w:szCs w:val="28"/>
+        </w:rPr>
+        <w:t>format:</w:t>
+      </w:r>
+    </w:p>
+    <w:p>
+      <w:pPr>
+        <w:ind w:left="720"/>
+        <w:rPr>
+          <w:sz w:val="28"/>
+          <w:szCs w:val="28"/>
+        </w:rPr>
+      </w:pPr>
+      <w:r>
+        <w:rPr>
+          <w:sz w:val="28"/>
+          <w:szCs w:val="28"/>
+        </w:rPr>
+        <w:t>multipart/form-data</w:t>
+      </w:r>
+    </w:p>
+    <w:p>
+      <w:pPr>
+        <w:ind w:left="720"/>
+        <w:rPr>
+          <w:b/>
+          <w:bCs/>
+          <w:i/>
+          <w:iCs/>
+          <w:caps/>
+          <w:sz w:val="28"/>
+          <w:szCs w:val="28"/>
+        </w:rPr>
+      </w:pPr>
+      <w:r>
+        <w:rPr>
+          <w:b/>
+          <w:bCs/>
+          <w:i/>
+          <w:iCs/>
+          <w:caps/>
+          <w:sz w:val="28"/>
+          <w:szCs w:val="28"/>
+        </w:rPr>
+        <w:t>example:</w:t>
+      </w:r>
+    </w:p>
+    <w:p>
+      <w:pPr>
+        <w:rPr>
+          <w:sz w:val="28"/>
+          <w:szCs w:val="28"/>
+        </w:rPr>
+      </w:pPr>
+      <w:r>
+        <w:rPr>
+          <w:sz w:val="28"/>
+          <w:szCs w:val="28"/>
+        </w:rPr>
+        <w:lastRenderedPageBreak/>
+        <w:drawing>
+          <wp:inline distT="0" distB="0" distL="0" distR="0" wp14:anchorId="3817537C" wp14:editId="5EB57CB6">
+            <wp:extent cx="5731510" cy="2744470"/>
+            <wp:effectExtent l="0" t="0" r="2540" b="0"/>
+            <wp:docPr id="880743297" name="Picture 1"/>
+            <wp:cNvGraphicFramePr>
+              <a:graphicFrameLocks xmlns:a="http://schemas.openxmlformats.org/drawingml/2006/main" noChangeAspect="1"/>
+            </wp:cNvGraphicFramePr>
+            <a:graphic xmlns:a="http://schemas.openxmlformats.org/drawingml/2006/main">
+              <a:graphicData uri="http://schemas.openxmlformats.org/drawingml/2006/picture">
+                <pic:pic xmlns:pic="http://schemas.openxmlformats.org/drawingml/2006/picture">
+                  <pic:nvPicPr>
+                    <pic:cNvPr id="880743297" name=""/>
+                    <pic:cNvPicPr/>
+                  </pic:nvPicPr>
+                  <pic:blipFill>
+                    <a:blip r:embed="rId6"/>
+                    <a:stretch>
+                      <a:fillRect/>
+                    </a:stretch>
+                  </pic:blipFill>
+                  <pic:spPr>
+                    <a:xfrm>
+                      <a:off x="0" y="0"/>
+                      <a:ext cx="5731510" cy="2744470"/>
+                    </a:xfrm>
+                    <a:prstGeom prst="rect">
+                      <a:avLst/>
+                    </a:prstGeom>
+                  </pic:spPr>
+                </pic:pic>
+              </a:graphicData>
+            </a:graphic>
+          </wp:inline>
+        </w:drawing>
+      </w:r>
+    </w:p>
+    <w:p>
+      <w:pPr>
+        <w:pStyle w:val="ListParagraph"/>
+        <w:numPr>
+          <w:ilvl w:val="0"/>
+          <w:numId w:val="1"/>
+        </w:numPr>
+        <w:rPr>
+          <w:b/>
+          <w:bCs/>
+          <w:sz w:val="28"/>
+          <w:szCs w:val="28"/>
+        </w:rPr>
+      </w:pPr>
+      <w:r>
+        <w:rPr>
+          <w:b/>
+          <w:bCs/>
+          <w:sz w:val="28"/>
+          <w:szCs w:val="28"/>
+        </w:rPr>
+        <w:t>Get all users</w:t>
+      </w:r>
+      <w:r>
+        <w:rPr>
+          <w:b/>
+          <w:bCs/>
+          <w:sz w:val="28"/>
+          <w:szCs w:val="28"/>
+        </w:rPr>
+        <w:t xml:space="preserve"> (30 per request)</w:t>
+      </w:r>
+    </w:p>
+    <w:p>
+      <w:pPr>
+        <w:ind w:left="720"/>
+        <w:rPr>
+          <w:b/>
+          <w:bCs/>
+          <w:i/>
+          <w:iCs/>
+          <w:caps/>
+          <w:sz w:val="28"/>
+          <w:szCs w:val="28"/>
+        </w:rPr>
+      </w:pPr>
+      <w:r>
+        <w:rPr>
+          <w:b/>
+          <w:bCs/>
+          <w:i/>
+          <w:iCs/>
+          <w:caps/>
+          <w:sz w:val="28"/>
+          <w:szCs w:val="28"/>
+        </w:rPr>
+        <w:t>url:</w:t>
+      </w:r>
+    </w:p>
+    <w:p>
+      <w:pPr>
+        <w:ind w:left="720"/>
+        <w:rPr>
+          <w:rFonts w:ascii="Segoe UI" w:hAnsi="Segoe UI" w:cs="Segoe UI"/>
+          <w:sz w:val="26"/>
+          <w:szCs w:val="26"/>
+        </w:rPr>
+      </w:pPr>
+      <w:r>
+        <w:rPr>
+          <w:color w:val="4EA72E" w:themeColor="accent6"/>
+          <w:sz w:val="26"/>
+          <w:szCs w:val="26"/>
+        </w:rPr>
+        <w:t>GE</w:t>
+      </w:r>
+      <w:r>
+        <w:rPr>
+          <w:color w:val="4EA72E" w:themeColor="accent6"/>
+          <w:sz w:val="26"/>
+          <w:szCs w:val="26"/>
+        </w:rPr>
+        <w:t>T</w:t>
+      </w:r>
+      <w:r>
+        <w:rPr>
+          <w:sz w:val="26"/>
+          <w:szCs w:val="26"/>
+        </w:rPr>
+        <w:t xml:space="preserve"> </w:t>
+      </w:r>
+      <w:r>
+        <w:rPr>
+          <w:rStyle w:val="inlinevariable"/>
+          <w:rFonts w:ascii="Segoe UI" w:hAnsi="Segoe UI" w:cs="Segoe UI"/>
+          <w:color w:val="2552AA"/>
+          <w:sz w:val="26"/>
+          <w:szCs w:val="26"/>
+          <w:bdr w:val="single" w:sz="4" w:space="0" w:color="EDEDED" w:frame="1"/>
+        </w:rPr>
+        <w:t>{{backend url}}</w:t>
       </w:r>
       <w:r>
         <w:rPr>
@@ -759,43 +1853,35 @@
         </w:rPr>
         <w:t xml:space="preserve"> </w:t>
       </w:r>
-      <w:proofErr w:type="spellStart"/>
       <w:r>
         <w:rPr>
           <w:rFonts w:ascii="Segoe UI" w:hAnsi="Segoe UI" w:cs="Segoe UI"/>
           <w:sz w:val="26"/>
           <w:szCs w:val="26"/>
         </w:rPr>
-        <w:t>searchID</w:t>
-      </w:r>
-      <w:proofErr w:type="spellEnd"/>
-      <w:r>
-        <w:rPr>
-          <w:rFonts w:ascii="Segoe UI" w:hAnsi="Segoe UI" w:cs="Segoe UI"/>
-          <w:sz w:val="26"/>
-          <w:szCs w:val="26"/>
-        </w:rPr>
-        <w:t>=abc123&amp;position=30&amp;limit=30</w:t>
-      </w:r>
-    </w:p>
-    <w:p>
-      <w:pPr>
-        <w:ind w:left="720"/>
-        <w:rPr>
-          <w:b/>
-          <w:bCs/>
-          <w:i/>
-          <w:iCs/>
-          <w:sz w:val="28"/>
-          <w:szCs w:val="28"/>
-        </w:rPr>
-      </w:pPr>
-      <w:r>
-        <w:rPr>
-          <w:b/>
-          <w:bCs/>
-          <w:i/>
-          <w:iCs/>
+        <w:t>searchID=abc123&amp;position=30&amp;limit=30</w:t>
+      </w:r>
+    </w:p>
+    <w:p>
+      <w:pPr>
+        <w:ind w:left="720"/>
+        <w:rPr>
+          <w:b/>
+          <w:bCs/>
+          <w:i/>
+          <w:iCs/>
+          <w:caps/>
+          <w:sz w:val="28"/>
+          <w:szCs w:val="28"/>
+        </w:rPr>
+      </w:pPr>
+      <w:r>
+        <w:rPr>
+          <w:b/>
+          <w:bCs/>
+          <w:i/>
+          <w:iCs/>
+          <w:caps/>
           <w:sz w:val="28"/>
           <w:szCs w:val="28"/>
         </w:rPr>
@@ -819,6 +1905,147 @@
           <w:sz w:val="28"/>
           <w:szCs w:val="28"/>
         </w:rPr>
+        <w:t xml:space="preserve">limit </w:t>
+      </w:r>
+      <w:r>
+        <w:rPr>
+          <w:i/>
+          <w:iCs/>
+          <w:sz w:val="28"/>
+          <w:szCs w:val="28"/>
+        </w:rPr>
+        <w:t>“query param”</w:t>
+      </w:r>
+      <w:r>
+        <w:rPr>
+          <w:sz w:val="28"/>
+          <w:szCs w:val="28"/>
+        </w:rPr>
+        <w:t xml:space="preserve"> </w:t>
+      </w:r>
+      <w:r>
+        <w:rPr>
+          <w:b/>
+          <w:bCs/>
+          <w:i/>
+          <w:iCs/>
+          <w:sz w:val="28"/>
+          <w:szCs w:val="28"/>
+        </w:rPr>
+        <w:t>optional</w:t>
+      </w:r>
+    </w:p>
+    <w:p>
+      <w:pPr>
+        <w:ind w:left="720"/>
+        <w:rPr>
+          <w:b/>
+          <w:bCs/>
+          <w:i/>
+          <w:iCs/>
+          <w:sz w:val="28"/>
+          <w:szCs w:val="28"/>
+        </w:rPr>
+      </w:pPr>
+      <w:r>
+        <w:rPr>
+          <w:sz w:val="28"/>
+          <w:szCs w:val="28"/>
+        </w:rPr>
+        <w:t xml:space="preserve">position </w:t>
+      </w:r>
+      <w:r>
+        <w:rPr>
+          <w:i/>
+          <w:iCs/>
+          <w:sz w:val="28"/>
+          <w:szCs w:val="28"/>
+        </w:rPr>
+        <w:t>“query param”</w:t>
+      </w:r>
+      <w:r>
+        <w:rPr>
+          <w:sz w:val="28"/>
+          <w:szCs w:val="28"/>
+        </w:rPr>
+        <w:t xml:space="preserve"> </w:t>
+      </w:r>
+      <w:r>
+        <w:rPr>
+          <w:b/>
+          <w:bCs/>
+          <w:i/>
+          <w:iCs/>
+          <w:sz w:val="28"/>
+          <w:szCs w:val="28"/>
+        </w:rPr>
+        <w:t>optional</w:t>
+      </w:r>
+    </w:p>
+    <w:p>
+      <w:pPr>
+        <w:ind w:left="720"/>
+        <w:rPr>
+          <w:b/>
+          <w:bCs/>
+          <w:i/>
+          <w:iCs/>
+          <w:sz w:val="28"/>
+          <w:szCs w:val="28"/>
+        </w:rPr>
+      </w:pPr>
+      <w:r>
+        <w:rPr>
+          <w:b/>
+          <w:bCs/>
+          <w:i/>
+          <w:iCs/>
+          <w:sz w:val="28"/>
+          <w:szCs w:val="28"/>
+        </w:rPr>
+        <w:t>description of params:</w:t>
+      </w:r>
+    </w:p>
+    <w:p>
+      <w:pPr>
+        <w:ind w:left="720"/>
+        <w:rPr>
+          <w:sz w:val="28"/>
+          <w:szCs w:val="28"/>
+        </w:rPr>
+      </w:pPr>
+      <w:r>
+        <w:rPr>
+          <w:b/>
+          <w:bCs/>
+          <w:sz w:val="28"/>
+          <w:szCs w:val="28"/>
+        </w:rPr>
+        <w:t>without params</w:t>
+      </w:r>
+      <w:r>
+        <w:rPr>
+          <w:sz w:val="28"/>
+          <w:szCs w:val="28"/>
+        </w:rPr>
+        <w:t xml:space="preserve"> gives response for only first 30 users</w:t>
+      </w:r>
+    </w:p>
+    <w:p>
+      <w:pPr>
+        <w:ind w:left="720"/>
+        <w:rPr>
+          <w:sz w:val="28"/>
+          <w:szCs w:val="28"/>
+        </w:rPr>
+      </w:pPr>
+      <w:r>
+        <w:rPr>
+          <w:b/>
+          <w:bCs/>
+          <w:sz w:val="28"/>
+          <w:szCs w:val="28"/>
+        </w:rPr>
         <w:t>limit</w:t>
       </w:r>
       <w:r>
@@ -826,161 +2053,6 @@
           <w:sz w:val="28"/>
           <w:szCs w:val="28"/>
         </w:rPr>
-        <w:t xml:space="preserve"> </w:t>
-      </w:r>
-      <w:r>
-        <w:rPr>
-          <w:i/>
-          <w:iCs/>
-          <w:sz w:val="28"/>
-          <w:szCs w:val="28"/>
-        </w:rPr>
-        <w:t>“query param”</w:t>
-      </w:r>
-      <w:r>
-        <w:rPr>
-          <w:sz w:val="28"/>
-          <w:szCs w:val="28"/>
-        </w:rPr>
-        <w:t xml:space="preserve"> </w:t>
-      </w:r>
-      <w:r>
-        <w:rPr>
-          <w:b/>
-          <w:bCs/>
-          <w:i/>
-          <w:iCs/>
-          <w:sz w:val="28"/>
-          <w:szCs w:val="28"/>
-        </w:rPr>
-        <w:t>optional</w:t>
-      </w:r>
-    </w:p>
-    <w:p>
-      <w:pPr>
-        <w:ind w:left="720"/>
-        <w:rPr>
-          <w:b/>
-          <w:bCs/>
-          <w:i/>
-          <w:iCs/>
-          <w:sz w:val="28"/>
-          <w:szCs w:val="28"/>
-        </w:rPr>
-      </w:pPr>
-      <w:r>
-        <w:rPr>
-          <w:sz w:val="28"/>
-          <w:szCs w:val="28"/>
-        </w:rPr>
-        <w:t>position</w:t>
-      </w:r>
-      <w:r>
-        <w:rPr>
-          <w:sz w:val="28"/>
-          <w:szCs w:val="28"/>
-        </w:rPr>
-        <w:t xml:space="preserve"> </w:t>
-      </w:r>
-      <w:r>
-        <w:rPr>
-          <w:i/>
-          <w:iCs/>
-          <w:sz w:val="28"/>
-          <w:szCs w:val="28"/>
-        </w:rPr>
-        <w:t>“query param”</w:t>
-      </w:r>
-      <w:r>
-        <w:rPr>
-          <w:sz w:val="28"/>
-          <w:szCs w:val="28"/>
-        </w:rPr>
-        <w:t xml:space="preserve"> </w:t>
-      </w:r>
-      <w:r>
-        <w:rPr>
-          <w:b/>
-          <w:bCs/>
-          <w:i/>
-          <w:iCs/>
-          <w:sz w:val="28"/>
-          <w:szCs w:val="28"/>
-        </w:rPr>
-        <w:t>optional</w:t>
-      </w:r>
-    </w:p>
-    <w:p>
-      <w:pPr>
-        <w:ind w:left="720"/>
-        <w:rPr>
-          <w:b/>
-          <w:bCs/>
-          <w:i/>
-          <w:iCs/>
-          <w:sz w:val="28"/>
-          <w:szCs w:val="28"/>
-        </w:rPr>
-      </w:pPr>
-      <w:r>
-        <w:rPr>
-          <w:b/>
-          <w:bCs/>
-          <w:i/>
-          <w:iCs/>
-          <w:sz w:val="28"/>
-          <w:szCs w:val="28"/>
-        </w:rPr>
-        <w:t>description of params:</w:t>
-      </w:r>
-    </w:p>
-    <w:p>
-      <w:pPr>
-        <w:ind w:left="720"/>
-        <w:rPr>
-          <w:sz w:val="28"/>
-          <w:szCs w:val="28"/>
-        </w:rPr>
-      </w:pPr>
-      <w:r>
-        <w:rPr>
-          <w:b/>
-          <w:bCs/>
-          <w:sz w:val="28"/>
-          <w:szCs w:val="28"/>
-        </w:rPr>
-        <w:t>without params</w:t>
-      </w:r>
-      <w:r>
-        <w:rPr>
-          <w:sz w:val="28"/>
-          <w:szCs w:val="28"/>
-        </w:rPr>
-        <w:t xml:space="preserve"> gives response for only first 30 users</w:t>
-      </w:r>
-    </w:p>
-    <w:p>
-      <w:pPr>
-        <w:ind w:left="720"/>
-        <w:rPr>
-          <w:sz w:val="28"/>
-          <w:szCs w:val="28"/>
-        </w:rPr>
-      </w:pPr>
-      <w:r>
-        <w:rPr>
-          <w:b/>
-          <w:bCs/>
-          <w:sz w:val="28"/>
-          <w:szCs w:val="28"/>
-        </w:rPr>
-        <w:t>limit</w:t>
-      </w:r>
-      <w:r>
-        <w:rPr>
-          <w:sz w:val="28"/>
-          <w:szCs w:val="28"/>
-        </w:rPr>
         <w:t xml:space="preserve"> sets the users</w:t>
       </w:r>
       <w:r>
@@ -988,14 +2060,7 @@
           <w:sz w:val="28"/>
           <w:szCs w:val="28"/>
         </w:rPr>
-        <w:t xml:space="preserve"> </w:t>
-      </w:r>
-      <w:r>
-        <w:rPr>
-          <w:sz w:val="28"/>
-          <w:szCs w:val="28"/>
-        </w:rPr>
-        <w:t>returned</w:t>
+        <w:t xml:space="preserve"> returned</w:t>
       </w:r>
       <w:r>
         <w:rPr>
@@ -1054,9 +2119,11 @@
       </w:pPr>
       <w:r>
         <w:rPr>
-          <w:sz w:val="28"/>
-          <w:szCs w:val="28"/>
-        </w:rPr>
+          <w:noProof/>
+          <w:sz w:val="28"/>
+          <w:szCs w:val="28"/>
+        </w:rPr>
+        <w:lastRenderedPageBreak/>
         <w:drawing>
           <wp:inline distT="0" distB="0" distL="0" distR="0" wp14:anchorId="002DD95D" wp14:editId="688EB1B9">
             <wp:extent cx="5731510" cy="1732280"/>
@@ -1073,7 +2140,7 @@
                     <pic:cNvPicPr/>
                   </pic:nvPicPr>
                   <pic:blipFill>
-                    <a:blip r:embed="rId6"/>
+                    <a:blip r:embed="rId7"/>
                     <a:stretch>
                       <a:fillRect/>
                     </a:stretch>
@@ -1102,16 +2169,18 @@
           <w:bCs/>
           <w:i/>
           <w:iCs/>
-          <w:sz w:val="28"/>
-          <w:szCs w:val="28"/>
-        </w:rPr>
-      </w:pPr>
-      <w:r>
-        <w:rPr>
-          <w:b/>
-          <w:bCs/>
-          <w:i/>
-          <w:iCs/>
+          <w:caps/>
+          <w:sz w:val="28"/>
+          <w:szCs w:val="28"/>
+        </w:rPr>
+      </w:pPr>
+      <w:r>
+        <w:rPr>
+          <w:b/>
+          <w:bCs/>
+          <w:i/>
+          <w:iCs/>
+          <w:caps/>
           <w:sz w:val="28"/>
           <w:szCs w:val="28"/>
         </w:rPr>
@@ -1159,16 +2228,18 @@
           <w:bCs/>
           <w:i/>
           <w:iCs/>
-          <w:sz w:val="28"/>
-          <w:szCs w:val="28"/>
-        </w:rPr>
-      </w:pPr>
-      <w:r>
-        <w:rPr>
-          <w:b/>
-          <w:bCs/>
-          <w:i/>
-          <w:iCs/>
+          <w:caps/>
+          <w:sz w:val="28"/>
+          <w:szCs w:val="28"/>
+        </w:rPr>
+      </w:pPr>
+      <w:r>
+        <w:rPr>
+          <w:b/>
+          <w:bCs/>
+          <w:i/>
+          <w:iCs/>
+          <w:caps/>
           <w:sz w:val="28"/>
           <w:szCs w:val="28"/>
         </w:rPr>
@@ -1187,7 +2258,6 @@
           <w:sz w:val="28"/>
           <w:szCs w:val="28"/>
         </w:rPr>
-        <w:lastRenderedPageBreak/>
         <w:tab/>
       </w:r>
       <w:r>
@@ -1212,7 +2282,7 @@
                     <pic:cNvPicPr/>
                   </pic:nvPicPr>
                   <pic:blipFill>
-                    <a:blip r:embed="rId7"/>
+                    <a:blip r:embed="rId8"/>
                     <a:stretch>
                       <a:fillRect/>
                     </a:stretch>
@@ -1280,16 +2350,18 @@
           <w:bCs/>
           <w:i/>
           <w:iCs/>
-          <w:sz w:val="28"/>
-          <w:szCs w:val="28"/>
-        </w:rPr>
-      </w:pPr>
-      <w:r>
-        <w:rPr>
-          <w:b/>
-          <w:bCs/>
-          <w:i/>
-          <w:iCs/>
+          <w:caps/>
+          <w:sz w:val="28"/>
+          <w:szCs w:val="28"/>
+        </w:rPr>
+      </w:pPr>
+      <w:r>
+        <w:rPr>
+          <w:b/>
+          <w:bCs/>
+          <w:i/>
+          <w:iCs/>
+          <w:caps/>
           <w:sz w:val="28"/>
           <w:szCs w:val="28"/>
         </w:rPr>
@@ -1347,9 +2419,18 @@
           <w:szCs w:val="26"/>
           <w:bdr w:val="single" w:sz="4" w:space="0" w:color="EDEDED" w:frame="1"/>
         </w:rPr>
-        <w:t xml:space="preserve">{{backend </w:t>
-      </w:r>
-      <w:proofErr w:type="spellStart"/>
+        <w:t>{{backend url}}</w:t>
+      </w:r>
+      <w:r>
+        <w:rPr>
+          <w:rFonts w:ascii="Segoe UI" w:hAnsi="Segoe UI" w:cs="Segoe UI"/>
+          <w:color w:val="212121"/>
+          <w:sz w:val="26"/>
+          <w:szCs w:val="26"/>
+          <w:shd w:val="clear" w:color="auto" w:fill="FFFFFF"/>
+        </w:rPr>
+        <w:t>/students/</w:t>
+      </w:r>
       <w:r>
         <w:rPr>
           <w:rStyle w:val="inlinevariable"/>
@@ -1359,9 +2440,8 @@
           <w:szCs w:val="26"/>
           <w:bdr w:val="single" w:sz="4" w:space="0" w:color="EDEDED" w:frame="1"/>
         </w:rPr>
-        <w:t>url</w:t>
-      </w:r>
-      <w:proofErr w:type="spellEnd"/>
+        <w:t>{{</w:t>
+      </w:r>
       <w:r>
         <w:rPr>
           <w:rStyle w:val="inlinevariable"/>
@@ -1371,17 +2451,7 @@
           <w:szCs w:val="26"/>
           <w:bdr w:val="single" w:sz="4" w:space="0" w:color="EDEDED" w:frame="1"/>
         </w:rPr>
-        <w:t>}}</w:t>
-      </w:r>
-      <w:r>
-        <w:rPr>
-          <w:rFonts w:ascii="Segoe UI" w:hAnsi="Segoe UI" w:cs="Segoe UI"/>
-          <w:color w:val="212121"/>
-          <w:sz w:val="26"/>
-          <w:szCs w:val="26"/>
-          <w:shd w:val="clear" w:color="auto" w:fill="FFFFFF"/>
-        </w:rPr>
-        <w:t>/students/</w:t>
+        <w:t>studentId</w:t>
       </w:r>
       <w:r>
         <w:rPr>
@@ -1392,30 +2462,6 @@
           <w:szCs w:val="26"/>
           <w:bdr w:val="single" w:sz="4" w:space="0" w:color="EDEDED" w:frame="1"/>
         </w:rPr>
-        <w:t>{{</w:t>
-      </w:r>
-      <w:proofErr w:type="spellStart"/>
-      <w:r>
-        <w:rPr>
-          <w:rStyle w:val="inlinevariable"/>
-          <w:rFonts w:ascii="Segoe UI" w:hAnsi="Segoe UI" w:cs="Segoe UI"/>
-          <w:color w:val="2552AA"/>
-          <w:sz w:val="26"/>
-          <w:szCs w:val="26"/>
-          <w:bdr w:val="single" w:sz="4" w:space="0" w:color="EDEDED" w:frame="1"/>
-        </w:rPr>
-        <w:t>studentId</w:t>
-      </w:r>
-      <w:proofErr w:type="spellEnd"/>
-      <w:r>
-        <w:rPr>
-          <w:rStyle w:val="inlinevariable"/>
-          <w:rFonts w:ascii="Segoe UI" w:hAnsi="Segoe UI" w:cs="Segoe UI"/>
-          <w:color w:val="2552AA"/>
-          <w:sz w:val="26"/>
-          <w:szCs w:val="26"/>
-          <w:bdr w:val="single" w:sz="4" w:space="0" w:color="EDEDED" w:frame="1"/>
-        </w:rPr>
         <w:t>}}</w:t>
       </w:r>
     </w:p>
@@ -1427,19 +2473,22 @@
           <w:bCs/>
           <w:i/>
           <w:iCs/>
-          <w:sz w:val="28"/>
-          <w:szCs w:val="28"/>
-        </w:rPr>
-      </w:pPr>
-      <w:r>
-        <w:rPr>
-          <w:b/>
-          <w:bCs/>
-          <w:i/>
-          <w:iCs/>
-          <w:sz w:val="28"/>
-          <w:szCs w:val="28"/>
-        </w:rPr>
+          <w:caps/>
+          <w:sz w:val="28"/>
+          <w:szCs w:val="28"/>
+        </w:rPr>
+      </w:pPr>
+      <w:r>
+        <w:rPr>
+          <w:b/>
+          <w:bCs/>
+          <w:i/>
+          <w:iCs/>
+          <w:caps/>
+          <w:sz w:val="28"/>
+          <w:szCs w:val="28"/>
+        </w:rPr>
+        <w:lastRenderedPageBreak/>
         <w:t>params:</w:t>
       </w:r>
     </w:p>
@@ -1451,17 +2500,26 @@
           <w:szCs w:val="28"/>
         </w:rPr>
       </w:pPr>
-      <w:proofErr w:type="spellStart"/>
-      <w:r>
-        <w:rPr>
-          <w:sz w:val="28"/>
-          <w:szCs w:val="28"/>
-        </w:rPr>
-        <w:t>studentId</w:t>
-      </w:r>
-      <w:proofErr w:type="spellEnd"/>
-      <w:r>
-        <w:rPr>
+      <w:r>
+        <w:rPr>
+          <w:sz w:val="28"/>
+          <w:szCs w:val="28"/>
+        </w:rPr>
+        <w:t xml:space="preserve">studentId </w:t>
+      </w:r>
+      <w:r>
+        <w:rPr>
+          <w:i/>
+          <w:iCs/>
+          <w:sz w:val="28"/>
+          <w:szCs w:val="28"/>
+        </w:rPr>
+        <w:t>“url parameter”</w:t>
+      </w:r>
+      <w:r>
+        <w:rPr>
+          <w:i/>
+          <w:iCs/>
           <w:sz w:val="28"/>
           <w:szCs w:val="28"/>
         </w:rPr>
@@ -1469,44 +2527,6 @@
       </w:r>
       <w:r>
         <w:rPr>
-          <w:i/>
-          <w:iCs/>
-          <w:sz w:val="28"/>
-          <w:szCs w:val="28"/>
-        </w:rPr>
-        <w:t>“</w:t>
-      </w:r>
-      <w:proofErr w:type="spellStart"/>
-      <w:r>
-        <w:rPr>
-          <w:i/>
-          <w:iCs/>
-          <w:sz w:val="28"/>
-          <w:szCs w:val="28"/>
-        </w:rPr>
-        <w:t>url</w:t>
-      </w:r>
-      <w:proofErr w:type="spellEnd"/>
-      <w:r>
-        <w:rPr>
-          <w:i/>
-          <w:iCs/>
-          <w:sz w:val="28"/>
-          <w:szCs w:val="28"/>
-        </w:rPr>
-        <w:t xml:space="preserve"> parameter”</w:t>
-      </w:r>
-      <w:r>
-        <w:rPr>
-          <w:i/>
-          <w:iCs/>
-          <w:sz w:val="28"/>
-          <w:szCs w:val="28"/>
-        </w:rPr>
-        <w:t xml:space="preserve"> </w:t>
-      </w:r>
-      <w:r>
-        <w:rPr>
           <w:b/>
           <w:bCs/>
           <w:i/>
@@ -1525,16 +2545,18 @@
           <w:bCs/>
           <w:i/>
           <w:iCs/>
-          <w:sz w:val="28"/>
-          <w:szCs w:val="28"/>
-        </w:rPr>
-      </w:pPr>
-      <w:r>
-        <w:rPr>
-          <w:b/>
-          <w:bCs/>
-          <w:i/>
-          <w:iCs/>
+          <w:caps/>
+          <w:sz w:val="28"/>
+          <w:szCs w:val="28"/>
+        </w:rPr>
+      </w:pPr>
+      <w:r>
+        <w:rPr>
+          <w:b/>
+          <w:bCs/>
+          <w:i/>
+          <w:iCs/>
+          <w:caps/>
           <w:sz w:val="28"/>
           <w:szCs w:val="28"/>
         </w:rPr>
@@ -1575,16 +2597,18 @@
           <w:bCs/>
           <w:i/>
           <w:iCs/>
-          <w:sz w:val="28"/>
-          <w:szCs w:val="28"/>
-        </w:rPr>
-      </w:pPr>
-      <w:r>
-        <w:rPr>
-          <w:b/>
-          <w:bCs/>
-          <w:i/>
-          <w:iCs/>
+          <w:caps/>
+          <w:sz w:val="28"/>
+          <w:szCs w:val="28"/>
+        </w:rPr>
+      </w:pPr>
+      <w:r>
+        <w:rPr>
+          <w:b/>
+          <w:bCs/>
+          <w:i/>
+          <w:iCs/>
+          <w:caps/>
           <w:sz w:val="28"/>
           <w:szCs w:val="28"/>
         </w:rPr>
@@ -1604,7 +2628,6 @@
           <w:sz w:val="28"/>
           <w:szCs w:val="28"/>
         </w:rPr>
-        <w:lastRenderedPageBreak/>
         <w:drawing>
           <wp:inline distT="0" distB="0" distL="0" distR="0" wp14:anchorId="126648A0" wp14:editId="40500DD2">
             <wp:extent cx="5731510" cy="3876040"/>
@@ -1621,7 +2644,7 @@
                     <pic:cNvPicPr/>
                   </pic:nvPicPr>
                   <pic:blipFill>
-                    <a:blip r:embed="rId8"/>
+                    <a:blip r:embed="rId9"/>
                     <a:stretch>
                       <a:fillRect/>
                     </a:stretch>
@@ -2168,7 +3191,7 @@
   <w:style w:type="paragraph" w:default="1" w:styleId="Normal">
     <w:name w:val="Normal"/>
     <w:qFormat/>
-    <w:rsid w:val="00544CC0"/>
+    <w:rsid w:val="00874DB8"/>
   </w:style>
   <w:style w:type="paragraph" w:styleId="Heading1">
     <w:name w:val="heading 1"/>

</xml_diff>

<commit_message>
Added mongoDB for logging APIs
</commit_message>
<xml_diff>
--- a/documentation files/HIKVISION backend documentation.docx
+++ b/documentation files/HIKVISION backend documentation.docx
@@ -8,16 +8,16 @@
         <w:rPr>
           <w:b/>
           <w:bCs/>
-          <w:sz w:val="28"/>
-          <w:szCs w:val="28"/>
-        </w:rPr>
-      </w:pPr>
-      <w:r>
-        <w:rPr>
-          <w:b/>
-          <w:bCs/>
-          <w:sz w:val="28"/>
-          <w:szCs w:val="28"/>
+          <w:sz w:val="40"/>
+          <w:szCs w:val="40"/>
+        </w:rPr>
+      </w:pPr>
+      <w:r>
+        <w:rPr>
+          <w:b/>
+          <w:bCs/>
+          <w:sz w:val="40"/>
+          <w:szCs w:val="40"/>
         </w:rPr>
         <w:t>HIKVISION backend documentation</w:t>
       </w:r>
@@ -98,8 +98,262 @@
           <w:sz w:val="28"/>
           <w:szCs w:val="28"/>
         </w:rPr>
-        <w:br/>
-      </w:r>
+        <w:t xml:space="preserve"> </w:t>
+      </w:r>
+      <w:r>
+        <w:rPr>
+          <w:b/>
+          <w:bCs/>
+          <w:color w:val="EE0000"/>
+          <w:sz w:val="28"/>
+          <w:szCs w:val="28"/>
+        </w:rPr>
+        <w:t>(testing)</w:t>
+      </w:r>
+    </w:p>
+    <w:p>
+      <w:pPr>
+        <w:jc w:val="center"/>
+        <w:rPr>
+          <w:b/>
+          <w:bCs/>
+          <w:sz w:val="28"/>
+          <w:szCs w:val="28"/>
+        </w:rPr>
+      </w:pPr>
+      <w:r>
+        <w:rPr>
+          <w:b/>
+          <w:bCs/>
+          <w:color w:val="EE0000"/>
+          <w:sz w:val="28"/>
+          <w:szCs w:val="28"/>
+        </w:rPr>
+        <w:t>(Must use basic auth with each API request other than health check)</w:t>
+      </w:r>
+    </w:p>
+    <w:p>
+      <w:pPr>
+        <w:jc w:val="center"/>
+        <w:rPr>
+          <w:b/>
+          <w:bCs/>
+          <w:sz w:val="28"/>
+          <w:szCs w:val="28"/>
+        </w:rPr>
+      </w:pPr>
+      <w:r>
+        <w:rPr>
+          <w:b/>
+          <w:bCs/>
+          <w:sz w:val="28"/>
+          <w:szCs w:val="28"/>
+        </w:rPr>
+        <w:t>(</w:t>
+      </w:r>
+      <w:r>
+        <w:rPr>
+          <w:rStyle w:val="inlinevariable"/>
+          <w:rFonts w:ascii="Segoe UI" w:hAnsi="Segoe UI" w:cs="Segoe UI"/>
+          <w:color w:val="2552AA"/>
+          <w:sz w:val="26"/>
+          <w:szCs w:val="26"/>
+          <w:bdr w:val="single" w:sz="4" w:space="0" w:color="EDEDED" w:frame="1"/>
+        </w:rPr>
+        <w:t>{{u</w:t>
+      </w:r>
+      <w:r>
+        <w:rPr>
+          <w:rStyle w:val="inlinevariable"/>
+          <w:rFonts w:ascii="Segoe UI" w:hAnsi="Segoe UI" w:cs="Segoe UI"/>
+          <w:color w:val="2552AA"/>
+          <w:sz w:val="26"/>
+          <w:szCs w:val="26"/>
+          <w:bdr w:val="single" w:sz="4" w:space="0" w:color="EDEDED" w:frame="1"/>
+        </w:rPr>
+        <w:t>sername</w:t>
+      </w:r>
+      <w:r>
+        <w:rPr>
+          <w:rStyle w:val="inlinevariable"/>
+          <w:rFonts w:ascii="Segoe UI" w:hAnsi="Segoe UI" w:cs="Segoe UI"/>
+          <w:color w:val="2552AA"/>
+          <w:sz w:val="26"/>
+          <w:szCs w:val="26"/>
+          <w:bdr w:val="single" w:sz="4" w:space="0" w:color="EDEDED" w:frame="1"/>
+        </w:rPr>
+        <w:t>}}</w:t>
+      </w:r>
+      <w:r>
+        <w:rPr>
+          <w:rFonts w:ascii="Segoe UI" w:hAnsi="Segoe UI" w:cs="Segoe UI"/>
+          <w:color w:val="212121"/>
+          <w:sz w:val="26"/>
+          <w:szCs w:val="26"/>
+          <w:shd w:val="clear" w:color="auto" w:fill="FFFFFF"/>
+        </w:rPr>
+        <w:t xml:space="preserve">: </w:t>
+      </w:r>
+      <w:r>
+        <w:rPr>
+          <w:rFonts w:ascii="Segoe UI" w:hAnsi="Segoe UI" w:cs="Segoe UI"/>
+          <w:color w:val="212121"/>
+          <w:sz w:val="26"/>
+          <w:szCs w:val="26"/>
+          <w:shd w:val="clear" w:color="auto" w:fill="FFFFFF"/>
+        </w:rPr>
+        <w:t>softshack</w:t>
+      </w:r>
+      <w:r>
+        <w:rPr>
+          <w:b/>
+          <w:bCs/>
+          <w:sz w:val="28"/>
+          <w:szCs w:val="28"/>
+        </w:rPr>
+        <w:t>)</w:t>
+      </w:r>
+      <w:r>
+        <w:rPr>
+          <w:b/>
+          <w:bCs/>
+          <w:sz w:val="28"/>
+          <w:szCs w:val="28"/>
+        </w:rPr>
+        <w:t xml:space="preserve"> </w:t>
+      </w:r>
+      <w:r>
+        <w:rPr>
+          <w:b/>
+          <w:bCs/>
+          <w:color w:val="EE0000"/>
+          <w:sz w:val="28"/>
+          <w:szCs w:val="28"/>
+        </w:rPr>
+        <w:t>(testing)</w:t>
+      </w:r>
+    </w:p>
+    <w:p>
+      <w:pPr>
+        <w:jc w:val="center"/>
+        <w:rPr>
+          <w:b/>
+          <w:bCs/>
+          <w:sz w:val="28"/>
+          <w:szCs w:val="28"/>
+        </w:rPr>
+      </w:pPr>
+      <w:r>
+        <w:rPr>
+          <w:b/>
+          <w:bCs/>
+          <w:sz w:val="28"/>
+          <w:szCs w:val="28"/>
+        </w:rPr>
+        <w:t>(</w:t>
+      </w:r>
+      <w:r>
+        <w:rPr>
+          <w:rStyle w:val="inlinevariable"/>
+          <w:rFonts w:ascii="Segoe UI" w:hAnsi="Segoe UI" w:cs="Segoe UI"/>
+          <w:color w:val="2552AA"/>
+          <w:sz w:val="26"/>
+          <w:szCs w:val="26"/>
+          <w:bdr w:val="single" w:sz="4" w:space="0" w:color="EDEDED" w:frame="1"/>
+        </w:rPr>
+        <w:t>{{</w:t>
+      </w:r>
+      <w:r>
+        <w:rPr>
+          <w:rStyle w:val="inlinevariable"/>
+          <w:rFonts w:ascii="Segoe UI" w:hAnsi="Segoe UI" w:cs="Segoe UI"/>
+          <w:color w:val="2552AA"/>
+          <w:sz w:val="26"/>
+          <w:szCs w:val="26"/>
+          <w:bdr w:val="single" w:sz="4" w:space="0" w:color="EDEDED" w:frame="1"/>
+        </w:rPr>
+        <w:t>password</w:t>
+      </w:r>
+      <w:r>
+        <w:rPr>
+          <w:rStyle w:val="inlinevariable"/>
+          <w:rFonts w:ascii="Segoe UI" w:hAnsi="Segoe UI" w:cs="Segoe UI"/>
+          <w:color w:val="2552AA"/>
+          <w:sz w:val="26"/>
+          <w:szCs w:val="26"/>
+          <w:bdr w:val="single" w:sz="4" w:space="0" w:color="EDEDED" w:frame="1"/>
+        </w:rPr>
+        <w:t>}}</w:t>
+      </w:r>
+      <w:r>
+        <w:rPr>
+          <w:rFonts w:ascii="Segoe UI" w:hAnsi="Segoe UI" w:cs="Segoe UI"/>
+          <w:color w:val="212121"/>
+          <w:sz w:val="26"/>
+          <w:szCs w:val="26"/>
+          <w:shd w:val="clear" w:color="auto" w:fill="FFFFFF"/>
+        </w:rPr>
+        <w:t xml:space="preserve">: </w:t>
+      </w:r>
+      <w:r>
+        <w:rPr>
+          <w:rFonts w:ascii="Segoe UI" w:hAnsi="Segoe UI" w:cs="Segoe UI"/>
+          <w:color w:val="212121"/>
+          <w:sz w:val="26"/>
+          <w:szCs w:val="26"/>
+          <w:shd w:val="clear" w:color="auto" w:fill="FFFFFF"/>
+        </w:rPr>
+        <w:t>GIFT@123</w:t>
+      </w:r>
+      <w:r>
+        <w:rPr>
+          <w:b/>
+          <w:bCs/>
+          <w:sz w:val="28"/>
+          <w:szCs w:val="28"/>
+        </w:rPr>
+        <w:t>)</w:t>
+      </w:r>
+      <w:r>
+        <w:rPr>
+          <w:b/>
+          <w:bCs/>
+          <w:sz w:val="28"/>
+          <w:szCs w:val="28"/>
+        </w:rPr>
+        <w:t xml:space="preserve"> </w:t>
+      </w:r>
+      <w:r>
+        <w:rPr>
+          <w:b/>
+          <w:bCs/>
+          <w:color w:val="EE0000"/>
+          <w:sz w:val="28"/>
+          <w:szCs w:val="28"/>
+        </w:rPr>
+        <w:t>(testing)</w:t>
+      </w:r>
+      <w:r>
+        <w:rPr>
+          <w:b/>
+          <w:bCs/>
+          <w:color w:val="EE0000"/>
+          <w:sz w:val="28"/>
+          <w:szCs w:val="28"/>
+        </w:rPr>
+        <w:t xml:space="preserve"> </w:t>
+      </w:r>
+    </w:p>
+    <w:p>
+      <w:pPr>
+        <w:jc w:val="center"/>
+        <w:rPr>
+          <w:b/>
+          <w:bCs/>
+          <w:sz w:val="28"/>
+          <w:szCs w:val="28"/>
+        </w:rPr>
+      </w:pPr>
     </w:p>
     <w:p>
       <w:pPr>
@@ -122,7 +376,7 @@
           <w:sz w:val="28"/>
           <w:szCs w:val="28"/>
         </w:rPr>
-        <w:t>Register user</w:t>
+        <w:t>Health Check</w:t>
       </w:r>
     </w:p>
     <w:p>
@@ -148,19 +402,7 @@
           <w:sz w:val="28"/>
           <w:szCs w:val="28"/>
         </w:rPr>
-        <w:t>url:</w:t>
-      </w:r>
-      <w:r>
-        <w:rPr>
-          <w:b/>
-          <w:bCs/>
-          <w:i/>
-          <w:iCs/>
-          <w:caps/>
-          <w:sz w:val="28"/>
-          <w:szCs w:val="28"/>
-        </w:rPr>
-        <w:t xml:space="preserve"> (Method + URL)</w:t>
+        <w:t>url: (Method + URL)</w:t>
       </w:r>
     </w:p>
     <w:p>
@@ -177,7 +419,15 @@
           <w:sz w:val="26"/>
           <w:szCs w:val="26"/>
         </w:rPr>
-        <w:t>POST</w:t>
+        <w:t>GE</w:t>
+      </w:r>
+      <w:r>
+        <w:rPr>
+          <w:color w:val="4EA72E" w:themeColor="accent6"/>
+          <w:sz w:val="26"/>
+          <w:szCs w:val="26"/>
+        </w:rPr>
+        <w:t>T</w:t>
       </w:r>
       <w:r>
         <w:rPr>
@@ -205,7 +455,17 @@
           <w:szCs w:val="26"/>
           <w:shd w:val="clear" w:color="auto" w:fill="FFFFFF"/>
         </w:rPr>
-        <w:t>/students/register</w:t>
+        <w:t>/</w:t>
+      </w:r>
+      <w:r>
+        <w:rPr>
+          <w:rFonts w:ascii="Segoe UI" w:hAnsi="Segoe UI" w:cs="Segoe UI"/>
+          <w:color w:val="212121"/>
+          <w:sz w:val="26"/>
+          <w:szCs w:val="26"/>
+          <w:shd w:val="clear" w:color="auto" w:fill="FFFFFF"/>
+        </w:rPr>
+        <w:t>health-check</w:t>
       </w:r>
     </w:p>
     <w:p>
@@ -232,278 +492,6 @@
           <w:szCs w:val="28"/>
         </w:rPr>
         <w:t>params:</w:t>
-      </w:r>
-    </w:p>
-    <w:p>
-      <w:pPr>
-        <w:ind w:left="720"/>
-        <w:rPr>
-          <w:b/>
-          <w:bCs/>
-          <w:i/>
-          <w:iCs/>
-          <w:sz w:val="28"/>
-          <w:szCs w:val="28"/>
-        </w:rPr>
-      </w:pPr>
-      <w:r>
-        <w:rPr>
-          <w:b/>
-          <w:bCs/>
-          <w:sz w:val="28"/>
-          <w:szCs w:val="28"/>
-        </w:rPr>
-        <w:t>name</w:t>
-      </w:r>
-      <w:r>
-        <w:rPr>
-          <w:sz w:val="28"/>
-          <w:szCs w:val="28"/>
-        </w:rPr>
-        <w:t xml:space="preserve"> (text)</w:t>
-      </w:r>
-      <w:r>
-        <w:rPr>
-          <w:sz w:val="28"/>
-          <w:szCs w:val="28"/>
-        </w:rPr>
-        <w:t xml:space="preserve"> </w:t>
-      </w:r>
-      <w:r>
-        <w:rPr>
-          <w:b/>
-          <w:bCs/>
-          <w:i/>
-          <w:iCs/>
-          <w:sz w:val="28"/>
-          <w:szCs w:val="28"/>
-        </w:rPr>
-        <w:t>required</w:t>
-      </w:r>
-    </w:p>
-    <w:p>
-      <w:pPr>
-        <w:ind w:left="720"/>
-        <w:rPr>
-          <w:sz w:val="28"/>
-          <w:szCs w:val="28"/>
-        </w:rPr>
-      </w:pPr>
-      <w:r>
-        <w:rPr>
-          <w:b/>
-          <w:bCs/>
-          <w:sz w:val="28"/>
-          <w:szCs w:val="28"/>
-        </w:rPr>
-        <w:t>employeeNo</w:t>
-      </w:r>
-      <w:r>
-        <w:rPr>
-          <w:sz w:val="28"/>
-          <w:szCs w:val="28"/>
-        </w:rPr>
-        <w:t xml:space="preserve"> (text)</w:t>
-      </w:r>
-      <w:r>
-        <w:rPr>
-          <w:sz w:val="28"/>
-          <w:szCs w:val="28"/>
-        </w:rPr>
-        <w:t xml:space="preserve"> </w:t>
-      </w:r>
-      <w:r>
-        <w:rPr>
-          <w:b/>
-          <w:bCs/>
-          <w:i/>
-          <w:iCs/>
-          <w:sz w:val="28"/>
-          <w:szCs w:val="28"/>
-        </w:rPr>
-        <w:t>required</w:t>
-      </w:r>
-      <w:r>
-        <w:rPr>
-          <w:b/>
-          <w:bCs/>
-          <w:i/>
-          <w:iCs/>
-          <w:sz w:val="28"/>
-          <w:szCs w:val="28"/>
-        </w:rPr>
-        <w:t xml:space="preserve"> | must be unique</w:t>
-      </w:r>
-    </w:p>
-    <w:p>
-      <w:pPr>
-        <w:ind w:left="720"/>
-        <w:rPr>
-          <w:b/>
-          <w:bCs/>
-          <w:i/>
-          <w:iCs/>
-          <w:sz w:val="28"/>
-          <w:szCs w:val="28"/>
-        </w:rPr>
-      </w:pPr>
-      <w:r>
-        <w:rPr>
-          <w:b/>
-          <w:bCs/>
-          <w:sz w:val="28"/>
-          <w:szCs w:val="28"/>
-        </w:rPr>
-        <w:t>faceImage</w:t>
-      </w:r>
-      <w:r>
-        <w:rPr>
-          <w:sz w:val="28"/>
-          <w:szCs w:val="28"/>
-        </w:rPr>
-        <w:t xml:space="preserve"> (file) </w:t>
-      </w:r>
-      <w:r>
-        <w:rPr>
-          <w:b/>
-          <w:bCs/>
-          <w:sz w:val="28"/>
-          <w:szCs w:val="28"/>
-        </w:rPr>
-        <w:t xml:space="preserve">constraints: </w:t>
-      </w:r>
-      <w:r>
-        <w:rPr>
-          <w:sz w:val="28"/>
-          <w:szCs w:val="28"/>
-        </w:rPr>
-        <w:t xml:space="preserve">(filesize =&gt; </w:t>
-      </w:r>
-      <w:r>
-        <w:rPr>
-          <w:sz w:val="28"/>
-          <w:szCs w:val="28"/>
-        </w:rPr>
-        <w:t>less</w:t>
-      </w:r>
-      <w:r>
-        <w:rPr>
-          <w:sz w:val="28"/>
-          <w:szCs w:val="28"/>
-        </w:rPr>
-        <w:t xml:space="preserve"> than </w:t>
-      </w:r>
-      <w:r>
-        <w:rPr>
-          <w:sz w:val="28"/>
-          <w:szCs w:val="28"/>
-        </w:rPr>
-        <w:t>5M</w:t>
-      </w:r>
-      <w:r>
-        <w:rPr>
-          <w:sz w:val="28"/>
-          <w:szCs w:val="28"/>
-        </w:rPr>
-        <w:t>B, file type =&gt; JPEG</w:t>
-      </w:r>
-      <w:r>
-        <w:rPr>
-          <w:sz w:val="28"/>
-          <w:szCs w:val="28"/>
-        </w:rPr>
-        <w:t>,</w:t>
-      </w:r>
-      <w:r>
-        <w:rPr>
-          <w:sz w:val="28"/>
-          <w:szCs w:val="28"/>
-        </w:rPr>
-        <w:t xml:space="preserve"> JPG</w:t>
-      </w:r>
-      <w:r>
-        <w:rPr>
-          <w:sz w:val="28"/>
-          <w:szCs w:val="28"/>
-        </w:rPr>
-        <w:t xml:space="preserve"> or PNG</w:t>
-      </w:r>
-      <w:r>
-        <w:rPr>
-          <w:sz w:val="28"/>
-          <w:szCs w:val="28"/>
-        </w:rPr>
-        <w:t>)</w:t>
-      </w:r>
-      <w:r>
-        <w:rPr>
-          <w:sz w:val="28"/>
-          <w:szCs w:val="28"/>
-        </w:rPr>
-        <w:t xml:space="preserve"> </w:t>
-      </w:r>
-      <w:r>
-        <w:rPr>
-          <w:b/>
-          <w:bCs/>
-          <w:i/>
-          <w:iCs/>
-          <w:sz w:val="28"/>
-          <w:szCs w:val="28"/>
-        </w:rPr>
-        <w:t xml:space="preserve">required </w:t>
-      </w:r>
-    </w:p>
-    <w:p>
-      <w:pPr>
-        <w:ind w:left="720"/>
-        <w:rPr>
-          <w:sz w:val="28"/>
-          <w:szCs w:val="28"/>
-        </w:rPr>
-      </w:pPr>
-      <w:r>
-        <w:rPr>
-          <w:b/>
-          <w:bCs/>
-          <w:sz w:val="28"/>
-          <w:szCs w:val="28"/>
-        </w:rPr>
-        <w:t>userType</w:t>
-      </w:r>
-      <w:r>
-        <w:rPr>
-          <w:sz w:val="28"/>
-          <w:szCs w:val="28"/>
-        </w:rPr>
-        <w:t xml:space="preserve"> (text) </w:t>
-      </w:r>
-      <w:r>
-        <w:rPr>
-          <w:b/>
-          <w:bCs/>
-          <w:sz w:val="28"/>
-          <w:szCs w:val="28"/>
-        </w:rPr>
-        <w:t xml:space="preserve">constraints: </w:t>
-      </w:r>
-      <w:r>
-        <w:rPr>
-          <w:sz w:val="28"/>
-          <w:szCs w:val="28"/>
-        </w:rPr>
-        <w:t xml:space="preserve">(can be only “normal, visitor or blackList” *case sensitive*) </w:t>
-      </w:r>
-      <w:r>
-        <w:rPr>
-          <w:b/>
-          <w:bCs/>
-          <w:i/>
-          <w:iCs/>
-          <w:sz w:val="28"/>
-          <w:szCs w:val="28"/>
-        </w:rPr>
-        <w:t>optional (default: normal)</w:t>
       </w:r>
     </w:p>
     <w:p>
@@ -528,7 +516,507 @@
           <w:sz w:val="28"/>
           <w:szCs w:val="28"/>
         </w:rPr>
-        <w:t>beginTime</w:t>
+        <w:t>None</w:t>
+      </w:r>
+    </w:p>
+    <w:p>
+      <w:pPr>
+        <w:ind w:left="720"/>
+        <w:rPr>
+          <w:b/>
+          <w:bCs/>
+          <w:i/>
+          <w:iCs/>
+          <w:caps/>
+          <w:sz w:val="28"/>
+          <w:szCs w:val="28"/>
+        </w:rPr>
+      </w:pPr>
+      <w:r>
+        <w:rPr>
+          <w:b/>
+          <w:bCs/>
+          <w:i/>
+          <w:iCs/>
+          <w:caps/>
+          <w:sz w:val="28"/>
+          <w:szCs w:val="28"/>
+        </w:rPr>
+        <w:t>format:</w:t>
+      </w:r>
+    </w:p>
+    <w:p>
+      <w:pPr>
+        <w:ind w:left="720"/>
+        <w:rPr>
+          <w:sz w:val="28"/>
+          <w:szCs w:val="28"/>
+        </w:rPr>
+      </w:pPr>
+      <w:r>
+        <w:rPr>
+          <w:sz w:val="28"/>
+          <w:szCs w:val="28"/>
+        </w:rPr>
+        <w:t>JSON</w:t>
+      </w:r>
+    </w:p>
+    <w:p>
+      <w:pPr>
+        <w:ind w:left="720"/>
+        <w:rPr>
+          <w:b/>
+          <w:bCs/>
+          <w:i/>
+          <w:iCs/>
+          <w:caps/>
+          <w:sz w:val="28"/>
+          <w:szCs w:val="28"/>
+        </w:rPr>
+      </w:pPr>
+      <w:r>
+        <w:rPr>
+          <w:b/>
+          <w:bCs/>
+          <w:i/>
+          <w:iCs/>
+          <w:caps/>
+          <w:sz w:val="28"/>
+          <w:szCs w:val="28"/>
+        </w:rPr>
+        <w:t>example:</w:t>
+      </w:r>
+    </w:p>
+    <w:p>
+      <w:pPr>
+        <w:ind w:left="720"/>
+        <w:rPr>
+          <w:b/>
+          <w:bCs/>
+          <w:i/>
+          <w:iCs/>
+          <w:caps/>
+          <w:sz w:val="28"/>
+          <w:szCs w:val="28"/>
+        </w:rPr>
+      </w:pPr>
+      <w:r>
+        <w:rPr>
+          <w:b/>
+          <w:bCs/>
+          <w:i/>
+          <w:iCs/>
+          <w:caps/>
+          <w:sz w:val="28"/>
+          <w:szCs w:val="28"/>
+        </w:rPr>
+        <w:drawing>
+          <wp:inline distT="0" distB="0" distL="0" distR="0" wp14:anchorId="11F611C1" wp14:editId="269AC635">
+            <wp:extent cx="5731510" cy="2453640"/>
+            <wp:effectExtent l="0" t="0" r="2540" b="3810"/>
+            <wp:docPr id="1251222852" name="Picture 1"/>
+            <wp:cNvGraphicFramePr>
+              <a:graphicFrameLocks xmlns:a="http://schemas.openxmlformats.org/drawingml/2006/main" noChangeAspect="1"/>
+            </wp:cNvGraphicFramePr>
+            <a:graphic xmlns:a="http://schemas.openxmlformats.org/drawingml/2006/main">
+              <a:graphicData uri="http://schemas.openxmlformats.org/drawingml/2006/picture">
+                <pic:pic xmlns:pic="http://schemas.openxmlformats.org/drawingml/2006/picture">
+                  <pic:nvPicPr>
+                    <pic:cNvPr id="1251222852" name=""/>
+                    <pic:cNvPicPr/>
+                  </pic:nvPicPr>
+                  <pic:blipFill>
+                    <a:blip r:embed="rId5"/>
+                    <a:stretch>
+                      <a:fillRect/>
+                    </a:stretch>
+                  </pic:blipFill>
+                  <pic:spPr>
+                    <a:xfrm>
+                      <a:off x="0" y="0"/>
+                      <a:ext cx="5731510" cy="2453640"/>
+                    </a:xfrm>
+                    <a:prstGeom prst="rect">
+                      <a:avLst/>
+                    </a:prstGeom>
+                  </pic:spPr>
+                </pic:pic>
+              </a:graphicData>
+            </a:graphic>
+          </wp:inline>
+        </w:drawing>
+      </w:r>
+    </w:p>
+    <w:p>
+      <w:pPr>
+        <w:pStyle w:val="ListParagraph"/>
+        <w:numPr>
+          <w:ilvl w:val="0"/>
+          <w:numId w:val="1"/>
+        </w:numPr>
+        <w:rPr>
+          <w:b/>
+          <w:bCs/>
+          <w:sz w:val="28"/>
+          <w:szCs w:val="28"/>
+        </w:rPr>
+      </w:pPr>
+      <w:r>
+        <w:rPr>
+          <w:b/>
+          <w:bCs/>
+          <w:sz w:val="28"/>
+          <w:szCs w:val="28"/>
+        </w:rPr>
+        <w:t>Register user</w:t>
+      </w:r>
+    </w:p>
+    <w:p>
+      <w:pPr>
+        <w:ind w:left="720"/>
+        <w:rPr>
+          <w:b/>
+          <w:bCs/>
+          <w:i/>
+          <w:iCs/>
+          <w:caps/>
+          <w:sz w:val="28"/>
+          <w:szCs w:val="28"/>
+        </w:rPr>
+      </w:pPr>
+      <w:r>
+        <w:rPr>
+          <w:b/>
+          <w:bCs/>
+          <w:i/>
+          <w:iCs/>
+          <w:caps/>
+          <w:sz w:val="28"/>
+          <w:szCs w:val="28"/>
+        </w:rPr>
+        <w:t>url:</w:t>
+      </w:r>
+      <w:r>
+        <w:rPr>
+          <w:b/>
+          <w:bCs/>
+          <w:i/>
+          <w:iCs/>
+          <w:caps/>
+          <w:sz w:val="28"/>
+          <w:szCs w:val="28"/>
+        </w:rPr>
+        <w:t xml:space="preserve"> (Method + URL)</w:t>
+      </w:r>
+    </w:p>
+    <w:p>
+      <w:pPr>
+        <w:ind w:left="720"/>
+        <w:rPr>
+          <w:sz w:val="26"/>
+          <w:szCs w:val="26"/>
+        </w:rPr>
+      </w:pPr>
+      <w:r>
+        <w:rPr>
+          <w:color w:val="4EA72E" w:themeColor="accent6"/>
+          <w:sz w:val="26"/>
+          <w:szCs w:val="26"/>
+        </w:rPr>
+        <w:t>POST</w:t>
+      </w:r>
+      <w:r>
+        <w:rPr>
+          <w:sz w:val="26"/>
+          <w:szCs w:val="26"/>
+        </w:rPr>
+        <w:t xml:space="preserve"> </w:t>
+      </w:r>
+      <w:r>
+        <w:rPr>
+          <w:rStyle w:val="inlinevariable"/>
+          <w:rFonts w:ascii="Segoe UI" w:hAnsi="Segoe UI" w:cs="Segoe UI"/>
+          <w:color w:val="2552AA"/>
+          <w:sz w:val="26"/>
+          <w:szCs w:val="26"/>
+          <w:bdr w:val="single" w:sz="4" w:space="0" w:color="EDEDED" w:frame="1"/>
+        </w:rPr>
+        <w:t>{{backend url}}</w:t>
+      </w:r>
+      <w:r>
+        <w:rPr>
+          <w:rFonts w:ascii="Segoe UI" w:hAnsi="Segoe UI" w:cs="Segoe UI"/>
+          <w:color w:val="212121"/>
+          <w:sz w:val="26"/>
+          <w:szCs w:val="26"/>
+          <w:shd w:val="clear" w:color="auto" w:fill="FFFFFF"/>
+        </w:rPr>
+        <w:t>/students/register</w:t>
+      </w:r>
+    </w:p>
+    <w:p>
+      <w:pPr>
+        <w:ind w:left="720"/>
+        <w:rPr>
+          <w:b/>
+          <w:bCs/>
+          <w:i/>
+          <w:iCs/>
+          <w:caps/>
+          <w:sz w:val="28"/>
+          <w:szCs w:val="28"/>
+        </w:rPr>
+      </w:pPr>
+      <w:r>
+        <w:rPr>
+          <w:b/>
+          <w:bCs/>
+          <w:i/>
+          <w:iCs/>
+          <w:caps/>
+          <w:sz w:val="28"/>
+          <w:szCs w:val="28"/>
+        </w:rPr>
+        <w:lastRenderedPageBreak/>
+        <w:t>params:</w:t>
+      </w:r>
+    </w:p>
+    <w:p>
+      <w:pPr>
+        <w:ind w:left="720"/>
+        <w:rPr>
+          <w:b/>
+          <w:bCs/>
+          <w:i/>
+          <w:iCs/>
+          <w:sz w:val="28"/>
+          <w:szCs w:val="28"/>
+        </w:rPr>
+      </w:pPr>
+      <w:r>
+        <w:rPr>
+          <w:b/>
+          <w:bCs/>
+          <w:sz w:val="28"/>
+          <w:szCs w:val="28"/>
+        </w:rPr>
+        <w:t>name</w:t>
+      </w:r>
+      <w:r>
+        <w:rPr>
+          <w:sz w:val="28"/>
+          <w:szCs w:val="28"/>
+        </w:rPr>
+        <w:t xml:space="preserve"> (text)</w:t>
+      </w:r>
+      <w:r>
+        <w:rPr>
+          <w:sz w:val="28"/>
+          <w:szCs w:val="28"/>
+        </w:rPr>
+        <w:t xml:space="preserve"> </w:t>
+      </w:r>
+      <w:r>
+        <w:rPr>
+          <w:b/>
+          <w:bCs/>
+          <w:i/>
+          <w:iCs/>
+          <w:sz w:val="28"/>
+          <w:szCs w:val="28"/>
+        </w:rPr>
+        <w:t>required</w:t>
+      </w:r>
+    </w:p>
+    <w:p>
+      <w:pPr>
+        <w:ind w:left="720"/>
+        <w:rPr>
+          <w:sz w:val="28"/>
+          <w:szCs w:val="28"/>
+        </w:rPr>
+      </w:pPr>
+      <w:r>
+        <w:rPr>
+          <w:b/>
+          <w:bCs/>
+          <w:sz w:val="28"/>
+          <w:szCs w:val="28"/>
+        </w:rPr>
+        <w:t>employeeNo</w:t>
+      </w:r>
+      <w:r>
+        <w:rPr>
+          <w:sz w:val="28"/>
+          <w:szCs w:val="28"/>
+        </w:rPr>
+        <w:t xml:space="preserve"> (text)</w:t>
+      </w:r>
+      <w:r>
+        <w:rPr>
+          <w:sz w:val="28"/>
+          <w:szCs w:val="28"/>
+        </w:rPr>
+        <w:t xml:space="preserve"> </w:t>
+      </w:r>
+      <w:r>
+        <w:rPr>
+          <w:b/>
+          <w:bCs/>
+          <w:i/>
+          <w:iCs/>
+          <w:sz w:val="28"/>
+          <w:szCs w:val="28"/>
+        </w:rPr>
+        <w:t>required</w:t>
+      </w:r>
+      <w:r>
+        <w:rPr>
+          <w:b/>
+          <w:bCs/>
+          <w:i/>
+          <w:iCs/>
+          <w:sz w:val="28"/>
+          <w:szCs w:val="28"/>
+        </w:rPr>
+        <w:t xml:space="preserve"> | must be unique</w:t>
+      </w:r>
+    </w:p>
+    <w:p>
+      <w:pPr>
+        <w:ind w:left="720"/>
+        <w:rPr>
+          <w:b/>
+          <w:bCs/>
+          <w:i/>
+          <w:iCs/>
+          <w:sz w:val="28"/>
+          <w:szCs w:val="28"/>
+        </w:rPr>
+      </w:pPr>
+      <w:r>
+        <w:rPr>
+          <w:b/>
+          <w:bCs/>
+          <w:sz w:val="28"/>
+          <w:szCs w:val="28"/>
+        </w:rPr>
+        <w:t>faceImage</w:t>
+      </w:r>
+      <w:r>
+        <w:rPr>
+          <w:sz w:val="28"/>
+          <w:szCs w:val="28"/>
+        </w:rPr>
+        <w:t xml:space="preserve"> (file) </w:t>
+      </w:r>
+      <w:r>
+        <w:rPr>
+          <w:b/>
+          <w:bCs/>
+          <w:sz w:val="28"/>
+          <w:szCs w:val="28"/>
+        </w:rPr>
+        <w:t xml:space="preserve">constraints: </w:t>
+      </w:r>
+      <w:r>
+        <w:rPr>
+          <w:sz w:val="28"/>
+          <w:szCs w:val="28"/>
+        </w:rPr>
+        <w:t xml:space="preserve">(filesize =&gt; </w:t>
+      </w:r>
+      <w:r>
+        <w:rPr>
+          <w:sz w:val="28"/>
+          <w:szCs w:val="28"/>
+        </w:rPr>
+        <w:t>less</w:t>
+      </w:r>
+      <w:r>
+        <w:rPr>
+          <w:sz w:val="28"/>
+          <w:szCs w:val="28"/>
+        </w:rPr>
+        <w:t xml:space="preserve"> than </w:t>
+      </w:r>
+      <w:r>
+        <w:rPr>
+          <w:sz w:val="28"/>
+          <w:szCs w:val="28"/>
+        </w:rPr>
+        <w:t>5M</w:t>
+      </w:r>
+      <w:r>
+        <w:rPr>
+          <w:sz w:val="28"/>
+          <w:szCs w:val="28"/>
+        </w:rPr>
+        <w:t>B, file type =&gt; JPEG</w:t>
+      </w:r>
+      <w:r>
+        <w:rPr>
+          <w:sz w:val="28"/>
+          <w:szCs w:val="28"/>
+        </w:rPr>
+        <w:t>,</w:t>
+      </w:r>
+      <w:r>
+        <w:rPr>
+          <w:sz w:val="28"/>
+          <w:szCs w:val="28"/>
+        </w:rPr>
+        <w:t xml:space="preserve"> JPG</w:t>
+      </w:r>
+      <w:r>
+        <w:rPr>
+          <w:sz w:val="28"/>
+          <w:szCs w:val="28"/>
+        </w:rPr>
+        <w:t xml:space="preserve"> or PNG</w:t>
+      </w:r>
+      <w:r>
+        <w:rPr>
+          <w:sz w:val="28"/>
+          <w:szCs w:val="28"/>
+        </w:rPr>
+        <w:t>)</w:t>
+      </w:r>
+      <w:r>
+        <w:rPr>
+          <w:sz w:val="28"/>
+          <w:szCs w:val="28"/>
+        </w:rPr>
+        <w:t xml:space="preserve"> </w:t>
+      </w:r>
+      <w:r>
+        <w:rPr>
+          <w:b/>
+          <w:bCs/>
+          <w:i/>
+          <w:iCs/>
+          <w:sz w:val="28"/>
+          <w:szCs w:val="28"/>
+        </w:rPr>
+        <w:t xml:space="preserve">required </w:t>
+      </w:r>
+    </w:p>
+    <w:p>
+      <w:pPr>
+        <w:ind w:left="720"/>
+        <w:rPr>
+          <w:sz w:val="28"/>
+          <w:szCs w:val="28"/>
+        </w:rPr>
+      </w:pPr>
+      <w:r>
+        <w:rPr>
+          <w:b/>
+          <w:bCs/>
+          <w:sz w:val="28"/>
+          <w:szCs w:val="28"/>
+        </w:rPr>
+        <w:t>userType</w:t>
       </w:r>
       <w:r>
         <w:rPr>
@@ -551,85 +1039,18 @@
           <w:sz w:val="28"/>
           <w:szCs w:val="28"/>
         </w:rPr>
-        <w:t>(</w:t>
-      </w:r>
-      <w:r>
-        <w:rPr>
-          <w:rFonts w:ascii="Segoe UI" w:eastAsia="Times New Roman" w:hAnsi="Segoe UI" w:cs="Segoe UI"/>
-          <w:color w:val="0451A5"/>
-          <w:kern w:val="0"/>
-          <w:sz w:val="26"/>
-          <w:szCs w:val="26"/>
-          <w:lang w:eastAsia="en-PK"/>
-          <w14:ligatures w14:val="none"/>
-        </w:rPr>
-        <w:t>must be in format YYYY-MM-DDTHH:mm:ss (e.g. 2024-01-01T00:00:00</w:t>
-      </w:r>
-      <w:r>
-        <w:rPr>
-          <w:rFonts w:ascii="Segoe UI" w:hAnsi="Segoe UI" w:cs="Segoe UI"/>
-          <w:sz w:val="26"/>
-          <w:szCs w:val="26"/>
-        </w:rPr>
-        <w:t xml:space="preserve">) </w:t>
-      </w:r>
-      <w:r>
-        <w:rPr>
-          <w:b/>
-          <w:bCs/>
-          <w:i/>
-          <w:iCs/>
-          <w:sz w:val="28"/>
-          <w:szCs w:val="28"/>
-        </w:rPr>
-        <w:t>optional (default:</w:t>
-      </w:r>
-      <w:r>
-        <w:rPr>
-          <w:rFonts w:ascii="Segoe UI" w:eastAsia="Times New Roman" w:hAnsi="Segoe UI" w:cs="Segoe UI"/>
-          <w:color w:val="0451A5"/>
-          <w:kern w:val="0"/>
-          <w:sz w:val="26"/>
-          <w:szCs w:val="26"/>
-          <w:lang w:eastAsia="en-PK"/>
-          <w14:ligatures w14:val="none"/>
-        </w:rPr>
-        <w:t xml:space="preserve"> 202</w:t>
-      </w:r>
-      <w:r>
-        <w:rPr>
-          <w:rFonts w:ascii="Segoe UI" w:eastAsia="Times New Roman" w:hAnsi="Segoe UI" w:cs="Segoe UI"/>
-          <w:color w:val="0451A5"/>
-          <w:kern w:val="0"/>
-          <w:sz w:val="26"/>
-          <w:szCs w:val="26"/>
-          <w:lang w:eastAsia="en-PK"/>
-          <w14:ligatures w14:val="none"/>
-        </w:rPr>
-        <w:t>6</w:t>
-      </w:r>
-      <w:r>
-        <w:rPr>
-          <w:rFonts w:ascii="Segoe UI" w:eastAsia="Times New Roman" w:hAnsi="Segoe UI" w:cs="Segoe UI"/>
-          <w:color w:val="0451A5"/>
-          <w:kern w:val="0"/>
-          <w:sz w:val="26"/>
-          <w:szCs w:val="26"/>
-          <w:lang w:eastAsia="en-PK"/>
-          <w14:ligatures w14:val="none"/>
-        </w:rPr>
-        <w:t>-01-01T00:00:00</w:t>
-      </w:r>
-      <w:r>
-        <w:rPr>
-          <w:b/>
-          <w:bCs/>
-          <w:i/>
-          <w:iCs/>
-          <w:sz w:val="28"/>
-          <w:szCs w:val="28"/>
-        </w:rPr>
-        <w:t>)</w:t>
+        <w:t xml:space="preserve">(can be only “normal, visitor or blackList” *case sensitive*) </w:t>
+      </w:r>
+      <w:r>
+        <w:rPr>
+          <w:b/>
+          <w:bCs/>
+          <w:i/>
+          <w:iCs/>
+          <w:sz w:val="28"/>
+          <w:szCs w:val="28"/>
+        </w:rPr>
+        <w:t>optional (default: normal)</w:t>
       </w:r>
     </w:p>
     <w:p>
@@ -654,7 +1075,7 @@
           <w:sz w:val="28"/>
           <w:szCs w:val="28"/>
         </w:rPr>
-        <w:t>endTime</w:t>
+        <w:t>beginTime</w:t>
       </w:r>
       <w:r>
         <w:rPr>
@@ -720,7 +1141,7 @@
           <w:lang w:eastAsia="en-PK"/>
           <w14:ligatures w14:val="none"/>
         </w:rPr>
-        <w:t xml:space="preserve"> 20</w:t>
+        <w:t xml:space="preserve"> 202</w:t>
       </w:r>
       <w:r>
         <w:rPr>
@@ -732,7 +1153,7 @@
           <w:lang w:eastAsia="en-PK"/>
           <w14:ligatures w14:val="none"/>
         </w:rPr>
-        <w:t>30</w:t>
+        <w:t>6</w:t>
       </w:r>
       <w:r>
         <w:rPr>
@@ -744,115 +1165,7 @@
           <w:lang w:eastAsia="en-PK"/>
           <w14:ligatures w14:val="none"/>
         </w:rPr>
-        <w:t>-1</w:t>
-      </w:r>
-      <w:r>
-        <w:rPr>
-          <w:rFonts w:ascii="Segoe UI" w:eastAsia="Times New Roman" w:hAnsi="Segoe UI" w:cs="Segoe UI"/>
-          <w:color w:val="0451A5"/>
-          <w:kern w:val="0"/>
-          <w:sz w:val="26"/>
-          <w:szCs w:val="26"/>
-          <w:lang w:eastAsia="en-PK"/>
-          <w14:ligatures w14:val="none"/>
-        </w:rPr>
-        <w:t>2</w:t>
-      </w:r>
-      <w:r>
-        <w:rPr>
-          <w:rFonts w:ascii="Segoe UI" w:eastAsia="Times New Roman" w:hAnsi="Segoe UI" w:cs="Segoe UI"/>
-          <w:color w:val="0451A5"/>
-          <w:kern w:val="0"/>
-          <w:sz w:val="26"/>
-          <w:szCs w:val="26"/>
-          <w:lang w:eastAsia="en-PK"/>
-          <w14:ligatures w14:val="none"/>
-        </w:rPr>
-        <w:t>-</w:t>
-      </w:r>
-      <w:r>
-        <w:rPr>
-          <w:rFonts w:ascii="Segoe UI" w:eastAsia="Times New Roman" w:hAnsi="Segoe UI" w:cs="Segoe UI"/>
-          <w:color w:val="0451A5"/>
-          <w:kern w:val="0"/>
-          <w:sz w:val="26"/>
-          <w:szCs w:val="26"/>
-          <w:lang w:eastAsia="en-PK"/>
-          <w14:ligatures w14:val="none"/>
-        </w:rPr>
-        <w:t>3</w:t>
-      </w:r>
-      <w:r>
-        <w:rPr>
-          <w:rFonts w:ascii="Segoe UI" w:eastAsia="Times New Roman" w:hAnsi="Segoe UI" w:cs="Segoe UI"/>
-          <w:color w:val="0451A5"/>
-          <w:kern w:val="0"/>
-          <w:sz w:val="26"/>
-          <w:szCs w:val="26"/>
-          <w:lang w:eastAsia="en-PK"/>
-          <w14:ligatures w14:val="none"/>
-        </w:rPr>
-        <w:t>1T</w:t>
-      </w:r>
-      <w:r>
-        <w:rPr>
-          <w:rFonts w:ascii="Segoe UI" w:eastAsia="Times New Roman" w:hAnsi="Segoe UI" w:cs="Segoe UI"/>
-          <w:color w:val="0451A5"/>
-          <w:kern w:val="0"/>
-          <w:sz w:val="26"/>
-          <w:szCs w:val="26"/>
-          <w:lang w:eastAsia="en-PK"/>
-          <w14:ligatures w14:val="none"/>
-        </w:rPr>
-        <w:t>23</w:t>
-      </w:r>
-      <w:r>
-        <w:rPr>
-          <w:rFonts w:ascii="Segoe UI" w:eastAsia="Times New Roman" w:hAnsi="Segoe UI" w:cs="Segoe UI"/>
-          <w:color w:val="0451A5"/>
-          <w:kern w:val="0"/>
-          <w:sz w:val="26"/>
-          <w:szCs w:val="26"/>
-          <w:lang w:eastAsia="en-PK"/>
-          <w14:ligatures w14:val="none"/>
-        </w:rPr>
-        <w:t>:</w:t>
-      </w:r>
-      <w:r>
-        <w:rPr>
-          <w:rFonts w:ascii="Segoe UI" w:eastAsia="Times New Roman" w:hAnsi="Segoe UI" w:cs="Segoe UI"/>
-          <w:color w:val="0451A5"/>
-          <w:kern w:val="0"/>
-          <w:sz w:val="26"/>
-          <w:szCs w:val="26"/>
-          <w:lang w:eastAsia="en-PK"/>
-          <w14:ligatures w14:val="none"/>
-        </w:rPr>
-        <w:t>59</w:t>
-      </w:r>
-      <w:r>
-        <w:rPr>
-          <w:rFonts w:ascii="Segoe UI" w:eastAsia="Times New Roman" w:hAnsi="Segoe UI" w:cs="Segoe UI"/>
-          <w:color w:val="0451A5"/>
-          <w:kern w:val="0"/>
-          <w:sz w:val="26"/>
-          <w:szCs w:val="26"/>
-          <w:lang w:eastAsia="en-PK"/>
-          <w14:ligatures w14:val="none"/>
-        </w:rPr>
-        <w:t>:</w:t>
-      </w:r>
-      <w:r>
-        <w:rPr>
-          <w:rFonts w:ascii="Segoe UI" w:eastAsia="Times New Roman" w:hAnsi="Segoe UI" w:cs="Segoe UI"/>
-          <w:color w:val="0451A5"/>
-          <w:kern w:val="0"/>
-          <w:sz w:val="26"/>
-          <w:szCs w:val="26"/>
-          <w:lang w:eastAsia="en-PK"/>
-          <w14:ligatures w14:val="none"/>
-        </w:rPr>
-        <w:t>59</w:t>
+        <w:t>-01-01T00:00:00</w:t>
       </w:r>
       <w:r>
         <w:rPr>
@@ -881,6 +1194,240 @@
           <w14:ligatures w14:val="none"/>
         </w:rPr>
       </w:pPr>
+      <w:r>
+        <w:rPr>
+          <w:b/>
+          <w:bCs/>
+          <w:sz w:val="28"/>
+          <w:szCs w:val="28"/>
+        </w:rPr>
+        <w:t>endTime</w:t>
+      </w:r>
+      <w:r>
+        <w:rPr>
+          <w:sz w:val="28"/>
+          <w:szCs w:val="28"/>
+        </w:rPr>
+        <w:t xml:space="preserve"> (text) </w:t>
+      </w:r>
+      <w:r>
+        <w:rPr>
+          <w:b/>
+          <w:bCs/>
+          <w:sz w:val="28"/>
+          <w:szCs w:val="28"/>
+        </w:rPr>
+        <w:t xml:space="preserve">constraints: </w:t>
+      </w:r>
+      <w:r>
+        <w:rPr>
+          <w:sz w:val="28"/>
+          <w:szCs w:val="28"/>
+        </w:rPr>
+        <w:t>(</w:t>
+      </w:r>
+      <w:r>
+        <w:rPr>
+          <w:rFonts w:ascii="Segoe UI" w:eastAsia="Times New Roman" w:hAnsi="Segoe UI" w:cs="Segoe UI"/>
+          <w:color w:val="0451A5"/>
+          <w:kern w:val="0"/>
+          <w:sz w:val="26"/>
+          <w:szCs w:val="26"/>
+          <w:lang w:eastAsia="en-PK"/>
+          <w14:ligatures w14:val="none"/>
+        </w:rPr>
+        <w:t>must be in format YYYY-MM-DDTHH:mm:ss (e.g. 2024-01-01T00:00:00</w:t>
+      </w:r>
+      <w:r>
+        <w:rPr>
+          <w:rFonts w:ascii="Segoe UI" w:hAnsi="Segoe UI" w:cs="Segoe UI"/>
+          <w:sz w:val="26"/>
+          <w:szCs w:val="26"/>
+        </w:rPr>
+        <w:t xml:space="preserve">) </w:t>
+      </w:r>
+      <w:r>
+        <w:rPr>
+          <w:b/>
+          <w:bCs/>
+          <w:i/>
+          <w:iCs/>
+          <w:sz w:val="28"/>
+          <w:szCs w:val="28"/>
+        </w:rPr>
+        <w:t>optional (default:</w:t>
+      </w:r>
+      <w:r>
+        <w:rPr>
+          <w:rFonts w:ascii="Segoe UI" w:eastAsia="Times New Roman" w:hAnsi="Segoe UI" w:cs="Segoe UI"/>
+          <w:color w:val="0451A5"/>
+          <w:kern w:val="0"/>
+          <w:sz w:val="26"/>
+          <w:szCs w:val="26"/>
+          <w:lang w:eastAsia="en-PK"/>
+          <w14:ligatures w14:val="none"/>
+        </w:rPr>
+        <w:t xml:space="preserve"> 20</w:t>
+      </w:r>
+      <w:r>
+        <w:rPr>
+          <w:rFonts w:ascii="Segoe UI" w:eastAsia="Times New Roman" w:hAnsi="Segoe UI" w:cs="Segoe UI"/>
+          <w:color w:val="0451A5"/>
+          <w:kern w:val="0"/>
+          <w:sz w:val="26"/>
+          <w:szCs w:val="26"/>
+          <w:lang w:eastAsia="en-PK"/>
+          <w14:ligatures w14:val="none"/>
+        </w:rPr>
+        <w:t>30</w:t>
+      </w:r>
+      <w:r>
+        <w:rPr>
+          <w:rFonts w:ascii="Segoe UI" w:eastAsia="Times New Roman" w:hAnsi="Segoe UI" w:cs="Segoe UI"/>
+          <w:color w:val="0451A5"/>
+          <w:kern w:val="0"/>
+          <w:sz w:val="26"/>
+          <w:szCs w:val="26"/>
+          <w:lang w:eastAsia="en-PK"/>
+          <w14:ligatures w14:val="none"/>
+        </w:rPr>
+        <w:t>-1</w:t>
+      </w:r>
+      <w:r>
+        <w:rPr>
+          <w:rFonts w:ascii="Segoe UI" w:eastAsia="Times New Roman" w:hAnsi="Segoe UI" w:cs="Segoe UI"/>
+          <w:color w:val="0451A5"/>
+          <w:kern w:val="0"/>
+          <w:sz w:val="26"/>
+          <w:szCs w:val="26"/>
+          <w:lang w:eastAsia="en-PK"/>
+          <w14:ligatures w14:val="none"/>
+        </w:rPr>
+        <w:t>2</w:t>
+      </w:r>
+      <w:r>
+        <w:rPr>
+          <w:rFonts w:ascii="Segoe UI" w:eastAsia="Times New Roman" w:hAnsi="Segoe UI" w:cs="Segoe UI"/>
+          <w:color w:val="0451A5"/>
+          <w:kern w:val="0"/>
+          <w:sz w:val="26"/>
+          <w:szCs w:val="26"/>
+          <w:lang w:eastAsia="en-PK"/>
+          <w14:ligatures w14:val="none"/>
+        </w:rPr>
+        <w:t>-</w:t>
+      </w:r>
+      <w:r>
+        <w:rPr>
+          <w:rFonts w:ascii="Segoe UI" w:eastAsia="Times New Roman" w:hAnsi="Segoe UI" w:cs="Segoe UI"/>
+          <w:color w:val="0451A5"/>
+          <w:kern w:val="0"/>
+          <w:sz w:val="26"/>
+          <w:szCs w:val="26"/>
+          <w:lang w:eastAsia="en-PK"/>
+          <w14:ligatures w14:val="none"/>
+        </w:rPr>
+        <w:t>3</w:t>
+      </w:r>
+      <w:r>
+        <w:rPr>
+          <w:rFonts w:ascii="Segoe UI" w:eastAsia="Times New Roman" w:hAnsi="Segoe UI" w:cs="Segoe UI"/>
+          <w:color w:val="0451A5"/>
+          <w:kern w:val="0"/>
+          <w:sz w:val="26"/>
+          <w:szCs w:val="26"/>
+          <w:lang w:eastAsia="en-PK"/>
+          <w14:ligatures w14:val="none"/>
+        </w:rPr>
+        <w:t>1T</w:t>
+      </w:r>
+      <w:r>
+        <w:rPr>
+          <w:rFonts w:ascii="Segoe UI" w:eastAsia="Times New Roman" w:hAnsi="Segoe UI" w:cs="Segoe UI"/>
+          <w:color w:val="0451A5"/>
+          <w:kern w:val="0"/>
+          <w:sz w:val="26"/>
+          <w:szCs w:val="26"/>
+          <w:lang w:eastAsia="en-PK"/>
+          <w14:ligatures w14:val="none"/>
+        </w:rPr>
+        <w:t>23</w:t>
+      </w:r>
+      <w:r>
+        <w:rPr>
+          <w:rFonts w:ascii="Segoe UI" w:eastAsia="Times New Roman" w:hAnsi="Segoe UI" w:cs="Segoe UI"/>
+          <w:color w:val="0451A5"/>
+          <w:kern w:val="0"/>
+          <w:sz w:val="26"/>
+          <w:szCs w:val="26"/>
+          <w:lang w:eastAsia="en-PK"/>
+          <w14:ligatures w14:val="none"/>
+        </w:rPr>
+        <w:t>:</w:t>
+      </w:r>
+      <w:r>
+        <w:rPr>
+          <w:rFonts w:ascii="Segoe UI" w:eastAsia="Times New Roman" w:hAnsi="Segoe UI" w:cs="Segoe UI"/>
+          <w:color w:val="0451A5"/>
+          <w:kern w:val="0"/>
+          <w:sz w:val="26"/>
+          <w:szCs w:val="26"/>
+          <w:lang w:eastAsia="en-PK"/>
+          <w14:ligatures w14:val="none"/>
+        </w:rPr>
+        <w:t>59</w:t>
+      </w:r>
+      <w:r>
+        <w:rPr>
+          <w:rFonts w:ascii="Segoe UI" w:eastAsia="Times New Roman" w:hAnsi="Segoe UI" w:cs="Segoe UI"/>
+          <w:color w:val="0451A5"/>
+          <w:kern w:val="0"/>
+          <w:sz w:val="26"/>
+          <w:szCs w:val="26"/>
+          <w:lang w:eastAsia="en-PK"/>
+          <w14:ligatures w14:val="none"/>
+        </w:rPr>
+        <w:t>:</w:t>
+      </w:r>
+      <w:r>
+        <w:rPr>
+          <w:rFonts w:ascii="Segoe UI" w:eastAsia="Times New Roman" w:hAnsi="Segoe UI" w:cs="Segoe UI"/>
+          <w:color w:val="0451A5"/>
+          <w:kern w:val="0"/>
+          <w:sz w:val="26"/>
+          <w:szCs w:val="26"/>
+          <w:lang w:eastAsia="en-PK"/>
+          <w14:ligatures w14:val="none"/>
+        </w:rPr>
+        <w:t>59</w:t>
+      </w:r>
+      <w:r>
+        <w:rPr>
+          <w:b/>
+          <w:bCs/>
+          <w:i/>
+          <w:iCs/>
+          <w:sz w:val="28"/>
+          <w:szCs w:val="28"/>
+        </w:rPr>
+        <w:t>)</w:t>
+      </w:r>
+    </w:p>
+    <w:p>
+      <w:pPr>
+        <w:shd w:val="clear" w:color="auto" w:fill="FFFFFF"/>
+        <w:spacing w:line="270" w:lineRule="atLeast"/>
+        <w:ind w:left="720"/>
+        <w:rPr>
+          <w:rFonts w:ascii="Courier New" w:eastAsia="Times New Roman" w:hAnsi="Courier New" w:cs="Courier New"/>
+          <w:color w:val="000000"/>
+          <w:kern w:val="0"/>
+          <w:sz w:val="18"/>
+          <w:szCs w:val="18"/>
+          <w:lang w:eastAsia="en-PK"/>
+          <w14:ligatures w14:val="none"/>
+        </w:rPr>
+      </w:pPr>
     </w:p>
     <w:p>
       <w:pPr>
@@ -984,7 +1531,6 @@
           <w:sz w:val="28"/>
           <w:szCs w:val="28"/>
         </w:rPr>
-        <w:lastRenderedPageBreak/>
         <w:drawing>
           <wp:inline distT="0" distB="0" distL="0" distR="0" wp14:anchorId="278A0296" wp14:editId="4A6EF7EE">
             <wp:extent cx="5731510" cy="2656840"/>
@@ -1001,7 +1547,7 @@
                     <pic:cNvPicPr/>
                   </pic:nvPicPr>
                   <pic:blipFill>
-                    <a:blip r:embed="rId5"/>
+                    <a:blip r:embed="rId6"/>
                     <a:stretch>
                       <a:fillRect/>
                     </a:stretch>
@@ -1087,6 +1633,7 @@
           <w:sz w:val="28"/>
           <w:szCs w:val="28"/>
         </w:rPr>
+        <w:lastRenderedPageBreak/>
         <w:t>url: (Method + URL)</w:t>
       </w:r>
     </w:p>
@@ -1686,7 +2233,6 @@
           <w:sz w:val="28"/>
           <w:szCs w:val="28"/>
         </w:rPr>
-        <w:lastRenderedPageBreak/>
         <w:drawing>
           <wp:inline distT="0" distB="0" distL="0" distR="0" wp14:anchorId="3817537C" wp14:editId="5EB57CB6">
             <wp:extent cx="5731510" cy="2744470"/>
@@ -1703,7 +2249,7 @@
                     <pic:cNvPicPr/>
                   </pic:nvPicPr>
                   <pic:blipFill>
-                    <a:blip r:embed="rId6"/>
+                    <a:blip r:embed="rId7"/>
                     <a:stretch>
                       <a:fillRect/>
                     </a:stretch>
@@ -1780,6 +2326,7 @@
           <w:sz w:val="28"/>
           <w:szCs w:val="28"/>
         </w:rPr>
+        <w:lastRenderedPageBreak/>
         <w:t>url:</w:t>
       </w:r>
     </w:p>
@@ -2123,7 +2670,6 @@
           <w:sz w:val="28"/>
           <w:szCs w:val="28"/>
         </w:rPr>
-        <w:lastRenderedPageBreak/>
         <w:drawing>
           <wp:inline distT="0" distB="0" distL="0" distR="0" wp14:anchorId="002DD95D" wp14:editId="688EB1B9">
             <wp:extent cx="5731510" cy="1732280"/>
@@ -2140,7 +2686,7 @@
                     <pic:cNvPicPr/>
                   </pic:nvPicPr>
                   <pic:blipFill>
-                    <a:blip r:embed="rId7"/>
+                    <a:blip r:embed="rId8"/>
                     <a:stretch>
                       <a:fillRect/>
                     </a:stretch>
@@ -2258,6 +2804,7 @@
           <w:sz w:val="28"/>
           <w:szCs w:val="28"/>
         </w:rPr>
+        <w:lastRenderedPageBreak/>
         <w:tab/>
       </w:r>
       <w:r>
@@ -2282,7 +2829,7 @@
                     <pic:cNvPicPr/>
                   </pic:nvPicPr>
                   <pic:blipFill>
-                    <a:blip r:embed="rId8"/>
+                    <a:blip r:embed="rId9"/>
                     <a:stretch>
                       <a:fillRect/>
                     </a:stretch>
@@ -2488,146 +3035,146 @@
           <w:sz w:val="28"/>
           <w:szCs w:val="28"/>
         </w:rPr>
+        <w:t>params:</w:t>
+      </w:r>
+    </w:p>
+    <w:p>
+      <w:pPr>
+        <w:ind w:left="720"/>
+        <w:rPr>
+          <w:sz w:val="28"/>
+          <w:szCs w:val="28"/>
+        </w:rPr>
+      </w:pPr>
+      <w:r>
+        <w:rPr>
+          <w:sz w:val="28"/>
+          <w:szCs w:val="28"/>
+        </w:rPr>
+        <w:t xml:space="preserve">studentId </w:t>
+      </w:r>
+      <w:r>
+        <w:rPr>
+          <w:i/>
+          <w:iCs/>
+          <w:sz w:val="28"/>
+          <w:szCs w:val="28"/>
+        </w:rPr>
+        <w:t>“url parameter”</w:t>
+      </w:r>
+      <w:r>
+        <w:rPr>
+          <w:i/>
+          <w:iCs/>
+          <w:sz w:val="28"/>
+          <w:szCs w:val="28"/>
+        </w:rPr>
+        <w:t xml:space="preserve"> </w:t>
+      </w:r>
+      <w:r>
+        <w:rPr>
+          <w:b/>
+          <w:bCs/>
+          <w:i/>
+          <w:iCs/>
+          <w:sz w:val="28"/>
+          <w:szCs w:val="28"/>
+        </w:rPr>
+        <w:t>required</w:t>
+      </w:r>
+    </w:p>
+    <w:p>
+      <w:pPr>
+        <w:ind w:left="720"/>
+        <w:rPr>
+          <w:b/>
+          <w:bCs/>
+          <w:i/>
+          <w:iCs/>
+          <w:caps/>
+          <w:sz w:val="28"/>
+          <w:szCs w:val="28"/>
+        </w:rPr>
+      </w:pPr>
+      <w:r>
+        <w:rPr>
+          <w:b/>
+          <w:bCs/>
+          <w:i/>
+          <w:iCs/>
+          <w:caps/>
+          <w:sz w:val="28"/>
+          <w:szCs w:val="28"/>
+        </w:rPr>
+        <w:t>format:</w:t>
+      </w:r>
+    </w:p>
+    <w:p>
+      <w:pPr>
+        <w:rPr>
+          <w:sz w:val="28"/>
+          <w:szCs w:val="28"/>
+        </w:rPr>
+      </w:pPr>
+      <w:r>
+        <w:rPr>
+          <w:b/>
+          <w:bCs/>
+          <w:i/>
+          <w:iCs/>
+          <w:sz w:val="28"/>
+          <w:szCs w:val="28"/>
+        </w:rPr>
+        <w:tab/>
+      </w:r>
+      <w:r>
+        <w:rPr>
+          <w:sz w:val="28"/>
+          <w:szCs w:val="28"/>
+        </w:rPr>
+        <w:t>JSON</w:t>
+      </w:r>
+    </w:p>
+    <w:p>
+      <w:pPr>
+        <w:ind w:left="720"/>
+        <w:rPr>
+          <w:b/>
+          <w:bCs/>
+          <w:i/>
+          <w:iCs/>
+          <w:caps/>
+          <w:sz w:val="28"/>
+          <w:szCs w:val="28"/>
+        </w:rPr>
+      </w:pPr>
+      <w:r>
+        <w:rPr>
+          <w:b/>
+          <w:bCs/>
+          <w:i/>
+          <w:iCs/>
+          <w:caps/>
+          <w:sz w:val="28"/>
+          <w:szCs w:val="28"/>
+        </w:rPr>
+        <w:t>example:</w:t>
+      </w:r>
+    </w:p>
+    <w:p>
+      <w:pPr>
+        <w:rPr>
+          <w:sz w:val="28"/>
+          <w:szCs w:val="28"/>
+        </w:rPr>
+      </w:pPr>
+      <w:r>
+        <w:rPr>
+          <w:noProof/>
+          <w:sz w:val="28"/>
+          <w:szCs w:val="28"/>
+        </w:rPr>
         <w:lastRenderedPageBreak/>
-        <w:t>params:</w:t>
-      </w:r>
-    </w:p>
-    <w:p>
-      <w:pPr>
-        <w:ind w:left="720"/>
-        <w:rPr>
-          <w:sz w:val="28"/>
-          <w:szCs w:val="28"/>
-        </w:rPr>
-      </w:pPr>
-      <w:r>
-        <w:rPr>
-          <w:sz w:val="28"/>
-          <w:szCs w:val="28"/>
-        </w:rPr>
-        <w:t xml:space="preserve">studentId </w:t>
-      </w:r>
-      <w:r>
-        <w:rPr>
-          <w:i/>
-          <w:iCs/>
-          <w:sz w:val="28"/>
-          <w:szCs w:val="28"/>
-        </w:rPr>
-        <w:t>“url parameter”</w:t>
-      </w:r>
-      <w:r>
-        <w:rPr>
-          <w:i/>
-          <w:iCs/>
-          <w:sz w:val="28"/>
-          <w:szCs w:val="28"/>
-        </w:rPr>
-        <w:t xml:space="preserve"> </w:t>
-      </w:r>
-      <w:r>
-        <w:rPr>
-          <w:b/>
-          <w:bCs/>
-          <w:i/>
-          <w:iCs/>
-          <w:sz w:val="28"/>
-          <w:szCs w:val="28"/>
-        </w:rPr>
-        <w:t>required</w:t>
-      </w:r>
-    </w:p>
-    <w:p>
-      <w:pPr>
-        <w:ind w:left="720"/>
-        <w:rPr>
-          <w:b/>
-          <w:bCs/>
-          <w:i/>
-          <w:iCs/>
-          <w:caps/>
-          <w:sz w:val="28"/>
-          <w:szCs w:val="28"/>
-        </w:rPr>
-      </w:pPr>
-      <w:r>
-        <w:rPr>
-          <w:b/>
-          <w:bCs/>
-          <w:i/>
-          <w:iCs/>
-          <w:caps/>
-          <w:sz w:val="28"/>
-          <w:szCs w:val="28"/>
-        </w:rPr>
-        <w:t>format:</w:t>
-      </w:r>
-    </w:p>
-    <w:p>
-      <w:pPr>
-        <w:rPr>
-          <w:sz w:val="28"/>
-          <w:szCs w:val="28"/>
-        </w:rPr>
-      </w:pPr>
-      <w:r>
-        <w:rPr>
-          <w:b/>
-          <w:bCs/>
-          <w:i/>
-          <w:iCs/>
-          <w:sz w:val="28"/>
-          <w:szCs w:val="28"/>
-        </w:rPr>
-        <w:tab/>
-      </w:r>
-      <w:r>
-        <w:rPr>
-          <w:sz w:val="28"/>
-          <w:szCs w:val="28"/>
-        </w:rPr>
-        <w:t>JSON</w:t>
-      </w:r>
-    </w:p>
-    <w:p>
-      <w:pPr>
-        <w:ind w:left="720"/>
-        <w:rPr>
-          <w:b/>
-          <w:bCs/>
-          <w:i/>
-          <w:iCs/>
-          <w:caps/>
-          <w:sz w:val="28"/>
-          <w:szCs w:val="28"/>
-        </w:rPr>
-      </w:pPr>
-      <w:r>
-        <w:rPr>
-          <w:b/>
-          <w:bCs/>
-          <w:i/>
-          <w:iCs/>
-          <w:caps/>
-          <w:sz w:val="28"/>
-          <w:szCs w:val="28"/>
-        </w:rPr>
-        <w:t>example:</w:t>
-      </w:r>
-    </w:p>
-    <w:p>
-      <w:pPr>
-        <w:rPr>
-          <w:sz w:val="28"/>
-          <w:szCs w:val="28"/>
-        </w:rPr>
-      </w:pPr>
-      <w:r>
-        <w:rPr>
-          <w:noProof/>
-          <w:sz w:val="28"/>
-          <w:szCs w:val="28"/>
-        </w:rPr>
         <w:drawing>
           <wp:inline distT="0" distB="0" distL="0" distR="0" wp14:anchorId="126648A0" wp14:editId="40500DD2">
             <wp:extent cx="5731510" cy="3876040"/>
@@ -2644,7 +3191,7 @@
                     <pic:cNvPicPr/>
                   </pic:nvPicPr>
                   <pic:blipFill>
-                    <a:blip r:embed="rId9"/>
+                    <a:blip r:embed="rId10"/>
                     <a:stretch>
                       <a:fillRect/>
                     </a:stretch>
@@ -3191,7 +3738,7 @@
   <w:style w:type="paragraph" w:default="1" w:styleId="Normal">
     <w:name w:val="Normal"/>
     <w:qFormat/>
-    <w:rsid w:val="00874DB8"/>
+    <w:rsid w:val="00BC4B2A"/>
   </w:style>
   <w:style w:type="paragraph" w:styleId="Heading1">
     <w:name w:val="heading 1"/>

</xml_diff>

<commit_message>
updated documentation for logs
</commit_message>
<xml_diff>
--- a/documentation files/HIKVISION backend documentation.docx
+++ b/documentation files/HIKVISION backend documentation.docx
@@ -99,16 +99,6 @@
           <w:szCs w:val="28"/>
         </w:rPr>
         <w:t xml:space="preserve"> </w:t>
-      </w:r>
-      <w:r>
-        <w:rPr>
-          <w:b/>
-          <w:bCs/>
-          <w:color w:val="EE0000"/>
-          <w:sz w:val="28"/>
-          <w:szCs w:val="28"/>
-        </w:rPr>
-        <w:t>(testing)</w:t>
       </w:r>
     </w:p>
     <w:p>
@@ -2481,6 +2471,17 @@
         </w:rPr>
         <w:t>optional</w:t>
       </w:r>
+      <w:r>
+        <w:rPr>
+          <w:b/>
+          <w:bCs/>
+          <w:i/>
+          <w:iCs/>
+          <w:sz w:val="28"/>
+          <w:szCs w:val="28"/>
+        </w:rPr>
+        <w:t xml:space="preserve"> (default: 30)</w:t>
+      </w:r>
     </w:p>
     <w:p>
       <w:pPr>
@@ -2527,6 +2528,17 @@
           <w:szCs w:val="28"/>
         </w:rPr>
         <w:t>optional</w:t>
+      </w:r>
+      <w:r>
+        <w:rPr>
+          <w:b/>
+          <w:bCs/>
+          <w:i/>
+          <w:iCs/>
+          <w:sz w:val="28"/>
+          <w:szCs w:val="28"/>
+        </w:rPr>
+        <w:t xml:space="preserve"> (default: 0)</w:t>
       </w:r>
     </w:p>
     <w:p>
@@ -3214,25 +3226,746 @@
     </w:p>
     <w:p>
       <w:pPr>
-        <w:ind w:left="720"/>
-        <w:rPr>
-          <w:sz w:val="28"/>
-          <w:szCs w:val="28"/>
-        </w:rPr>
-      </w:pPr>
-    </w:p>
-    <w:p>
-      <w:pPr>
-        <w:ind w:left="720"/>
-        <w:rPr>
-          <w:b/>
-          <w:bCs/>
-          <w:i/>
-          <w:iCs/>
-          <w:sz w:val="28"/>
-          <w:szCs w:val="28"/>
-        </w:rPr>
-      </w:pPr>
+        <w:pStyle w:val="ListParagraph"/>
+        <w:numPr>
+          <w:ilvl w:val="0"/>
+          <w:numId w:val="1"/>
+        </w:numPr>
+        <w:rPr>
+          <w:b/>
+          <w:bCs/>
+          <w:sz w:val="28"/>
+          <w:szCs w:val="28"/>
+        </w:rPr>
+      </w:pPr>
+      <w:r>
+        <w:rPr>
+          <w:b/>
+          <w:bCs/>
+          <w:sz w:val="28"/>
+          <w:szCs w:val="28"/>
+        </w:rPr>
+        <w:t>Get all users (30 per request)</w:t>
+      </w:r>
+    </w:p>
+    <w:p>
+      <w:pPr>
+        <w:ind w:left="720"/>
+        <w:rPr>
+          <w:b/>
+          <w:bCs/>
+          <w:i/>
+          <w:iCs/>
+          <w:caps/>
+          <w:sz w:val="28"/>
+          <w:szCs w:val="28"/>
+        </w:rPr>
+      </w:pPr>
+      <w:r>
+        <w:rPr>
+          <w:b/>
+          <w:bCs/>
+          <w:i/>
+          <w:iCs/>
+          <w:caps/>
+          <w:sz w:val="28"/>
+          <w:szCs w:val="28"/>
+        </w:rPr>
+        <w:t>url:</w:t>
+      </w:r>
+    </w:p>
+    <w:p>
+      <w:pPr>
+        <w:ind w:left="720"/>
+        <w:rPr>
+          <w:rFonts w:ascii="Segoe UI" w:hAnsi="Segoe UI" w:cs="Segoe UI"/>
+          <w:sz w:val="26"/>
+          <w:szCs w:val="26"/>
+        </w:rPr>
+      </w:pPr>
+      <w:r>
+        <w:rPr>
+          <w:color w:val="4EA72E" w:themeColor="accent6"/>
+          <w:sz w:val="26"/>
+          <w:szCs w:val="26"/>
+        </w:rPr>
+        <w:t>GE</w:t>
+      </w:r>
+      <w:r>
+        <w:rPr>
+          <w:color w:val="4EA72E" w:themeColor="accent6"/>
+          <w:sz w:val="26"/>
+          <w:szCs w:val="26"/>
+        </w:rPr>
+        <w:t>T</w:t>
+      </w:r>
+      <w:r>
+        <w:rPr>
+          <w:sz w:val="26"/>
+          <w:szCs w:val="26"/>
+        </w:rPr>
+        <w:t xml:space="preserve"> </w:t>
+      </w:r>
+      <w:r>
+        <w:rPr>
+          <w:rStyle w:val="inlinevariable"/>
+          <w:rFonts w:ascii="Segoe UI" w:hAnsi="Segoe UI" w:cs="Segoe UI"/>
+          <w:color w:val="2552AA"/>
+          <w:sz w:val="26"/>
+          <w:szCs w:val="26"/>
+          <w:bdr w:val="single" w:sz="4" w:space="0" w:color="EDEDED" w:frame="1"/>
+        </w:rPr>
+        <w:t>{{backend url}}</w:t>
+      </w:r>
+      <w:r>
+        <w:rPr>
+          <w:rFonts w:ascii="Segoe UI" w:hAnsi="Segoe UI" w:cs="Segoe UI"/>
+          <w:color w:val="212121"/>
+          <w:sz w:val="26"/>
+          <w:szCs w:val="26"/>
+          <w:shd w:val="clear" w:color="auto" w:fill="FFFFFF"/>
+        </w:rPr>
+        <w:t>/</w:t>
+      </w:r>
+      <w:r>
+        <w:rPr>
+          <w:rFonts w:ascii="Segoe UI" w:hAnsi="Segoe UI" w:cs="Segoe UI"/>
+          <w:color w:val="212121"/>
+          <w:sz w:val="26"/>
+          <w:szCs w:val="26"/>
+          <w:shd w:val="clear" w:color="auto" w:fill="FFFFFF"/>
+        </w:rPr>
+        <w:t>logs/device</w:t>
+      </w:r>
+      <w:r>
+        <w:rPr>
+          <w:rFonts w:cs="Segoe UI"/>
+          <w:color w:val="212121"/>
+          <w:sz w:val="26"/>
+          <w:szCs w:val="26"/>
+          <w:shd w:val="clear" w:color="auto" w:fill="FFFFFF"/>
+        </w:rPr>
+        <w:t>?</w:t>
+      </w:r>
+      <w:r>
+        <w:rPr>
+          <w:sz w:val="26"/>
+          <w:szCs w:val="26"/>
+        </w:rPr>
+        <w:t xml:space="preserve"> </w:t>
+      </w:r>
+      <w:r>
+        <w:rPr>
+          <w:rFonts w:ascii="Segoe UI" w:hAnsi="Segoe UI" w:cs="Segoe UI"/>
+          <w:color w:val="212121"/>
+          <w:sz w:val="26"/>
+          <w:szCs w:val="26"/>
+          <w:shd w:val="clear" w:color="auto" w:fill="FFFFFF"/>
+        </w:rPr>
+        <w:t>beginTime=2026-06-06T00:00:00&amp;endTime=2026-06-06T23:00:00&amp;filter=all&amp;position=12&amp;limit=10</w:t>
+      </w:r>
+    </w:p>
+    <w:p>
+      <w:pPr>
+        <w:ind w:left="720"/>
+        <w:rPr>
+          <w:b/>
+          <w:bCs/>
+          <w:i/>
+          <w:iCs/>
+          <w:caps/>
+          <w:sz w:val="28"/>
+          <w:szCs w:val="28"/>
+        </w:rPr>
+      </w:pPr>
+      <w:r>
+        <w:rPr>
+          <w:b/>
+          <w:bCs/>
+          <w:i/>
+          <w:iCs/>
+          <w:caps/>
+          <w:sz w:val="28"/>
+          <w:szCs w:val="28"/>
+        </w:rPr>
+        <w:t>params:</w:t>
+      </w:r>
+    </w:p>
+    <w:p>
+      <w:pPr>
+        <w:ind w:left="720"/>
+        <w:rPr>
+          <w:b/>
+          <w:bCs/>
+          <w:i/>
+          <w:iCs/>
+          <w:sz w:val="28"/>
+          <w:szCs w:val="28"/>
+        </w:rPr>
+      </w:pPr>
+      <w:r>
+        <w:rPr>
+          <w:sz w:val="28"/>
+          <w:szCs w:val="28"/>
+        </w:rPr>
+        <w:t xml:space="preserve">limit </w:t>
+      </w:r>
+      <w:r>
+        <w:rPr>
+          <w:i/>
+          <w:iCs/>
+          <w:sz w:val="28"/>
+          <w:szCs w:val="28"/>
+        </w:rPr>
+        <w:t>“query param”</w:t>
+      </w:r>
+      <w:r>
+        <w:rPr>
+          <w:sz w:val="28"/>
+          <w:szCs w:val="28"/>
+        </w:rPr>
+        <w:t xml:space="preserve"> </w:t>
+      </w:r>
+      <w:r>
+        <w:rPr>
+          <w:b/>
+          <w:bCs/>
+          <w:i/>
+          <w:iCs/>
+          <w:sz w:val="28"/>
+          <w:szCs w:val="28"/>
+        </w:rPr>
+        <w:t>optional</w:t>
+      </w:r>
+      <w:r>
+        <w:rPr>
+          <w:b/>
+          <w:bCs/>
+          <w:i/>
+          <w:iCs/>
+          <w:sz w:val="28"/>
+          <w:szCs w:val="28"/>
+        </w:rPr>
+        <w:t xml:space="preserve"> (default: 50)</w:t>
+      </w:r>
+    </w:p>
+    <w:p>
+      <w:pPr>
+        <w:ind w:left="720"/>
+        <w:rPr>
+          <w:b/>
+          <w:bCs/>
+          <w:i/>
+          <w:iCs/>
+          <w:sz w:val="28"/>
+          <w:szCs w:val="28"/>
+        </w:rPr>
+      </w:pPr>
+      <w:r>
+        <w:rPr>
+          <w:sz w:val="28"/>
+          <w:szCs w:val="28"/>
+        </w:rPr>
+        <w:t xml:space="preserve">position </w:t>
+      </w:r>
+      <w:r>
+        <w:rPr>
+          <w:i/>
+          <w:iCs/>
+          <w:sz w:val="28"/>
+          <w:szCs w:val="28"/>
+        </w:rPr>
+        <w:t>“query param”</w:t>
+      </w:r>
+      <w:r>
+        <w:rPr>
+          <w:sz w:val="28"/>
+          <w:szCs w:val="28"/>
+        </w:rPr>
+        <w:t xml:space="preserve"> </w:t>
+      </w:r>
+      <w:r>
+        <w:rPr>
+          <w:b/>
+          <w:bCs/>
+          <w:i/>
+          <w:iCs/>
+          <w:sz w:val="28"/>
+          <w:szCs w:val="28"/>
+        </w:rPr>
+        <w:t>optional</w:t>
+      </w:r>
+      <w:r>
+        <w:rPr>
+          <w:b/>
+          <w:bCs/>
+          <w:i/>
+          <w:iCs/>
+          <w:sz w:val="28"/>
+          <w:szCs w:val="28"/>
+        </w:rPr>
+        <w:t xml:space="preserve"> (default: 0)</w:t>
+      </w:r>
+    </w:p>
+    <w:p>
+      <w:pPr>
+        <w:ind w:left="720"/>
+        <w:rPr>
+          <w:b/>
+          <w:bCs/>
+          <w:i/>
+          <w:iCs/>
+          <w:sz w:val="28"/>
+          <w:szCs w:val="28"/>
+        </w:rPr>
+      </w:pPr>
+      <w:r>
+        <w:rPr>
+          <w:sz w:val="28"/>
+          <w:szCs w:val="28"/>
+        </w:rPr>
+        <w:t>beginTime</w:t>
+      </w:r>
+      <w:r>
+        <w:rPr>
+          <w:sz w:val="28"/>
+          <w:szCs w:val="28"/>
+        </w:rPr>
+        <w:t xml:space="preserve"> </w:t>
+      </w:r>
+      <w:r>
+        <w:rPr>
+          <w:i/>
+          <w:iCs/>
+          <w:sz w:val="28"/>
+          <w:szCs w:val="28"/>
+        </w:rPr>
+        <w:t>“query param”</w:t>
+      </w:r>
+      <w:r>
+        <w:rPr>
+          <w:sz w:val="28"/>
+          <w:szCs w:val="28"/>
+        </w:rPr>
+        <w:t xml:space="preserve"> </w:t>
+      </w:r>
+      <w:r>
+        <w:rPr>
+          <w:b/>
+          <w:bCs/>
+          <w:sz w:val="28"/>
+          <w:szCs w:val="28"/>
+        </w:rPr>
+        <w:t xml:space="preserve">constraints: </w:t>
+      </w:r>
+      <w:r>
+        <w:rPr>
+          <w:sz w:val="28"/>
+          <w:szCs w:val="28"/>
+        </w:rPr>
+        <w:t>(</w:t>
+      </w:r>
+      <w:r>
+        <w:rPr>
+          <w:rFonts w:ascii="Segoe UI" w:eastAsia="Times New Roman" w:hAnsi="Segoe UI" w:cs="Segoe UI"/>
+          <w:color w:val="0451A5"/>
+          <w:kern w:val="0"/>
+          <w:sz w:val="26"/>
+          <w:szCs w:val="26"/>
+          <w:lang w:eastAsia="en-PK"/>
+          <w14:ligatures w14:val="none"/>
+        </w:rPr>
+        <w:t>must be in format YYYY-MM-DDTHH:mm:ss (e.g. 2024-01-01T00:00:00</w:t>
+      </w:r>
+      <w:r>
+        <w:rPr>
+          <w:rFonts w:ascii="Segoe UI" w:hAnsi="Segoe UI" w:cs="Segoe UI"/>
+          <w:sz w:val="26"/>
+          <w:szCs w:val="26"/>
+        </w:rPr>
+        <w:t>)</w:t>
+      </w:r>
+      <w:r>
+        <w:rPr>
+          <w:rFonts w:ascii="Segoe UI" w:hAnsi="Segoe UI" w:cs="Segoe UI"/>
+          <w:sz w:val="26"/>
+          <w:szCs w:val="26"/>
+        </w:rPr>
+        <w:t xml:space="preserve"> </w:t>
+      </w:r>
+      <w:r>
+        <w:rPr>
+          <w:b/>
+          <w:bCs/>
+          <w:i/>
+          <w:iCs/>
+          <w:sz w:val="28"/>
+          <w:szCs w:val="28"/>
+        </w:rPr>
+        <w:t>optional</w:t>
+      </w:r>
+    </w:p>
+    <w:p>
+      <w:pPr>
+        <w:ind w:left="720"/>
+        <w:rPr>
+          <w:b/>
+          <w:bCs/>
+          <w:i/>
+          <w:iCs/>
+          <w:sz w:val="28"/>
+          <w:szCs w:val="28"/>
+        </w:rPr>
+      </w:pPr>
+      <w:r>
+        <w:rPr>
+          <w:sz w:val="28"/>
+          <w:szCs w:val="28"/>
+        </w:rPr>
+        <w:t>endTime</w:t>
+      </w:r>
+      <w:r>
+        <w:rPr>
+          <w:sz w:val="28"/>
+          <w:szCs w:val="28"/>
+        </w:rPr>
+        <w:t xml:space="preserve"> </w:t>
+      </w:r>
+      <w:r>
+        <w:rPr>
+          <w:i/>
+          <w:iCs/>
+          <w:sz w:val="28"/>
+          <w:szCs w:val="28"/>
+        </w:rPr>
+        <w:t>“query param”</w:t>
+      </w:r>
+      <w:r>
+        <w:rPr>
+          <w:sz w:val="28"/>
+          <w:szCs w:val="28"/>
+        </w:rPr>
+        <w:t xml:space="preserve"> </w:t>
+      </w:r>
+      <w:r>
+        <w:rPr>
+          <w:b/>
+          <w:bCs/>
+          <w:sz w:val="28"/>
+          <w:szCs w:val="28"/>
+        </w:rPr>
+        <w:t xml:space="preserve">constraints: </w:t>
+      </w:r>
+      <w:r>
+        <w:rPr>
+          <w:sz w:val="28"/>
+          <w:szCs w:val="28"/>
+        </w:rPr>
+        <w:t>(</w:t>
+      </w:r>
+      <w:r>
+        <w:rPr>
+          <w:rFonts w:ascii="Segoe UI" w:eastAsia="Times New Roman" w:hAnsi="Segoe UI" w:cs="Segoe UI"/>
+          <w:color w:val="0451A5"/>
+          <w:kern w:val="0"/>
+          <w:sz w:val="26"/>
+          <w:szCs w:val="26"/>
+          <w:lang w:eastAsia="en-PK"/>
+          <w14:ligatures w14:val="none"/>
+        </w:rPr>
+        <w:t>must be in format YYYY-MM-DDTHH:mm:ss (e.g. 2024-01-01T00:00:00</w:t>
+      </w:r>
+      <w:r>
+        <w:rPr>
+          <w:rFonts w:ascii="Segoe UI" w:hAnsi="Segoe UI" w:cs="Segoe UI"/>
+          <w:sz w:val="26"/>
+          <w:szCs w:val="26"/>
+        </w:rPr>
+        <w:t>)</w:t>
+      </w:r>
+      <w:r>
+        <w:rPr>
+          <w:sz w:val="28"/>
+          <w:szCs w:val="28"/>
+        </w:rPr>
+        <w:t xml:space="preserve"> </w:t>
+      </w:r>
+      <w:r>
+        <w:rPr>
+          <w:b/>
+          <w:bCs/>
+          <w:i/>
+          <w:iCs/>
+          <w:sz w:val="28"/>
+          <w:szCs w:val="28"/>
+        </w:rPr>
+        <w:t>optional</w:t>
+      </w:r>
+    </w:p>
+    <w:p>
+      <w:pPr>
+        <w:ind w:left="720"/>
+        <w:rPr>
+          <w:b/>
+          <w:bCs/>
+          <w:i/>
+          <w:iCs/>
+          <w:sz w:val="28"/>
+          <w:szCs w:val="28"/>
+        </w:rPr>
+      </w:pPr>
+      <w:r>
+        <w:rPr>
+          <w:sz w:val="28"/>
+          <w:szCs w:val="28"/>
+        </w:rPr>
+        <w:t>filter</w:t>
+      </w:r>
+      <w:r>
+        <w:rPr>
+          <w:sz w:val="28"/>
+          <w:szCs w:val="28"/>
+        </w:rPr>
+        <w:t xml:space="preserve"> </w:t>
+      </w:r>
+      <w:r>
+        <w:rPr>
+          <w:i/>
+          <w:iCs/>
+          <w:sz w:val="28"/>
+          <w:szCs w:val="28"/>
+        </w:rPr>
+        <w:t>“query param”</w:t>
+      </w:r>
+      <w:r>
+        <w:rPr>
+          <w:i/>
+          <w:iCs/>
+          <w:sz w:val="28"/>
+          <w:szCs w:val="28"/>
+        </w:rPr>
+        <w:t xml:space="preserve"> </w:t>
+      </w:r>
+      <w:r>
+        <w:rPr>
+          <w:b/>
+          <w:bCs/>
+          <w:sz w:val="28"/>
+          <w:szCs w:val="28"/>
+        </w:rPr>
+        <w:t xml:space="preserve">constraints: </w:t>
+      </w:r>
+      <w:r>
+        <w:rPr>
+          <w:sz w:val="28"/>
+          <w:szCs w:val="28"/>
+        </w:rPr>
+        <w:t>(can be only “</w:t>
+      </w:r>
+      <w:r>
+        <w:rPr>
+          <w:sz w:val="28"/>
+          <w:szCs w:val="28"/>
+        </w:rPr>
+        <w:t>all</w:t>
+      </w:r>
+      <w:r>
+        <w:rPr>
+          <w:sz w:val="28"/>
+          <w:szCs w:val="28"/>
+        </w:rPr>
+        <w:t xml:space="preserve">, </w:t>
+      </w:r>
+      <w:r>
+        <w:rPr>
+          <w:sz w:val="28"/>
+          <w:szCs w:val="28"/>
+        </w:rPr>
+        <w:t>verified,</w:t>
+      </w:r>
+      <w:r>
+        <w:rPr>
+          <w:sz w:val="28"/>
+          <w:szCs w:val="28"/>
+        </w:rPr>
+        <w:t xml:space="preserve"> blackList</w:t>
+      </w:r>
+      <w:r>
+        <w:rPr>
+          <w:sz w:val="28"/>
+          <w:szCs w:val="28"/>
+        </w:rPr>
+        <w:t>, doorOpen, doorClose, duplicate</w:t>
+      </w:r>
+      <w:r>
+        <w:rPr>
+          <w:sz w:val="28"/>
+          <w:szCs w:val="28"/>
+        </w:rPr>
+        <w:t xml:space="preserve">” *case sensitive*)  </w:t>
+      </w:r>
+      <w:r>
+        <w:rPr>
+          <w:b/>
+          <w:bCs/>
+          <w:i/>
+          <w:iCs/>
+          <w:sz w:val="28"/>
+          <w:szCs w:val="28"/>
+        </w:rPr>
+        <w:t>optional</w:t>
+      </w:r>
+      <w:r>
+        <w:rPr>
+          <w:b/>
+          <w:bCs/>
+          <w:i/>
+          <w:iCs/>
+          <w:sz w:val="28"/>
+          <w:szCs w:val="28"/>
+        </w:rPr>
+        <w:t xml:space="preserve"> (default: all)</w:t>
+      </w:r>
+    </w:p>
+    <w:p>
+      <w:pPr>
+        <w:ind w:left="720"/>
+        <w:rPr>
+          <w:b/>
+          <w:bCs/>
+          <w:i/>
+          <w:iCs/>
+          <w:sz w:val="28"/>
+          <w:szCs w:val="28"/>
+        </w:rPr>
+      </w:pPr>
+    </w:p>
+    <w:p>
+      <w:pPr>
+        <w:ind w:left="720"/>
+        <w:rPr>
+          <w:b/>
+          <w:bCs/>
+          <w:i/>
+          <w:iCs/>
+          <w:caps/>
+          <w:sz w:val="28"/>
+          <w:szCs w:val="28"/>
+        </w:rPr>
+      </w:pPr>
+      <w:r>
+        <w:rPr>
+          <w:b/>
+          <w:bCs/>
+          <w:i/>
+          <w:iCs/>
+          <w:caps/>
+          <w:sz w:val="28"/>
+          <w:szCs w:val="28"/>
+        </w:rPr>
+        <w:t>format:</w:t>
+      </w:r>
+    </w:p>
+    <w:p>
+      <w:pPr>
+        <w:rPr>
+          <w:sz w:val="28"/>
+          <w:szCs w:val="28"/>
+        </w:rPr>
+      </w:pPr>
+      <w:r>
+        <w:rPr>
+          <w:b/>
+          <w:bCs/>
+          <w:i/>
+          <w:iCs/>
+          <w:sz w:val="28"/>
+          <w:szCs w:val="28"/>
+        </w:rPr>
+        <w:tab/>
+      </w:r>
+      <w:r>
+        <w:rPr>
+          <w:sz w:val="28"/>
+          <w:szCs w:val="28"/>
+        </w:rPr>
+        <w:t>JSON</w:t>
+      </w:r>
+    </w:p>
+    <w:p>
+      <w:pPr>
+        <w:ind w:left="720"/>
+        <w:rPr>
+          <w:b/>
+          <w:bCs/>
+          <w:i/>
+          <w:iCs/>
+          <w:caps/>
+          <w:sz w:val="28"/>
+          <w:szCs w:val="28"/>
+        </w:rPr>
+      </w:pPr>
+      <w:r>
+        <w:rPr>
+          <w:b/>
+          <w:bCs/>
+          <w:i/>
+          <w:iCs/>
+          <w:caps/>
+          <w:sz w:val="28"/>
+          <w:szCs w:val="28"/>
+        </w:rPr>
+        <w:t>example:</w:t>
+      </w:r>
+    </w:p>
+    <w:p>
+      <w:pPr>
+        <w:rPr>
+          <w:sz w:val="28"/>
+          <w:szCs w:val="28"/>
+        </w:rPr>
+      </w:pPr>
+      <w:r>
+        <w:rPr>
+          <w:sz w:val="28"/>
+          <w:szCs w:val="28"/>
+        </w:rPr>
+        <w:drawing>
+          <wp:inline distT="0" distB="0" distL="0" distR="0" wp14:anchorId="6F82E46B" wp14:editId="11CFF870">
+            <wp:extent cx="5731510" cy="3138170"/>
+            <wp:effectExtent l="0" t="0" r="2540" b="5080"/>
+            <wp:docPr id="914644712" name="Picture 1"/>
+            <wp:cNvGraphicFramePr>
+              <a:graphicFrameLocks xmlns:a="http://schemas.openxmlformats.org/drawingml/2006/main" noChangeAspect="1"/>
+            </wp:cNvGraphicFramePr>
+            <a:graphic xmlns:a="http://schemas.openxmlformats.org/drawingml/2006/main">
+              <a:graphicData uri="http://schemas.openxmlformats.org/drawingml/2006/picture">
+                <pic:pic xmlns:pic="http://schemas.openxmlformats.org/drawingml/2006/picture">
+                  <pic:nvPicPr>
+                    <pic:cNvPr id="914644712" name=""/>
+                    <pic:cNvPicPr/>
+                  </pic:nvPicPr>
+                  <pic:blipFill>
+                    <a:blip r:embed="rId11"/>
+                    <a:stretch>
+                      <a:fillRect/>
+                    </a:stretch>
+                  </pic:blipFill>
+                  <pic:spPr>
+                    <a:xfrm>
+                      <a:off x="0" y="0"/>
+                      <a:ext cx="5731510" cy="3138170"/>
+                    </a:xfrm>
+                    <a:prstGeom prst="rect">
+                      <a:avLst/>
+                    </a:prstGeom>
+                  </pic:spPr>
+                </pic:pic>
+              </a:graphicData>
+            </a:graphic>
+          </wp:inline>
+        </w:drawing>
+      </w:r>
     </w:p>
     <w:sectPr>
       <w:pgSz w:w="11906" w:h="16838"/>
@@ -3332,8 +4065,97 @@
       </w:pPr>
     </w:lvl>
   </w:abstractNum>
+  <w:abstractNum w:abstractNumId="1" w15:restartNumberingAfterBreak="0">
+    <w:nsid w:val="64C51B68"/>
+    <w:multiLevelType w:val="hybridMultilevel"/>
+    <w:tmpl w:val="9A4276D8"/>
+    <w:lvl w:ilvl="0" w:tplc="FFFFFFFF">
+      <w:start w:val="1"/>
+      <w:numFmt w:val="decimal"/>
+      <w:lvlText w:val="%1."/>
+      <w:lvlJc w:val="left"/>
+      <w:pPr>
+        <w:ind w:left="720" w:hanging="360"/>
+      </w:pPr>
+    </w:lvl>
+    <w:lvl w:ilvl="1" w:tplc="FFFFFFFF" w:tentative="1">
+      <w:start w:val="1"/>
+      <w:numFmt w:val="lowerLetter"/>
+      <w:lvlText w:val="%2."/>
+      <w:lvlJc w:val="left"/>
+      <w:pPr>
+        <w:ind w:left="1440" w:hanging="360"/>
+      </w:pPr>
+    </w:lvl>
+    <w:lvl w:ilvl="2" w:tplc="FFFFFFFF" w:tentative="1">
+      <w:start w:val="1"/>
+      <w:numFmt w:val="lowerRoman"/>
+      <w:lvlText w:val="%3."/>
+      <w:lvlJc w:val="right"/>
+      <w:pPr>
+        <w:ind w:left="2160" w:hanging="180"/>
+      </w:pPr>
+    </w:lvl>
+    <w:lvl w:ilvl="3" w:tplc="FFFFFFFF" w:tentative="1">
+      <w:start w:val="1"/>
+      <w:numFmt w:val="decimal"/>
+      <w:lvlText w:val="%4."/>
+      <w:lvlJc w:val="left"/>
+      <w:pPr>
+        <w:ind w:left="2880" w:hanging="360"/>
+      </w:pPr>
+    </w:lvl>
+    <w:lvl w:ilvl="4" w:tplc="FFFFFFFF" w:tentative="1">
+      <w:start w:val="1"/>
+      <w:numFmt w:val="lowerLetter"/>
+      <w:lvlText w:val="%5."/>
+      <w:lvlJc w:val="left"/>
+      <w:pPr>
+        <w:ind w:left="3600" w:hanging="360"/>
+      </w:pPr>
+    </w:lvl>
+    <w:lvl w:ilvl="5" w:tplc="FFFFFFFF" w:tentative="1">
+      <w:start w:val="1"/>
+      <w:numFmt w:val="lowerRoman"/>
+      <w:lvlText w:val="%6."/>
+      <w:lvlJc w:val="right"/>
+      <w:pPr>
+        <w:ind w:left="4320" w:hanging="180"/>
+      </w:pPr>
+    </w:lvl>
+    <w:lvl w:ilvl="6" w:tplc="FFFFFFFF" w:tentative="1">
+      <w:start w:val="1"/>
+      <w:numFmt w:val="decimal"/>
+      <w:lvlText w:val="%7."/>
+      <w:lvlJc w:val="left"/>
+      <w:pPr>
+        <w:ind w:left="5040" w:hanging="360"/>
+      </w:pPr>
+    </w:lvl>
+    <w:lvl w:ilvl="7" w:tplc="FFFFFFFF" w:tentative="1">
+      <w:start w:val="1"/>
+      <w:numFmt w:val="lowerLetter"/>
+      <w:lvlText w:val="%8."/>
+      <w:lvlJc w:val="left"/>
+      <w:pPr>
+        <w:ind w:left="5760" w:hanging="360"/>
+      </w:pPr>
+    </w:lvl>
+    <w:lvl w:ilvl="8" w:tplc="FFFFFFFF" w:tentative="1">
+      <w:start w:val="1"/>
+      <w:numFmt w:val="lowerRoman"/>
+      <w:lvlText w:val="%9."/>
+      <w:lvlJc w:val="right"/>
+      <w:pPr>
+        <w:ind w:left="6480" w:hanging="180"/>
+      </w:pPr>
+    </w:lvl>
+  </w:abstractNum>
   <w:num w:numId="1" w16cid:durableId="1352608570">
     <w:abstractNumId w:val="0"/>
+  </w:num>
+  <w:num w:numId="2" w16cid:durableId="362287530">
+    <w:abstractNumId w:val="1"/>
   </w:num>
 </w:numbering>
 </file>
@@ -3738,7 +4560,7 @@
   <w:style w:type="paragraph" w:default="1" w:styleId="Normal">
     <w:name w:val="Normal"/>
     <w:qFormat/>
-    <w:rsid w:val="00BC4B2A"/>
+    <w:rsid w:val="00634EC6"/>
   </w:style>
   <w:style w:type="paragraph" w:styleId="Heading1">
     <w:name w:val="heading 1"/>

</xml_diff>

<commit_message>
Added get by ID student route, fixed major user registeration bug
</commit_message>
<xml_diff>
--- a/documentation files/HIKVISION backend documentation.docx
+++ b/documentation files/HIKVISION backend documentation.docx
@@ -182,17 +182,7 @@
           <w:szCs w:val="26"/>
           <w:shd w:val="clear" w:color="auto" w:fill="FFFFFF"/>
         </w:rPr>
-        <w:t xml:space="preserve">: </w:t>
-      </w:r>
-      <w:r>
-        <w:rPr>
-          <w:rFonts w:ascii="Segoe UI" w:hAnsi="Segoe UI" w:cs="Segoe UI"/>
-          <w:color w:val="212121"/>
-          <w:sz w:val="26"/>
-          <w:szCs w:val="26"/>
-          <w:shd w:val="clear" w:color="auto" w:fill="FFFFFF"/>
-        </w:rPr>
-        <w:t>softshack</w:t>
+        <w:t>: softshack</w:t>
       </w:r>
       <w:r>
         <w:rPr>
@@ -283,17 +273,7 @@
           <w:szCs w:val="26"/>
           <w:shd w:val="clear" w:color="auto" w:fill="FFFFFF"/>
         </w:rPr>
-        <w:t xml:space="preserve">: </w:t>
-      </w:r>
-      <w:r>
-        <w:rPr>
-          <w:rFonts w:ascii="Segoe UI" w:hAnsi="Segoe UI" w:cs="Segoe UI"/>
-          <w:color w:val="212121"/>
-          <w:sz w:val="26"/>
-          <w:szCs w:val="26"/>
-          <w:shd w:val="clear" w:color="auto" w:fill="FFFFFF"/>
-        </w:rPr>
-        <w:t>GIFT@123</w:t>
+        <w:t>: GIFT@123</w:t>
       </w:r>
       <w:r>
         <w:rPr>
@@ -597,6 +577,7 @@
           <w:i/>
           <w:iCs/>
           <w:caps/>
+          <w:noProof/>
           <w:sz w:val="28"/>
           <w:szCs w:val="28"/>
         </w:rPr>
@@ -898,7 +879,21 @@
           <w:sz w:val="28"/>
           <w:szCs w:val="28"/>
         </w:rPr>
-        <w:t xml:space="preserve"> (file) </w:t>
+        <w:t xml:space="preserve"> (</w:t>
+      </w:r>
+      <w:r>
+        <w:rPr>
+          <w:sz w:val="28"/>
+          <w:szCs w:val="28"/>
+        </w:rPr>
+        <w:t>text</w:t>
+      </w:r>
+      <w:r>
+        <w:rPr>
+          <w:sz w:val="28"/>
+          <w:szCs w:val="28"/>
+        </w:rPr>
+        <w:t xml:space="preserve">) </w:t>
       </w:r>
       <w:r>
         <w:rPr>
@@ -942,28 +937,14 @@
           <w:sz w:val="28"/>
           <w:szCs w:val="28"/>
         </w:rPr>
-        <w:t>B, file type =&gt; JPEG</w:t>
-      </w:r>
-      <w:r>
-        <w:rPr>
-          <w:sz w:val="28"/>
-          <w:szCs w:val="28"/>
-        </w:rPr>
-        <w:t>,</w:t>
-      </w:r>
-      <w:r>
-        <w:rPr>
-          <w:sz w:val="28"/>
-          <w:szCs w:val="28"/>
-        </w:rPr>
-        <w:t xml:space="preserve"> JPG</w:t>
-      </w:r>
-      <w:r>
-        <w:rPr>
-          <w:sz w:val="28"/>
-          <w:szCs w:val="28"/>
-        </w:rPr>
-        <w:t xml:space="preserve"> or PNG</w:t>
+        <w:t xml:space="preserve">B, file type =&gt; </w:t>
+      </w:r>
+      <w:r>
+        <w:rPr>
+          <w:sz w:val="28"/>
+          <w:szCs w:val="28"/>
+        </w:rPr>
+        <w:t>base64 image URL</w:t>
       </w:r>
       <w:r>
         <w:rPr>
@@ -1434,28 +1415,7 @@
           <w:sz w:val="28"/>
           <w:szCs w:val="28"/>
         </w:rPr>
-        <w:t>multipart</w:t>
-      </w:r>
-      <w:r>
-        <w:rPr>
-          <w:sz w:val="28"/>
-          <w:szCs w:val="28"/>
-        </w:rPr>
-        <w:t>/f</w:t>
-      </w:r>
-      <w:r>
-        <w:rPr>
-          <w:sz w:val="28"/>
-          <w:szCs w:val="28"/>
-        </w:rPr>
-        <w:t>orm</w:t>
-      </w:r>
-      <w:r>
-        <w:rPr>
-          <w:sz w:val="28"/>
-          <w:szCs w:val="28"/>
-        </w:rPr>
-        <w:t>-data</w:t>
+        <w:t>JSON</w:t>
       </w:r>
     </w:p>
     <w:p>
@@ -1564,16 +1524,7 @@
           <w:sz w:val="28"/>
           <w:szCs w:val="28"/>
         </w:rPr>
-        <w:t>Update</w:t>
-      </w:r>
-      <w:r>
-        <w:rPr>
-          <w:b/>
-          <w:bCs/>
-          <w:sz w:val="28"/>
-          <w:szCs w:val="28"/>
-        </w:rPr>
-        <w:t xml:space="preserve"> user</w:t>
+        <w:t>Update user</w:t>
       </w:r>
     </w:p>
     <w:p>
@@ -1821,7 +1772,7 @@
           <w:sz w:val="28"/>
           <w:szCs w:val="28"/>
         </w:rPr>
-        <w:t xml:space="preserve"> (file) </w:t>
+        <w:t xml:space="preserve"> (text) </w:t>
       </w:r>
       <w:r>
         <w:rPr>
@@ -1837,49 +1788,7 @@
           <w:sz w:val="28"/>
           <w:szCs w:val="28"/>
         </w:rPr>
-        <w:t xml:space="preserve">(filesize =&gt; less than </w:t>
-      </w:r>
-      <w:r>
-        <w:rPr>
-          <w:sz w:val="28"/>
-          <w:szCs w:val="28"/>
-        </w:rPr>
-        <w:t>5M</w:t>
-      </w:r>
-      <w:r>
-        <w:rPr>
-          <w:sz w:val="28"/>
-          <w:szCs w:val="28"/>
-        </w:rPr>
-        <w:t>B, file type =&gt; JPEG</w:t>
-      </w:r>
-      <w:r>
-        <w:rPr>
-          <w:sz w:val="28"/>
-          <w:szCs w:val="28"/>
-        </w:rPr>
-        <w:t>,</w:t>
-      </w:r>
-      <w:r>
-        <w:rPr>
-          <w:sz w:val="28"/>
-          <w:szCs w:val="28"/>
-        </w:rPr>
-        <w:t xml:space="preserve"> JPG</w:t>
-      </w:r>
-      <w:r>
-        <w:rPr>
-          <w:sz w:val="28"/>
-          <w:szCs w:val="28"/>
-        </w:rPr>
-        <w:t xml:space="preserve"> or PNG</w:t>
-      </w:r>
-      <w:r>
-        <w:rPr>
-          <w:sz w:val="28"/>
-          <w:szCs w:val="28"/>
-        </w:rPr>
-        <w:t xml:space="preserve">) </w:t>
+        <w:t xml:space="preserve">(filesize =&gt; less than 5MB, file type =&gt; base64 image URL) </w:t>
       </w:r>
       <w:r>
         <w:rPr>
@@ -2158,7 +2067,7 @@
           <w:sz w:val="28"/>
           <w:szCs w:val="28"/>
         </w:rPr>
-        <w:t>multipart/form-data</w:t>
+        <w:t>JSON</w:t>
       </w:r>
     </w:p>
     <w:p>
@@ -2196,6 +2105,7 @@
       </w:pPr>
       <w:r>
         <w:rPr>
+          <w:noProof/>
           <w:sz w:val="28"/>
           <w:szCs w:val="28"/>
         </w:rPr>
@@ -3221,7 +3131,16 @@
           <w:sz w:val="28"/>
           <w:szCs w:val="28"/>
         </w:rPr>
-        <w:t>Get all users (30 per request)</w:t>
+        <w:t xml:space="preserve">Get </w:t>
+      </w:r>
+      <w:r>
+        <w:rPr>
+          <w:b/>
+          <w:bCs/>
+          <w:sz w:val="28"/>
+          <w:szCs w:val="28"/>
+        </w:rPr>
+        <w:t>device logs</w:t>
       </w:r>
     </w:p>
     <w:p>
@@ -3411,18 +3330,7 @@
           <w:sz w:val="28"/>
           <w:szCs w:val="28"/>
         </w:rPr>
-        <w:t>optional</w:t>
-      </w:r>
-      <w:r>
-        <w:rPr>
-          <w:b/>
-          <w:bCs/>
-          <w:i/>
-          <w:iCs/>
-          <w:sz w:val="28"/>
-          <w:szCs w:val="28"/>
-        </w:rPr>
-        <w:t xml:space="preserve"> (default: 50)</w:t>
+        <w:t>optional (default: 50)</w:t>
       </w:r>
     </w:p>
     <w:p>
@@ -3469,45 +3377,27 @@
           <w:sz w:val="28"/>
           <w:szCs w:val="28"/>
         </w:rPr>
-        <w:t>optional</w:t>
-      </w:r>
-      <w:r>
-        <w:rPr>
-          <w:b/>
-          <w:bCs/>
-          <w:i/>
-          <w:iCs/>
-          <w:sz w:val="28"/>
-          <w:szCs w:val="28"/>
-        </w:rPr>
-        <w:t xml:space="preserve"> (default: 0)</w:t>
-      </w:r>
-    </w:p>
-    <w:p>
-      <w:pPr>
-        <w:ind w:left="720"/>
-        <w:rPr>
-          <w:b/>
-          <w:bCs/>
-          <w:i/>
-          <w:iCs/>
-          <w:sz w:val="28"/>
-          <w:szCs w:val="28"/>
-        </w:rPr>
-      </w:pPr>
-      <w:r>
-        <w:rPr>
-          <w:sz w:val="28"/>
-          <w:szCs w:val="28"/>
-        </w:rPr>
-        <w:t>beginTime</w:t>
-      </w:r>
-      <w:r>
-        <w:rPr>
-          <w:sz w:val="28"/>
-          <w:szCs w:val="28"/>
-        </w:rPr>
-        <w:t xml:space="preserve"> </w:t>
+        <w:t>optional (default: 0)</w:t>
+      </w:r>
+    </w:p>
+    <w:p>
+      <w:pPr>
+        <w:ind w:left="720"/>
+        <w:rPr>
+          <w:b/>
+          <w:bCs/>
+          <w:i/>
+          <w:iCs/>
+          <w:sz w:val="28"/>
+          <w:szCs w:val="28"/>
+        </w:rPr>
+      </w:pPr>
+      <w:r>
+        <w:rPr>
+          <w:sz w:val="28"/>
+          <w:szCs w:val="28"/>
+        </w:rPr>
+        <w:t xml:space="preserve">beginTime </w:t>
       </w:r>
       <w:r>
         <w:rPr>
@@ -3598,14 +3488,7 @@
           <w:sz w:val="28"/>
           <w:szCs w:val="28"/>
         </w:rPr>
-        <w:t>endTime</w:t>
-      </w:r>
-      <w:r>
-        <w:rPr>
-          <w:sz w:val="28"/>
-          <w:szCs w:val="28"/>
-        </w:rPr>
-        <w:t xml:space="preserve"> </w:t>
+        <w:t xml:space="preserve">endTime </w:t>
       </w:r>
       <w:r>
         <w:rPr>
@@ -3695,10 +3578,21 @@
           <w:sz w:val="28"/>
           <w:szCs w:val="28"/>
         </w:rPr>
-        <w:t>filter</w:t>
-      </w:r>
-      <w:r>
-        <w:rPr>
+        <w:t xml:space="preserve">filter </w:t>
+      </w:r>
+      <w:r>
+        <w:rPr>
+          <w:i/>
+          <w:iCs/>
+          <w:sz w:val="28"/>
+          <w:szCs w:val="28"/>
+        </w:rPr>
+        <w:t>“query param”</w:t>
+      </w:r>
+      <w:r>
+        <w:rPr>
+          <w:i/>
+          <w:iCs/>
           <w:sz w:val="28"/>
           <w:szCs w:val="28"/>
         </w:rPr>
@@ -3706,24 +3600,6 @@
       </w:r>
       <w:r>
         <w:rPr>
-          <w:i/>
-          <w:iCs/>
-          <w:sz w:val="28"/>
-          <w:szCs w:val="28"/>
-        </w:rPr>
-        <w:t>“query param”</w:t>
-      </w:r>
-      <w:r>
-        <w:rPr>
-          <w:i/>
-          <w:iCs/>
-          <w:sz w:val="28"/>
-          <w:szCs w:val="28"/>
-        </w:rPr>
-        <w:t xml:space="preserve"> </w:t>
-      </w:r>
-      <w:r>
-        <w:rPr>
           <w:b/>
           <w:bCs/>
           <w:sz w:val="28"/>
@@ -3736,71 +3612,18 @@
           <w:sz w:val="28"/>
           <w:szCs w:val="28"/>
         </w:rPr>
-        <w:t>(can be only “</w:t>
-      </w:r>
-      <w:r>
-        <w:rPr>
-          <w:sz w:val="28"/>
-          <w:szCs w:val="28"/>
-        </w:rPr>
-        <w:t>all</w:t>
-      </w:r>
-      <w:r>
-        <w:rPr>
-          <w:sz w:val="28"/>
-          <w:szCs w:val="28"/>
-        </w:rPr>
-        <w:t xml:space="preserve">, </w:t>
-      </w:r>
-      <w:r>
-        <w:rPr>
-          <w:sz w:val="28"/>
-          <w:szCs w:val="28"/>
-        </w:rPr>
-        <w:t>verified,</w:t>
-      </w:r>
-      <w:r>
-        <w:rPr>
-          <w:sz w:val="28"/>
-          <w:szCs w:val="28"/>
-        </w:rPr>
-        <w:t xml:space="preserve"> blackList</w:t>
-      </w:r>
-      <w:r>
-        <w:rPr>
-          <w:sz w:val="28"/>
-          <w:szCs w:val="28"/>
-        </w:rPr>
-        <w:t>, doorOpen, doorClose, duplicate</w:t>
-      </w:r>
-      <w:r>
-        <w:rPr>
-          <w:sz w:val="28"/>
-          <w:szCs w:val="28"/>
-        </w:rPr>
-        <w:t xml:space="preserve">” *case sensitive*)  </w:t>
-      </w:r>
-      <w:r>
-        <w:rPr>
-          <w:b/>
-          <w:bCs/>
-          <w:i/>
-          <w:iCs/>
-          <w:sz w:val="28"/>
-          <w:szCs w:val="28"/>
-        </w:rPr>
-        <w:t>optional</w:t>
-      </w:r>
-      <w:r>
-        <w:rPr>
-          <w:b/>
-          <w:bCs/>
-          <w:i/>
-          <w:iCs/>
-          <w:sz w:val="28"/>
-          <w:szCs w:val="28"/>
-        </w:rPr>
-        <w:t xml:space="preserve"> (default: all)</w:t>
+        <w:t xml:space="preserve">(can be only “all, verified, blackList, doorOpen, doorClose, duplicate” *case sensitive*)  </w:t>
+      </w:r>
+      <w:r>
+        <w:rPr>
+          <w:b/>
+          <w:bCs/>
+          <w:i/>
+          <w:iCs/>
+          <w:sz w:val="28"/>
+          <w:szCs w:val="28"/>
+        </w:rPr>
+        <w:t>optional (default: all)</w:t>
       </w:r>
     </w:p>
     <w:p>
@@ -3903,6 +3726,7 @@
       </w:pPr>
       <w:r>
         <w:rPr>
+          <w:noProof/>
           <w:sz w:val="28"/>
           <w:szCs w:val="28"/>
         </w:rPr>

</xml_diff>

<commit_message>
fixed documentation acc to new routes
</commit_message>
<xml_diff>
--- a/documentation files/HIKVISION backend documentation.docx
+++ b/documentation files/HIKVISION backend documentation.docx
@@ -2784,6 +2784,391 @@
           <w:sz w:val="28"/>
           <w:szCs w:val="28"/>
         </w:rPr>
+        <w:t xml:space="preserve">Get </w:t>
+      </w:r>
+      <w:r>
+        <w:rPr>
+          <w:b/>
+          <w:bCs/>
+          <w:sz w:val="28"/>
+          <w:szCs w:val="28"/>
+        </w:rPr>
+        <w:t>user by ID</w:t>
+      </w:r>
+    </w:p>
+    <w:p>
+      <w:pPr>
+        <w:ind w:left="720"/>
+        <w:rPr>
+          <w:b/>
+          <w:bCs/>
+          <w:i/>
+          <w:iCs/>
+          <w:caps/>
+          <w:sz w:val="28"/>
+          <w:szCs w:val="28"/>
+        </w:rPr>
+      </w:pPr>
+      <w:r>
+        <w:rPr>
+          <w:b/>
+          <w:bCs/>
+          <w:i/>
+          <w:iCs/>
+          <w:caps/>
+          <w:sz w:val="28"/>
+          <w:szCs w:val="28"/>
+        </w:rPr>
+        <w:t>url:</w:t>
+      </w:r>
+    </w:p>
+    <w:p>
+      <w:pPr>
+        <w:ind w:left="720"/>
+        <w:rPr>
+          <w:rFonts w:ascii="Segoe UI" w:hAnsi="Segoe UI" w:cs="Segoe UI"/>
+          <w:sz w:val="26"/>
+          <w:szCs w:val="26"/>
+        </w:rPr>
+      </w:pPr>
+      <w:r>
+        <w:rPr>
+          <w:color w:val="4EA72E" w:themeColor="accent6"/>
+          <w:sz w:val="26"/>
+          <w:szCs w:val="26"/>
+        </w:rPr>
+        <w:t>GE</w:t>
+      </w:r>
+      <w:r>
+        <w:rPr>
+          <w:color w:val="4EA72E" w:themeColor="accent6"/>
+          <w:sz w:val="26"/>
+          <w:szCs w:val="26"/>
+        </w:rPr>
+        <w:t>T</w:t>
+      </w:r>
+      <w:r>
+        <w:rPr>
+          <w:sz w:val="26"/>
+          <w:szCs w:val="26"/>
+        </w:rPr>
+        <w:t xml:space="preserve"> </w:t>
+      </w:r>
+      <w:r>
+        <w:rPr>
+          <w:rStyle w:val="inlinevariable"/>
+          <w:rFonts w:ascii="Segoe UI" w:hAnsi="Segoe UI" w:cs="Segoe UI"/>
+          <w:color w:val="2552AA"/>
+          <w:sz w:val="26"/>
+          <w:szCs w:val="26"/>
+          <w:bdr w:val="single" w:sz="4" w:space="0" w:color="EDEDED" w:frame="1"/>
+        </w:rPr>
+        <w:t>{{backend url}}</w:t>
+      </w:r>
+      <w:r>
+        <w:rPr>
+          <w:rFonts w:ascii="Segoe UI" w:hAnsi="Segoe UI" w:cs="Segoe UI"/>
+          <w:color w:val="212121"/>
+          <w:sz w:val="26"/>
+          <w:szCs w:val="26"/>
+          <w:shd w:val="clear" w:color="auto" w:fill="FFFFFF"/>
+        </w:rPr>
+        <w:t>/students</w:t>
+      </w:r>
+      <w:r>
+        <w:rPr>
+          <w:rFonts w:cs="Segoe UI"/>
+          <w:color w:val="212121"/>
+          <w:sz w:val="26"/>
+          <w:szCs w:val="26"/>
+          <w:shd w:val="clear" w:color="auto" w:fill="FFFFFF"/>
+        </w:rPr>
+        <w:t>/</w:t>
+      </w:r>
+      <w:r>
+        <w:rPr>
+          <w:rStyle w:val="inlinevariable"/>
+          <w:rFonts w:ascii="Segoe UI" w:hAnsi="Segoe UI" w:cs="Segoe UI"/>
+          <w:color w:val="2552AA"/>
+          <w:sz w:val="26"/>
+          <w:szCs w:val="26"/>
+          <w:bdr w:val="single" w:sz="4" w:space="0" w:color="EDEDED" w:frame="1"/>
+        </w:rPr>
+        <w:t>{{</w:t>
+      </w:r>
+      <w:r>
+        <w:rPr>
+          <w:rStyle w:val="inlinevariable"/>
+          <w:rFonts w:ascii="Segoe UI" w:hAnsi="Segoe UI" w:cs="Segoe UI"/>
+          <w:color w:val="2552AA"/>
+          <w:sz w:val="26"/>
+          <w:szCs w:val="26"/>
+          <w:bdr w:val="single" w:sz="4" w:space="0" w:color="EDEDED" w:frame="1"/>
+        </w:rPr>
+        <w:t>studentId</w:t>
+      </w:r>
+      <w:r>
+        <w:rPr>
+          <w:rStyle w:val="inlinevariable"/>
+          <w:rFonts w:ascii="Segoe UI" w:hAnsi="Segoe UI" w:cs="Segoe UI"/>
+          <w:color w:val="2552AA"/>
+          <w:sz w:val="26"/>
+          <w:szCs w:val="26"/>
+          <w:bdr w:val="single" w:sz="4" w:space="0" w:color="EDEDED" w:frame="1"/>
+        </w:rPr>
+        <w:t>}}</w:t>
+      </w:r>
+    </w:p>
+    <w:p>
+      <w:pPr>
+        <w:ind w:left="720"/>
+        <w:rPr>
+          <w:b/>
+          <w:bCs/>
+          <w:i/>
+          <w:iCs/>
+          <w:caps/>
+          <w:sz w:val="28"/>
+          <w:szCs w:val="28"/>
+        </w:rPr>
+      </w:pPr>
+      <w:r>
+        <w:rPr>
+          <w:b/>
+          <w:bCs/>
+          <w:i/>
+          <w:iCs/>
+          <w:caps/>
+          <w:sz w:val="28"/>
+          <w:szCs w:val="28"/>
+        </w:rPr>
+        <w:t>params:</w:t>
+      </w:r>
+    </w:p>
+    <w:p>
+      <w:pPr>
+        <w:ind w:left="720"/>
+        <w:rPr>
+          <w:sz w:val="28"/>
+          <w:szCs w:val="28"/>
+        </w:rPr>
+      </w:pPr>
+      <w:r>
+        <w:rPr>
+          <w:sz w:val="28"/>
+          <w:szCs w:val="28"/>
+        </w:rPr>
+        <w:t xml:space="preserve">studentId </w:t>
+      </w:r>
+      <w:r>
+        <w:rPr>
+          <w:i/>
+          <w:iCs/>
+          <w:sz w:val="28"/>
+          <w:szCs w:val="28"/>
+        </w:rPr>
+        <w:t>“url parameter”</w:t>
+      </w:r>
+      <w:r>
+        <w:rPr>
+          <w:i/>
+          <w:iCs/>
+          <w:sz w:val="28"/>
+          <w:szCs w:val="28"/>
+        </w:rPr>
+        <w:t xml:space="preserve"> </w:t>
+      </w:r>
+      <w:r>
+        <w:rPr>
+          <w:b/>
+          <w:bCs/>
+          <w:i/>
+          <w:iCs/>
+          <w:sz w:val="28"/>
+          <w:szCs w:val="28"/>
+        </w:rPr>
+        <w:t>required</w:t>
+      </w:r>
+    </w:p>
+    <w:p>
+      <w:pPr>
+        <w:ind w:left="720"/>
+        <w:rPr>
+          <w:b/>
+          <w:bCs/>
+          <w:i/>
+          <w:iCs/>
+          <w:caps/>
+          <w:sz w:val="28"/>
+          <w:szCs w:val="28"/>
+        </w:rPr>
+      </w:pPr>
+      <w:r>
+        <w:rPr>
+          <w:b/>
+          <w:bCs/>
+          <w:i/>
+          <w:iCs/>
+          <w:caps/>
+          <w:sz w:val="28"/>
+          <w:szCs w:val="28"/>
+        </w:rPr>
+        <w:t>format:</w:t>
+      </w:r>
+    </w:p>
+    <w:p>
+      <w:pPr>
+        <w:rPr>
+          <w:sz w:val="28"/>
+          <w:szCs w:val="28"/>
+        </w:rPr>
+      </w:pPr>
+      <w:r>
+        <w:rPr>
+          <w:b/>
+          <w:bCs/>
+          <w:i/>
+          <w:iCs/>
+          <w:sz w:val="28"/>
+          <w:szCs w:val="28"/>
+        </w:rPr>
+        <w:tab/>
+      </w:r>
+      <w:r>
+        <w:rPr>
+          <w:sz w:val="28"/>
+          <w:szCs w:val="28"/>
+        </w:rPr>
+        <w:t>JSON</w:t>
+      </w:r>
+    </w:p>
+    <w:p>
+      <w:pPr>
+        <w:ind w:left="720"/>
+        <w:rPr>
+          <w:b/>
+          <w:bCs/>
+          <w:i/>
+          <w:iCs/>
+          <w:caps/>
+          <w:sz w:val="28"/>
+          <w:szCs w:val="28"/>
+        </w:rPr>
+      </w:pPr>
+      <w:r>
+        <w:rPr>
+          <w:b/>
+          <w:bCs/>
+          <w:i/>
+          <w:iCs/>
+          <w:caps/>
+          <w:sz w:val="28"/>
+          <w:szCs w:val="28"/>
+        </w:rPr>
+        <w:t>example:</w:t>
+      </w:r>
+    </w:p>
+    <w:p>
+      <w:pPr>
+        <w:rPr>
+          <w:sz w:val="28"/>
+          <w:szCs w:val="28"/>
+        </w:rPr>
+      </w:pPr>
+      <w:r>
+        <w:rPr>
+          <w:sz w:val="28"/>
+          <w:szCs w:val="28"/>
+        </w:rPr>
+        <w:lastRenderedPageBreak/>
+        <w:tab/>
+      </w:r>
+      <w:r>
+        <w:rPr>
+          <w:sz w:val="28"/>
+          <w:szCs w:val="28"/>
+        </w:rPr>
+        <w:drawing>
+          <wp:inline distT="0" distB="0" distL="0" distR="0" wp14:anchorId="3F02136D" wp14:editId="5B799B34">
+            <wp:extent cx="5731510" cy="3155950"/>
+            <wp:effectExtent l="0" t="0" r="2540" b="6350"/>
+            <wp:docPr id="766799491" name="Picture 1"/>
+            <wp:cNvGraphicFramePr>
+              <a:graphicFrameLocks xmlns:a="http://schemas.openxmlformats.org/drawingml/2006/main" noChangeAspect="1"/>
+            </wp:cNvGraphicFramePr>
+            <a:graphic xmlns:a="http://schemas.openxmlformats.org/drawingml/2006/main">
+              <a:graphicData uri="http://schemas.openxmlformats.org/drawingml/2006/picture">
+                <pic:pic xmlns:pic="http://schemas.openxmlformats.org/drawingml/2006/picture">
+                  <pic:nvPicPr>
+                    <pic:cNvPr id="766799491" name=""/>
+                    <pic:cNvPicPr/>
+                  </pic:nvPicPr>
+                  <pic:blipFill>
+                    <a:blip r:embed="rId10"/>
+                    <a:stretch>
+                      <a:fillRect/>
+                    </a:stretch>
+                  </pic:blipFill>
+                  <pic:spPr>
+                    <a:xfrm>
+                      <a:off x="0" y="0"/>
+                      <a:ext cx="5731510" cy="3155950"/>
+                    </a:xfrm>
+                    <a:prstGeom prst="rect">
+                      <a:avLst/>
+                    </a:prstGeom>
+                  </pic:spPr>
+                </pic:pic>
+              </a:graphicData>
+            </a:graphic>
+          </wp:inline>
+        </w:drawing>
+      </w:r>
+    </w:p>
+    <w:p>
+      <w:pPr>
+        <w:rPr>
+          <w:sz w:val="28"/>
+          <w:szCs w:val="28"/>
+        </w:rPr>
+      </w:pPr>
+      <w:r>
+        <w:rPr>
+          <w:sz w:val="28"/>
+          <w:szCs w:val="28"/>
+        </w:rPr>
+        <w:t xml:space="preserve"> </w:t>
+      </w:r>
+    </w:p>
+    <w:p>
+      <w:pPr>
+        <w:rPr>
+          <w:sz w:val="28"/>
+          <w:szCs w:val="28"/>
+        </w:rPr>
+      </w:pPr>
+    </w:p>
+    <w:p>
+      <w:pPr>
+        <w:pStyle w:val="ListParagraph"/>
+        <w:numPr>
+          <w:ilvl w:val="0"/>
+          <w:numId w:val="1"/>
+        </w:numPr>
+        <w:rPr>
+          <w:b/>
+          <w:bCs/>
+          <w:sz w:val="28"/>
+          <w:szCs w:val="28"/>
+        </w:rPr>
+      </w:pPr>
+      <w:r>
+        <w:rPr>
+          <w:b/>
+          <w:bCs/>
+          <w:sz w:val="28"/>
+          <w:szCs w:val="28"/>
+        </w:rPr>
         <w:t>Delete user</w:t>
       </w:r>
     </w:p>
@@ -3089,7 +3474,7 @@
                     <pic:cNvPicPr/>
                   </pic:nvPicPr>
                   <pic:blipFill>
-                    <a:blip r:embed="rId10"/>
+                    <a:blip r:embed="rId11"/>
                     <a:stretch>
                       <a:fillRect/>
                     </a:stretch>
@@ -3746,7 +4131,7 @@
                     <pic:cNvPicPr/>
                   </pic:nvPicPr>
                   <pic:blipFill>
-                    <a:blip r:embed="rId11"/>
+                    <a:blip r:embed="rId12"/>
                     <a:stretch>
                       <a:fillRect/>
                     </a:stretch>
@@ -3866,6 +4251,92 @@
     </w:lvl>
   </w:abstractNum>
   <w:abstractNum w:abstractNumId="1" w15:restartNumberingAfterBreak="0">
+    <w:nsid w:val="37130ED5"/>
+    <w:multiLevelType w:val="hybridMultilevel"/>
+    <w:tmpl w:val="9A4276D8"/>
+    <w:lvl w:ilvl="0" w:tplc="FFFFFFFF">
+      <w:start w:val="1"/>
+      <w:numFmt w:val="decimal"/>
+      <w:lvlText w:val="%1."/>
+      <w:lvlJc w:val="left"/>
+      <w:pPr>
+        <w:ind w:left="720" w:hanging="360"/>
+      </w:pPr>
+    </w:lvl>
+    <w:lvl w:ilvl="1" w:tplc="FFFFFFFF" w:tentative="1">
+      <w:start w:val="1"/>
+      <w:numFmt w:val="lowerLetter"/>
+      <w:lvlText w:val="%2."/>
+      <w:lvlJc w:val="left"/>
+      <w:pPr>
+        <w:ind w:left="1440" w:hanging="360"/>
+      </w:pPr>
+    </w:lvl>
+    <w:lvl w:ilvl="2" w:tplc="FFFFFFFF" w:tentative="1">
+      <w:start w:val="1"/>
+      <w:numFmt w:val="lowerRoman"/>
+      <w:lvlText w:val="%3."/>
+      <w:lvlJc w:val="right"/>
+      <w:pPr>
+        <w:ind w:left="2160" w:hanging="180"/>
+      </w:pPr>
+    </w:lvl>
+    <w:lvl w:ilvl="3" w:tplc="FFFFFFFF" w:tentative="1">
+      <w:start w:val="1"/>
+      <w:numFmt w:val="decimal"/>
+      <w:lvlText w:val="%4."/>
+      <w:lvlJc w:val="left"/>
+      <w:pPr>
+        <w:ind w:left="2880" w:hanging="360"/>
+      </w:pPr>
+    </w:lvl>
+    <w:lvl w:ilvl="4" w:tplc="FFFFFFFF" w:tentative="1">
+      <w:start w:val="1"/>
+      <w:numFmt w:val="lowerLetter"/>
+      <w:lvlText w:val="%5."/>
+      <w:lvlJc w:val="left"/>
+      <w:pPr>
+        <w:ind w:left="3600" w:hanging="360"/>
+      </w:pPr>
+    </w:lvl>
+    <w:lvl w:ilvl="5" w:tplc="FFFFFFFF" w:tentative="1">
+      <w:start w:val="1"/>
+      <w:numFmt w:val="lowerRoman"/>
+      <w:lvlText w:val="%6."/>
+      <w:lvlJc w:val="right"/>
+      <w:pPr>
+        <w:ind w:left="4320" w:hanging="180"/>
+      </w:pPr>
+    </w:lvl>
+    <w:lvl w:ilvl="6" w:tplc="FFFFFFFF" w:tentative="1">
+      <w:start w:val="1"/>
+      <w:numFmt w:val="decimal"/>
+      <w:lvlText w:val="%7."/>
+      <w:lvlJc w:val="left"/>
+      <w:pPr>
+        <w:ind w:left="5040" w:hanging="360"/>
+      </w:pPr>
+    </w:lvl>
+    <w:lvl w:ilvl="7" w:tplc="FFFFFFFF" w:tentative="1">
+      <w:start w:val="1"/>
+      <w:numFmt w:val="lowerLetter"/>
+      <w:lvlText w:val="%8."/>
+      <w:lvlJc w:val="left"/>
+      <w:pPr>
+        <w:ind w:left="5760" w:hanging="360"/>
+      </w:pPr>
+    </w:lvl>
+    <w:lvl w:ilvl="8" w:tplc="FFFFFFFF" w:tentative="1">
+      <w:start w:val="1"/>
+      <w:numFmt w:val="lowerRoman"/>
+      <w:lvlText w:val="%9."/>
+      <w:lvlJc w:val="right"/>
+      <w:pPr>
+        <w:ind w:left="6480" w:hanging="180"/>
+      </w:pPr>
+    </w:lvl>
+  </w:abstractNum>
+  <w:abstractNum w:abstractNumId="2" w15:restartNumberingAfterBreak="0">
     <w:nsid w:val="64C51B68"/>
     <w:multiLevelType w:val="hybridMultilevel"/>
     <w:tmpl w:val="9A4276D8"/>
@@ -3955,6 +4426,9 @@
     <w:abstractNumId w:val="0"/>
   </w:num>
   <w:num w:numId="2" w16cid:durableId="362287530">
+    <w:abstractNumId w:val="2"/>
+  </w:num>
+  <w:num w:numId="3" w16cid:durableId="1057360128">
     <w:abstractNumId w:val="1"/>
   </w:num>
 </w:numbering>
@@ -4360,7 +4834,7 @@
   <w:style w:type="paragraph" w:default="1" w:styleId="Normal">
     <w:name w:val="Normal"/>
     <w:qFormat/>
-    <w:rsid w:val="00634EC6"/>
+    <w:rsid w:val="0000475A"/>
   </w:style>
   <w:style w:type="paragraph" w:styleId="Heading1">
     <w:name w:val="heading 1"/>

</xml_diff>

<commit_message>
refactored for multiple devices
</commit_message>
<xml_diff>
--- a/documentation files/HIKVISION backend documentation.docx
+++ b/documentation files/HIKVISION backend documentation.docx
@@ -70,7 +70,67 @@
           <w:szCs w:val="26"/>
           <w:shd w:val="clear" w:color="auto" w:fill="FFFFFF"/>
         </w:rPr>
-        <w:t>172.17.30.228</w:t>
+        <w:t>192</w:t>
+      </w:r>
+      <w:r>
+        <w:rPr>
+          <w:rFonts w:ascii="Segoe UI" w:hAnsi="Segoe UI" w:cs="Segoe UI"/>
+          <w:color w:val="212121"/>
+          <w:sz w:val="26"/>
+          <w:szCs w:val="26"/>
+          <w:shd w:val="clear" w:color="auto" w:fill="FFFFFF"/>
+        </w:rPr>
+        <w:t>.1</w:t>
+      </w:r>
+      <w:r>
+        <w:rPr>
+          <w:rFonts w:ascii="Segoe UI" w:hAnsi="Segoe UI" w:cs="Segoe UI"/>
+          <w:color w:val="212121"/>
+          <w:sz w:val="26"/>
+          <w:szCs w:val="26"/>
+          <w:shd w:val="clear" w:color="auto" w:fill="FFFFFF"/>
+        </w:rPr>
+        <w:t>68</w:t>
+      </w:r>
+      <w:r>
+        <w:rPr>
+          <w:rFonts w:ascii="Segoe UI" w:hAnsi="Segoe UI" w:cs="Segoe UI"/>
+          <w:color w:val="212121"/>
+          <w:sz w:val="26"/>
+          <w:szCs w:val="26"/>
+          <w:shd w:val="clear" w:color="auto" w:fill="FFFFFF"/>
+        </w:rPr>
+        <w:t>.</w:t>
+      </w:r>
+      <w:r>
+        <w:rPr>
+          <w:rFonts w:ascii="Segoe UI" w:hAnsi="Segoe UI" w:cs="Segoe UI"/>
+          <w:color w:val="212121"/>
+          <w:sz w:val="26"/>
+          <w:szCs w:val="26"/>
+          <w:shd w:val="clear" w:color="auto" w:fill="FFFFFF"/>
+        </w:rPr>
+        <w:t>12</w:t>
+      </w:r>
+      <w:r>
+        <w:rPr>
+          <w:rFonts w:ascii="Segoe UI" w:hAnsi="Segoe UI" w:cs="Segoe UI"/>
+          <w:color w:val="212121"/>
+          <w:sz w:val="26"/>
+          <w:szCs w:val="26"/>
+          <w:shd w:val="clear" w:color="auto" w:fill="FFFFFF"/>
+        </w:rPr>
+        <w:t>.</w:t>
+      </w:r>
+      <w:r>
+        <w:rPr>
+          <w:rFonts w:ascii="Segoe UI" w:hAnsi="Segoe UI" w:cs="Segoe UI"/>
+          <w:color w:val="212121"/>
+          <w:sz w:val="26"/>
+          <w:szCs w:val="26"/>
+          <w:shd w:val="clear" w:color="auto" w:fill="FFFFFF"/>
+        </w:rPr>
+        <w:t>128</w:t>
       </w:r>
       <w:r>
         <w:rPr>
@@ -3085,6 +3145,7 @@
       </w:r>
       <w:r>
         <w:rPr>
+          <w:noProof/>
           <w:sz w:val="28"/>
           <w:szCs w:val="28"/>
         </w:rPr>

</xml_diff>